<commit_message>
Add subgroup missingness and capital gain/loss EDA; revise midterm research questions and wording
</commit_message>
<xml_diff>
--- a/Phase3_MidtermReport_Brinegar.docx
+++ b/Phase3_MidtermReport_Brinegar.docx
@@ -87,7 +87,7 @@
     </w:p>
     <w:p>
       <w:r>
-        <w:t>The main research question is: How do different resampling methods affect predictive performance and fairness across demographic groups in an imbalanced classification problem? We ask whether accuracy, precision, recall, and F1 differ across conditions and whether differences are consistent across cross-validation folds.</w:t>
+        <w:t>The main research question is: How do different resampling methods affect predictive performance and fairness across demographic groups in an imbalanced classification problem? We ask (1) whether accuracy, precision, recall, and F1 differ across conditions, (2) how each method changes the female-minus-male statistical parity and equal opportunity gaps, and whether better predictive performance comes with better or worse fairness, and (3) whether these differences are consistent across cross-validation folds. Following instructor feedback on Phase 2, we changed the framing from oversampling to resampling and finalized random undersampling as the fourth condition.</w:t>
       </w:r>
     </w:p>
     <w:p>
@@ -117,13 +117,13 @@
         <w:t>, or the positive class</w:t>
       </w:r>
       <w:r>
-        <w:t xml:space="preserve">. Sex is the protected attribute, using Female and Male categories. Female is designated unprivileged and male privileged for </w:t>
-      </w:r>
-      <w:r>
-        <w:t xml:space="preserve">this </w:t>
-      </w:r>
-      <w:r>
-        <w:t>evaluation. Four sex/income combinations will define sampling subgroups</w:t>
+        <w:t xml:space="preserve">. Sex is the protected attribute, using Female and Male categories. Female is designated unprivileged and male privileged for this evaluation. Sampling targets depend on sex/income subgroup counts in each training fold, not on privileged or unprivileged status.</w:t>
+      </w:r>
+      <w:r>
+        <w:t xml:space="preserve"/>
+      </w:r>
+      <w:r>
+        <w:t> Four sex/income combinations will define sampling subgroups</w:t>
       </w:r>
       <w:r>
         <w:t>.</w:t>
@@ -1569,13 +1569,13 @@
     </w:p>
     <w:p>
       <w:r>
-        <w:t xml:space="preserve">The initial inspection establishes that data quality and representation </w:t>
-      </w:r>
-      <w:r>
-        <w:t>that had to be</w:t>
-      </w:r>
-      <w:r>
-        <w:t xml:space="preserve"> addressed before testing the resampling hypothesis. Hidden unknown markers</w:t>
+        <w:t xml:space="preserve">The initial inspection identifies data quality and representation issues that must be addressed before testing the resampling hypothesis.</w:t>
+      </w:r>
+      <w:r>
+        <w:t/>
+      </w:r>
+      <w:r>
+        <w:t xml:space="preserve"> Hidden unknown markers</w:t>
       </w:r>
       <w:r>
         <w:t xml:space="preserve"> (The “?” for unknown values)</w:t>

</xml_diff>

<commit_message>
There was a small typo, a missing space
</commit_message>
<xml_diff>
--- a/Phase3_MidtermReport_Brinegar.docx
+++ b/Phase3_MidtermReport_Brinegar.docx
@@ -1,6 +1,6 @@
 
 <file path=word/document.xml><?xml version="1.0" encoding="utf-8"?>
-<w:document xmlns:wpc="http://schemas.microsoft.com/office/word/2010/wordprocessingCanvas" xmlns:cx="http://schemas.microsoft.com/office/drawing/2014/chartex" xmlns:cx1="http://schemas.microsoft.com/office/drawing/2015/9/8/chartex" xmlns:cx2="http://schemas.microsoft.com/office/drawing/2015/10/21/chartex" xmlns:cx3="http://schemas.microsoft.com/office/drawing/2016/5/9/chartex" xmlns:cx4="http://schemas.microsoft.com/office/drawing/2016/5/10/chartex" xmlns:cx5="http://schemas.microsoft.com/office/drawing/2016/5/11/chartex" xmlns:cx6="http://schemas.microsoft.com/office/drawing/2016/5/12/chartex" xmlns:cx7="http://schemas.microsoft.com/office/drawing/2016/5/13/chartex" xmlns:cx8="http://schemas.microsoft.com/office/drawing/2016/5/14/chartex" xmlns:mc="http://schemas.openxmlformats.org/markup-compatibility/2006" xmlns:m="http://schemas.openxmlformats.org/officeDocument/2006/math" xmlns:aink="http://schemas.microsoft.com/office/drawing/2016/ink" xmlns:am3d="http://schemas.microsoft.com/office/drawing/2017/model3d" xmlns:oel="http://schemas.microsoft.com/office/2019/extlst" xmlns:r="http://schemas.openxmlformats.org/officeDocument/2006/relationships" xmlns:wp14="http://schemas.microsoft.com/office/word/2010/wordprocessingDrawing" xmlns:wp="http://schemas.openxmlformats.org/drawingml/2006/wordprocessingDrawing" xmlns:wpg="http://schemas.microsoft.com/office/word/2010/wordprocessingGroup" xmlns:wpi="http://schemas.microsoft.com/office/word/2010/wordprocessingInk" xmlns:wps="http://schemas.microsoft.com/office/word/2010/wordprocessingShape" xmlns:o="urn:schemas-microsoft-com:office:office" xmlns:v="urn:schemas-microsoft-com:vml" xmlns:w10="urn:schemas-microsoft-com:office:word" xmlns:w="http://schemas.openxmlformats.org/wordprocessingml/2006/main" xmlns:w14="http://schemas.microsoft.com/office/word/2010/wordml" xmlns:w15="http://schemas.microsoft.com/office/word/2012/wordml" xmlns:w16cex="http://schemas.microsoft.com/office/word/2018/wordml/cex" xmlns:w16cid="http://schemas.microsoft.com/office/word/2016/wordml/cid" xmlns:w16="http://schemas.microsoft.com/office/word/2018/wordml" xmlns:w16sdtdh="http://schemas.microsoft.com/office/word/2020/wordml/sdtdatahash" xmlns:w16sdtfl="http://schemas.microsoft.com/office/word/2024/wordml/sdtformatlock" xmlns:w16se="http://schemas.microsoft.com/office/word/2015/wordml/symex" xmlns:w16du="http://schemas.microsoft.com/office/word/2023/wordml/word16du" xmlns:wne="http://schemas.microsoft.com/office/word/2006/wordml" mc:Ignorable="w14 w15 w16se w16cid w16 w16cex w16sdtdh w16sdtfl w16du wp14">
+<w:document xmlns:wpc="http://schemas.microsoft.com/office/word/2010/wordprocessingCanvas" xmlns:cx="http://schemas.microsoft.com/office/drawing/2014/chartex" xmlns:cx1="http://schemas.microsoft.com/office/drawing/2015/9/8/chartex" xmlns:cx2="http://schemas.microsoft.com/office/drawing/2015/10/21/chartex" xmlns:cx3="http://schemas.microsoft.com/office/drawing/2016/5/9/chartex" xmlns:cx4="http://schemas.microsoft.com/office/drawing/2016/5/10/chartex" xmlns:cx5="http://schemas.microsoft.com/office/drawing/2016/5/11/chartex" xmlns:cx6="http://schemas.microsoft.com/office/drawing/2016/5/12/chartex" xmlns:cx7="http://schemas.microsoft.com/office/drawing/2016/5/13/chartex" xmlns:cx8="http://schemas.microsoft.com/office/drawing/2016/5/14/chartex" xmlns:mc="http://schemas.openxmlformats.org/markup-compatibility/2006" xmlns:aink="http://schemas.microsoft.com/office/drawing/2016/ink" xmlns:am3d="http://schemas.microsoft.com/office/drawing/2017/model3d" xmlns:o="urn:schemas-microsoft-com:office:office" xmlns:oel="http://schemas.microsoft.com/office/2019/extlst" xmlns:r="http://schemas.openxmlformats.org/officeDocument/2006/relationships" xmlns:m="http://schemas.openxmlformats.org/officeDocument/2006/math" xmlns:v="urn:schemas-microsoft-com:vml" xmlns:wp14="http://schemas.microsoft.com/office/word/2010/wordprocessingDrawing" xmlns:wp="http://schemas.openxmlformats.org/drawingml/2006/wordprocessingDrawing" xmlns:w10="urn:schemas-microsoft-com:office:word" xmlns:w="http://schemas.openxmlformats.org/wordprocessingml/2006/main" xmlns:w14="http://schemas.microsoft.com/office/word/2010/wordml" xmlns:w15="http://schemas.microsoft.com/office/word/2012/wordml" xmlns:w16cex="http://schemas.microsoft.com/office/word/2018/wordml/cex" xmlns:w16cid="http://schemas.microsoft.com/office/word/2016/wordml/cid" xmlns:w16="http://schemas.microsoft.com/office/word/2018/wordml" xmlns:w16du="http://schemas.microsoft.com/office/word/2023/wordml/word16du" xmlns:w16sdtdh="http://schemas.microsoft.com/office/word/2020/wordml/sdtdatahash" xmlns:w16sdtfl="http://schemas.microsoft.com/office/word/2024/wordml/sdtformatlock" xmlns:w16se="http://schemas.microsoft.com/office/word/2015/wordml/symex" xmlns:wpg="http://schemas.microsoft.com/office/word/2010/wordprocessingGroup" xmlns:wpi="http://schemas.microsoft.com/office/word/2010/wordprocessingInk" xmlns:wne="http://schemas.microsoft.com/office/word/2006/wordml" xmlns:wps="http://schemas.microsoft.com/office/word/2010/wordprocessingShape" mc:Ignorable="w14 w15 w16se w16cid w16 w16cex w16sdtdh w16sdtfl w16du wp14">
   <w:body>
     <w:p>
       <w:pPr>
@@ -117,13 +117,13 @@
         <w:t>, or the positive class</w:t>
       </w:r>
       <w:r>
-        <w:t xml:space="preserve">. Sex is the protected attribute, using Female and Male categories. Female is designated unprivileged and male privileged for this evaluation. Sampling targets depend on sex/income subgroup counts in each training fold, not on privileged or unprivileged status.</w:t>
+        <w:t>. Sex is the protected attribute, using Female and Male categories. Female is designated unprivileged and male privileged for this evaluation. Sampling targets depend on sex/income subgroup counts in each training fold, not on privileged or unprivileged status.</w:t>
       </w:r>
       <w:r>
-        <w:t xml:space="preserve"/>
+        <w:t xml:space="preserve"> </w:t>
       </w:r>
       <w:r>
-        <w:t> Four sex/income combinations will define sampling subgroups</w:t>
+        <w:t>Four sex/income combinations will define sampling subgroups</w:t>
       </w:r>
       <w:r>
         <w:t>.</w:t>
@@ -131,7 +131,10 @@
     </w:p>
     <w:p>
       <w:r>
-        <w:t>The loaded data contain six integer columns and nine object columns, including the target. Age and hours_per_week describe age and working hours; capital_gain and capital_loss record capital amounts. Education appears as both a named category and an ordered education_num code. Workclass, occupation, marital_status, relationship, race, and native_country describe employment and demographic</w:t>
+        <w:t xml:space="preserve">The loaded data contain six integer columns and nine object columns, including the target. Age and hours_per_week describe age and working hours; capital_gain and capital_loss record capital amounts. Education appears as both a named category and an ordered education_num code. Workclass, occupation, </w:t>
+      </w:r>
+      <w:r>
+        <w:t>marital_status, relationship, race, and native_country describe employment and demographic</w:t>
       </w:r>
       <w:r>
         <w:t>s</w:t>
@@ -162,14 +165,7 @@
           <w:sz w:val="21"/>
           <w:szCs w:val="21"/>
         </w:rPr>
-        <w:t xml:space="preserve">The </w:t>
-      </w:r>
-      <w:r>
-        <w:rPr>
-          <w:sz w:val="21"/>
-          <w:szCs w:val="21"/>
-        </w:rPr>
-        <w:t xml:space="preserve">Adult dataset is a good fit for this project because it includes two income categories, unequal numbers of male and female observations, and both numerical and categorical features. However, the </w:t>
+        <w:t xml:space="preserve">The Adult dataset is a good fit for this project because it includes two income categories, unequal numbers of male and female observations, and both numerical and categorical features. However, the </w:t>
       </w:r>
       <w:r>
         <w:rPr>
@@ -241,10 +237,7 @@
         <w:pStyle w:val="Heading2"/>
       </w:pPr>
       <w:r>
-        <w:t>C</w:t>
-      </w:r>
-      <w:r>
-        <w:t>leaning and Transformations</w:t>
+        <w:t>Cleaning and Transformations</w:t>
       </w:r>
     </w:p>
     <w:p>
@@ -266,14 +259,7 @@
           <w:i/>
           <w:color w:val="595959"/>
         </w:rPr>
-        <w:t xml:space="preserve">[To complete: </w:t>
-      </w:r>
-      <w:r>
-        <w:rPr>
-          <w:i/>
-          <w:color w:val="595959"/>
-        </w:rPr>
-        <w:t>Add transformations/cleaning done for missing values, the trailing ‘.’ in the target column values, etc.</w:t>
+        <w:t>[To complete: Add transformations/cleaning done for missing values, the trailing ‘.’ in the target column values, etc.</w:t>
       </w:r>
       <w:r>
         <w:rPr>
@@ -287,21 +273,7 @@
           <w:i/>
           <w:color w:val="595959"/>
         </w:rPr>
-        <w:t>Complete missing-data and outlier checks, verify the education mapping, and finalize feature selection, categorical encoding, and the role of</w:t>
-      </w:r>
-      <w:r>
-        <w:rPr>
-          <w:i/>
-          <w:color w:val="595959"/>
-        </w:rPr>
-        <w:t xml:space="preserve"> the</w:t>
-      </w:r>
-      <w:r>
-        <w:rPr>
-          <w:i/>
-          <w:color w:val="595959"/>
-        </w:rPr>
-        <w:t xml:space="preserve"> </w:t>
+        <w:t xml:space="preserve">Complete missing-data and outlier checks, verify the education mapping, and finalize feature selection, categorical encoding, and the role of the </w:t>
       </w:r>
       <w:proofErr w:type="spellStart"/>
       <w:r>
@@ -317,14 +289,7 @@
           <w:i/>
           <w:color w:val="595959"/>
         </w:rPr>
-        <w:t xml:space="preserve"> column</w:t>
-      </w:r>
-      <w:r>
-        <w:rPr>
-          <w:i/>
-          <w:color w:val="595959"/>
-        </w:rPr>
-        <w:t>. Record any feature transformations]</w:t>
+        <w:t xml:space="preserve"> column. Record any feature transformations]</w:t>
       </w:r>
     </w:p>
     <w:p>
@@ -759,6 +724,7 @@
     </w:p>
     <w:p>
       <w:r>
+        <w:lastRenderedPageBreak/>
         <w:t>Table 1 counts entries by column, not affected rows</w:t>
       </w:r>
       <w:r>
@@ -782,7 +748,6 @@
     </w:p>
     <w:p>
       <w:r>
-        <w:lastRenderedPageBreak/>
         <w:t>Income has four raw strings: training labels ≤50K and &gt;50K, and test labels with trailing periods. Their respective counts are 24,720 and 7,841 in training, and 12,435 and 3,846 in test. The apparent extra classes are a source-format inconsistency, not additional income outcomes.</w:t>
       </w:r>
     </w:p>
@@ -806,14 +771,7 @@
           <w:i/>
           <w:color w:val="595959"/>
         </w:rPr>
-        <w:t xml:space="preserve"> </w:t>
-      </w:r>
-      <w:r>
-        <w:rPr>
-          <w:i/>
-          <w:color w:val="595959"/>
-        </w:rPr>
-        <w:t>insert figure here showing counts described below</w:t>
+        <w:t xml:space="preserve"> insert figure here showing counts described below</w:t>
       </w:r>
       <w:r>
         <w:t>&gt;</w:t>
@@ -843,21 +801,7 @@
           <w:i/>
           <w:color w:val="595959"/>
         </w:rPr>
-        <w:t xml:space="preserve">[To complete: </w:t>
-      </w:r>
-      <w:r>
-        <w:rPr>
-          <w:i/>
-          <w:color w:val="595959"/>
-        </w:rPr>
-        <w:t>Include sex/income subgroup totals. Those counts are needed to calculate how many rows each resampling method would add or remove.</w:t>
-      </w:r>
-      <w:r>
-        <w:rPr>
-          <w:i/>
-          <w:color w:val="595959"/>
-        </w:rPr>
-        <w:t>]</w:t>
+        <w:t>[To complete: Include sex/income subgroup totals. Those counts are needed to calculate how many rows each resampling method would add or remove.]</w:t>
       </w:r>
     </w:p>
     <w:p>
@@ -1535,14 +1479,7 @@
           <w:i/>
           <w:color w:val="595959"/>
         </w:rPr>
-        <w:t xml:space="preserve">[To complete: Add normalized sex/income count table and group income rates. Examine missingness by subgroup, </w:t>
-      </w:r>
-      <w:r>
-        <w:rPr>
-          <w:i/>
-          <w:color w:val="595959"/>
-        </w:rPr>
-        <w:t>numerical distributions by outcome, education versus education_num, and other relevant feature relationships</w:t>
+        <w:t>[To complete: Add normalized sex/income count table and group income rates. Examine missingness by subgroup, numerical distributions by outcome, education versus education_num, and other relevant feature relationships</w:t>
       </w:r>
       <w:r>
         <w:rPr>
@@ -1569,13 +1506,7 @@
     </w:p>
     <w:p>
       <w:r>
-        <w:t xml:space="preserve">The initial inspection identifies data quality and representation issues that must be addressed before testing the resampling hypothesis.</w:t>
-      </w:r>
-      <w:r>
-        <w:t/>
-      </w:r>
-      <w:r>
-        <w:t xml:space="preserve"> Hidden unknown markers</w:t>
+        <w:t>The initial inspection identifies data quality and representation issues that must be addressed before testing the resampling hypothesis. Hidden unknown markers</w:t>
       </w:r>
       <w:r>
         <w:t xml:space="preserve"> (The “?” for unknown values)</w:t>
@@ -1637,27 +1568,7 @@
     </w:p>
     <w:p>
       <w:r>
-        <w:t xml:space="preserve">Because the dataset contains both numbers and categories, we will use SMOTE-NC to create synthetic records while keeping categorical values </w:t>
-      </w:r>
-      <w:proofErr w:type="spellStart"/>
-      <w:r>
-        <w:t>valid.</w:t>
-      </w:r>
-      <w:r>
-        <w:t xml:space="preserve"> </w:t>
-      </w:r>
-      <w:proofErr w:type="spellEnd"/>
-      <w:r>
-        <w:t>Categorical predictors will be identified explicitly</w:t>
-      </w:r>
-      <w:r>
-        <w:t>. S</w:t>
-      </w:r>
-      <w:r>
-        <w:t xml:space="preserve">ex and income will be preserved or restored from the subgroup label. The temporary sampling label will be removed before classifier training. </w:t>
-      </w:r>
-      <w:r>
-        <w:t xml:space="preserve">Random oversampling copies existing records, while random </w:t>
+        <w:t xml:space="preserve">Because the dataset contains both numbers and categories, we will use SMOTE-NC to create synthetic records while keeping categorical values valid. Categorical predictors will be identified explicitly. Sex and income will be preserved or restored from the subgroup label. The temporary sampling label will be removed before classifier training. Random oversampling copies existing records, while random </w:t>
       </w:r>
       <w:proofErr w:type="spellStart"/>
       <w:r>
@@ -1665,13 +1576,11 @@
       </w:r>
       <w:proofErr w:type="spellEnd"/>
       <w:r>
-        <w:t xml:space="preserve"> removes records. Neither method changes the values within a record.</w:t>
+        <w:t xml:space="preserve"> removes records. Neither method changes the values within a record. Synthetic </w:t>
       </w:r>
       <w:r>
-        <w:t xml:space="preserve"> </w:t>
-      </w:r>
-      <w:r>
-        <w:t>Synthetic categorical values and demographic/outcome labels will be validated.</w:t>
+        <w:lastRenderedPageBreak/>
+        <w:t>categorical values and demographic/outcome labels will be validated.</w:t>
       </w:r>
     </w:p>
     <w:p>
@@ -1688,11 +1597,7 @@
         <w:t>V</w:t>
       </w:r>
       <w:r>
-        <w:t xml:space="preserve">alidation rows will retain their observed proportions. We will report accuracy, favorable-class precision, recall and F1, group confusion matrices, and mean scores with variation across folds. Fairness </w:t>
-      </w:r>
-      <w:r>
-        <w:lastRenderedPageBreak/>
-        <w:t>evaluation will use female-minus-male statistical parity gaps (favorable prediction rates) and equal opportunity gaps (true-positive rates). Smaller absolute gaps indicate closer group rates on those measures, not complete fairness.</w:t>
+        <w:t>alidation rows will retain their observed proportions. We will report accuracy, favorable-class precision, recall and F1, group confusion matrices, and mean scores with variation across folds. Fairness evaluation will use female-minus-male statistical parity gaps (favorable prediction rates) and equal opportunity gaps (true-positive rates). Smaller absolute gaps indicate closer group rates on those measures, not complete fairness.</w:t>
       </w:r>
     </w:p>
     <w:p>
@@ -1740,7 +1645,7 @@
 </file>
 
 <file path=word/endnotes.xml><?xml version="1.0" encoding="utf-8"?>
-<w:endnotes xmlns:wpc="http://schemas.microsoft.com/office/word/2010/wordprocessingCanvas" xmlns:cx="http://schemas.microsoft.com/office/drawing/2014/chartex" xmlns:cx1="http://schemas.microsoft.com/office/drawing/2015/9/8/chartex" xmlns:cx2="http://schemas.microsoft.com/office/drawing/2015/10/21/chartex" xmlns:cx3="http://schemas.microsoft.com/office/drawing/2016/5/9/chartex" xmlns:cx4="http://schemas.microsoft.com/office/drawing/2016/5/10/chartex" xmlns:cx5="http://schemas.microsoft.com/office/drawing/2016/5/11/chartex" xmlns:cx6="http://schemas.microsoft.com/office/drawing/2016/5/12/chartex" xmlns:cx7="http://schemas.microsoft.com/office/drawing/2016/5/13/chartex" xmlns:cx8="http://schemas.microsoft.com/office/drawing/2016/5/14/chartex" xmlns:mc="http://schemas.openxmlformats.org/markup-compatibility/2006" xmlns:m="http://schemas.openxmlformats.org/officeDocument/2006/math" xmlns:aink="http://schemas.microsoft.com/office/drawing/2016/ink" xmlns:am3d="http://schemas.microsoft.com/office/drawing/2017/model3d" xmlns:oel="http://schemas.microsoft.com/office/2019/extlst" xmlns:r="http://schemas.openxmlformats.org/officeDocument/2006/relationships" xmlns:wp14="http://schemas.microsoft.com/office/word/2010/wordprocessingDrawing" xmlns:wp="http://schemas.openxmlformats.org/drawingml/2006/wordprocessingDrawing" xmlns:wpg="http://schemas.microsoft.com/office/word/2010/wordprocessingGroup" xmlns:wpi="http://schemas.microsoft.com/office/word/2010/wordprocessingInk" xmlns:wps="http://schemas.microsoft.com/office/word/2010/wordprocessingShape" xmlns:o="urn:schemas-microsoft-com:office:office" xmlns:v="urn:schemas-microsoft-com:vml" xmlns:w10="urn:schemas-microsoft-com:office:word" xmlns:w="http://schemas.openxmlformats.org/wordprocessingml/2006/main" xmlns:w14="http://schemas.microsoft.com/office/word/2010/wordml" xmlns:w15="http://schemas.microsoft.com/office/word/2012/wordml" xmlns:w16cex="http://schemas.microsoft.com/office/word/2018/wordml/cex" xmlns:w16cid="http://schemas.microsoft.com/office/word/2016/wordml/cid" xmlns:w16="http://schemas.microsoft.com/office/word/2018/wordml" xmlns:w16sdtdh="http://schemas.microsoft.com/office/word/2020/wordml/sdtdatahash" xmlns:w16sdtfl="http://schemas.microsoft.com/office/word/2024/wordml/sdtformatlock" xmlns:w16se="http://schemas.microsoft.com/office/word/2015/wordml/symex" xmlns:w16du="http://schemas.microsoft.com/office/word/2023/wordml/word16du" xmlns:wne="http://schemas.microsoft.com/office/word/2006/wordml" mc:Ignorable="w14 w15 w16se w16cid w16 w16cex w16sdtdh w16sdtfl w16du wp14">
+<w:endnotes xmlns:wpc="http://schemas.microsoft.com/office/word/2010/wordprocessingCanvas" xmlns:cx="http://schemas.microsoft.com/office/drawing/2014/chartex" xmlns:cx1="http://schemas.microsoft.com/office/drawing/2015/9/8/chartex" xmlns:cx2="http://schemas.microsoft.com/office/drawing/2015/10/21/chartex" xmlns:cx3="http://schemas.microsoft.com/office/drawing/2016/5/9/chartex" xmlns:cx4="http://schemas.microsoft.com/office/drawing/2016/5/10/chartex" xmlns:cx5="http://schemas.microsoft.com/office/drawing/2016/5/11/chartex" xmlns:cx6="http://schemas.microsoft.com/office/drawing/2016/5/12/chartex" xmlns:cx7="http://schemas.microsoft.com/office/drawing/2016/5/13/chartex" xmlns:cx8="http://schemas.microsoft.com/office/drawing/2016/5/14/chartex" xmlns:mc="http://schemas.openxmlformats.org/markup-compatibility/2006" xmlns:aink="http://schemas.microsoft.com/office/drawing/2016/ink" xmlns:am3d="http://schemas.microsoft.com/office/drawing/2017/model3d" xmlns:o="urn:schemas-microsoft-com:office:office" xmlns:oel="http://schemas.microsoft.com/office/2019/extlst" xmlns:r="http://schemas.openxmlformats.org/officeDocument/2006/relationships" xmlns:m="http://schemas.openxmlformats.org/officeDocument/2006/math" xmlns:v="urn:schemas-microsoft-com:vml" xmlns:wp14="http://schemas.microsoft.com/office/word/2010/wordprocessingDrawing" xmlns:wp="http://schemas.openxmlformats.org/drawingml/2006/wordprocessingDrawing" xmlns:w10="urn:schemas-microsoft-com:office:word" xmlns:w="http://schemas.openxmlformats.org/wordprocessingml/2006/main" xmlns:w14="http://schemas.microsoft.com/office/word/2010/wordml" xmlns:w15="http://schemas.microsoft.com/office/word/2012/wordml" xmlns:w16cex="http://schemas.microsoft.com/office/word/2018/wordml/cex" xmlns:w16cid="http://schemas.microsoft.com/office/word/2016/wordml/cid" xmlns:w16="http://schemas.microsoft.com/office/word/2018/wordml" xmlns:w16du="http://schemas.microsoft.com/office/word/2023/wordml/word16du" xmlns:w16sdtdh="http://schemas.microsoft.com/office/word/2020/wordml/sdtdatahash" xmlns:w16sdtfl="http://schemas.microsoft.com/office/word/2024/wordml/sdtformatlock" xmlns:w16se="http://schemas.microsoft.com/office/word/2015/wordml/symex" xmlns:wpg="http://schemas.microsoft.com/office/word/2010/wordprocessingGroup" xmlns:wpi="http://schemas.microsoft.com/office/word/2010/wordprocessingInk" xmlns:wne="http://schemas.microsoft.com/office/word/2006/wordml" xmlns:wps="http://schemas.microsoft.com/office/word/2010/wordprocessingShape" mc:Ignorable="w14 w15 w16se w16cid w16 w16cex w16sdtdh w16sdtfl w16du wp14">
   <w:endnote w:type="separator" w:id="-1">
     <w:p>
       <w:pPr>
@@ -1765,7 +1670,7 @@
 </file>
 
 <file path=word/footer1.xml><?xml version="1.0" encoding="utf-8"?>
-<w:ftr xmlns:wpc="http://schemas.microsoft.com/office/word/2010/wordprocessingCanvas" xmlns:cx="http://schemas.microsoft.com/office/drawing/2014/chartex" xmlns:cx1="http://schemas.microsoft.com/office/drawing/2015/9/8/chartex" xmlns:cx2="http://schemas.microsoft.com/office/drawing/2015/10/21/chartex" xmlns:cx3="http://schemas.microsoft.com/office/drawing/2016/5/9/chartex" xmlns:cx4="http://schemas.microsoft.com/office/drawing/2016/5/10/chartex" xmlns:cx5="http://schemas.microsoft.com/office/drawing/2016/5/11/chartex" xmlns:cx6="http://schemas.microsoft.com/office/drawing/2016/5/12/chartex" xmlns:cx7="http://schemas.microsoft.com/office/drawing/2016/5/13/chartex" xmlns:cx8="http://schemas.microsoft.com/office/drawing/2016/5/14/chartex" xmlns:mc="http://schemas.openxmlformats.org/markup-compatibility/2006" xmlns:m="http://schemas.openxmlformats.org/officeDocument/2006/math" xmlns:aink="http://schemas.microsoft.com/office/drawing/2016/ink" xmlns:am3d="http://schemas.microsoft.com/office/drawing/2017/model3d" xmlns:oel="http://schemas.microsoft.com/office/2019/extlst" xmlns:r="http://schemas.openxmlformats.org/officeDocument/2006/relationships" xmlns:wp14="http://schemas.microsoft.com/office/word/2010/wordprocessingDrawing" xmlns:wp="http://schemas.openxmlformats.org/drawingml/2006/wordprocessingDrawing" xmlns:wpg="http://schemas.microsoft.com/office/word/2010/wordprocessingGroup" xmlns:wpi="http://schemas.microsoft.com/office/word/2010/wordprocessingInk" xmlns:wps="http://schemas.microsoft.com/office/word/2010/wordprocessingShape" xmlns:o="urn:schemas-microsoft-com:office:office" xmlns:v="urn:schemas-microsoft-com:vml" xmlns:w10="urn:schemas-microsoft-com:office:word" xmlns:w="http://schemas.openxmlformats.org/wordprocessingml/2006/main" xmlns:w14="http://schemas.microsoft.com/office/word/2010/wordml" xmlns:w15="http://schemas.microsoft.com/office/word/2012/wordml" xmlns:w16cex="http://schemas.microsoft.com/office/word/2018/wordml/cex" xmlns:w16cid="http://schemas.microsoft.com/office/word/2016/wordml/cid" xmlns:w16="http://schemas.microsoft.com/office/word/2018/wordml" xmlns:w16sdtdh="http://schemas.microsoft.com/office/word/2020/wordml/sdtdatahash" xmlns:w16sdtfl="http://schemas.microsoft.com/office/word/2024/wordml/sdtformatlock" xmlns:w16se="http://schemas.microsoft.com/office/word/2015/wordml/symex" xmlns:w16du="http://schemas.microsoft.com/office/word/2023/wordml/word16du" xmlns:wne="http://schemas.microsoft.com/office/word/2006/wordml" mc:Ignorable="w14 w15 w16se w16cid w16 w16cex w16sdtdh w16sdtfl w16du wp14">
+<w:ftr xmlns:wpc="http://schemas.microsoft.com/office/word/2010/wordprocessingCanvas" xmlns:cx="http://schemas.microsoft.com/office/drawing/2014/chartex" xmlns:cx1="http://schemas.microsoft.com/office/drawing/2015/9/8/chartex" xmlns:cx2="http://schemas.microsoft.com/office/drawing/2015/10/21/chartex" xmlns:cx3="http://schemas.microsoft.com/office/drawing/2016/5/9/chartex" xmlns:cx4="http://schemas.microsoft.com/office/drawing/2016/5/10/chartex" xmlns:cx5="http://schemas.microsoft.com/office/drawing/2016/5/11/chartex" xmlns:cx6="http://schemas.microsoft.com/office/drawing/2016/5/12/chartex" xmlns:cx7="http://schemas.microsoft.com/office/drawing/2016/5/13/chartex" xmlns:cx8="http://schemas.microsoft.com/office/drawing/2016/5/14/chartex" xmlns:mc="http://schemas.openxmlformats.org/markup-compatibility/2006" xmlns:aink="http://schemas.microsoft.com/office/drawing/2016/ink" xmlns:am3d="http://schemas.microsoft.com/office/drawing/2017/model3d" xmlns:o="urn:schemas-microsoft-com:office:office" xmlns:oel="http://schemas.microsoft.com/office/2019/extlst" xmlns:r="http://schemas.openxmlformats.org/officeDocument/2006/relationships" xmlns:m="http://schemas.openxmlformats.org/officeDocument/2006/math" xmlns:v="urn:schemas-microsoft-com:vml" xmlns:wp14="http://schemas.microsoft.com/office/word/2010/wordprocessingDrawing" xmlns:wp="http://schemas.openxmlformats.org/drawingml/2006/wordprocessingDrawing" xmlns:w10="urn:schemas-microsoft-com:office:word" xmlns:w="http://schemas.openxmlformats.org/wordprocessingml/2006/main" xmlns:w14="http://schemas.microsoft.com/office/word/2010/wordml" xmlns:w15="http://schemas.microsoft.com/office/word/2012/wordml" xmlns:w16cex="http://schemas.microsoft.com/office/word/2018/wordml/cex" xmlns:w16cid="http://schemas.microsoft.com/office/word/2016/wordml/cid" xmlns:w16="http://schemas.microsoft.com/office/word/2018/wordml" xmlns:w16du="http://schemas.microsoft.com/office/word/2023/wordml/word16du" xmlns:w16sdtdh="http://schemas.microsoft.com/office/word/2020/wordml/sdtdatahash" xmlns:w16sdtfl="http://schemas.microsoft.com/office/word/2024/wordml/sdtformatlock" xmlns:w16se="http://schemas.microsoft.com/office/word/2015/wordml/symex" xmlns:wpg="http://schemas.microsoft.com/office/word/2010/wordprocessingGroup" xmlns:wpi="http://schemas.microsoft.com/office/word/2010/wordprocessingInk" xmlns:wne="http://schemas.microsoft.com/office/word/2006/wordml" xmlns:wps="http://schemas.microsoft.com/office/word/2010/wordprocessingShape" mc:Ignorable="w14 w15 w16se w16cid w16 w16cex w16sdtdh w16sdtfl w16du wp14">
   <w:p>
     <w:pPr>
       <w:pStyle w:val="Footer"/>
@@ -1794,7 +1699,7 @@
 </file>
 
 <file path=word/footnotes.xml><?xml version="1.0" encoding="utf-8"?>
-<w:footnotes xmlns:wpc="http://schemas.microsoft.com/office/word/2010/wordprocessingCanvas" xmlns:cx="http://schemas.microsoft.com/office/drawing/2014/chartex" xmlns:cx1="http://schemas.microsoft.com/office/drawing/2015/9/8/chartex" xmlns:cx2="http://schemas.microsoft.com/office/drawing/2015/10/21/chartex" xmlns:cx3="http://schemas.microsoft.com/office/drawing/2016/5/9/chartex" xmlns:cx4="http://schemas.microsoft.com/office/drawing/2016/5/10/chartex" xmlns:cx5="http://schemas.microsoft.com/office/drawing/2016/5/11/chartex" xmlns:cx6="http://schemas.microsoft.com/office/drawing/2016/5/12/chartex" xmlns:cx7="http://schemas.microsoft.com/office/drawing/2016/5/13/chartex" xmlns:cx8="http://schemas.microsoft.com/office/drawing/2016/5/14/chartex" xmlns:mc="http://schemas.openxmlformats.org/markup-compatibility/2006" xmlns:m="http://schemas.openxmlformats.org/officeDocument/2006/math" xmlns:aink="http://schemas.microsoft.com/office/drawing/2016/ink" xmlns:am3d="http://schemas.microsoft.com/office/drawing/2017/model3d" xmlns:oel="http://schemas.microsoft.com/office/2019/extlst" xmlns:r="http://schemas.openxmlformats.org/officeDocument/2006/relationships" xmlns:wp14="http://schemas.microsoft.com/office/word/2010/wordprocessingDrawing" xmlns:wp="http://schemas.openxmlformats.org/drawingml/2006/wordprocessingDrawing" xmlns:wpg="http://schemas.microsoft.com/office/word/2010/wordprocessingGroup" xmlns:wpi="http://schemas.microsoft.com/office/word/2010/wordprocessingInk" xmlns:wps="http://schemas.microsoft.com/office/word/2010/wordprocessingShape" xmlns:o="urn:schemas-microsoft-com:office:office" xmlns:v="urn:schemas-microsoft-com:vml" xmlns:w10="urn:schemas-microsoft-com:office:word" xmlns:w="http://schemas.openxmlformats.org/wordprocessingml/2006/main" xmlns:w14="http://schemas.microsoft.com/office/word/2010/wordml" xmlns:w15="http://schemas.microsoft.com/office/word/2012/wordml" xmlns:w16cex="http://schemas.microsoft.com/office/word/2018/wordml/cex" xmlns:w16cid="http://schemas.microsoft.com/office/word/2016/wordml/cid" xmlns:w16="http://schemas.microsoft.com/office/word/2018/wordml" xmlns:w16sdtdh="http://schemas.microsoft.com/office/word/2020/wordml/sdtdatahash" xmlns:w16sdtfl="http://schemas.microsoft.com/office/word/2024/wordml/sdtformatlock" xmlns:w16se="http://schemas.microsoft.com/office/word/2015/wordml/symex" xmlns:w16du="http://schemas.microsoft.com/office/word/2023/wordml/word16du" xmlns:wne="http://schemas.microsoft.com/office/word/2006/wordml" mc:Ignorable="w14 w15 w16se w16cid w16 w16cex w16sdtdh w16sdtfl w16du wp14">
+<w:footnotes xmlns:wpc="http://schemas.microsoft.com/office/word/2010/wordprocessingCanvas" xmlns:cx="http://schemas.microsoft.com/office/drawing/2014/chartex" xmlns:cx1="http://schemas.microsoft.com/office/drawing/2015/9/8/chartex" xmlns:cx2="http://schemas.microsoft.com/office/drawing/2015/10/21/chartex" xmlns:cx3="http://schemas.microsoft.com/office/drawing/2016/5/9/chartex" xmlns:cx4="http://schemas.microsoft.com/office/drawing/2016/5/10/chartex" xmlns:cx5="http://schemas.microsoft.com/office/drawing/2016/5/11/chartex" xmlns:cx6="http://schemas.microsoft.com/office/drawing/2016/5/12/chartex" xmlns:cx7="http://schemas.microsoft.com/office/drawing/2016/5/13/chartex" xmlns:cx8="http://schemas.microsoft.com/office/drawing/2016/5/14/chartex" xmlns:mc="http://schemas.openxmlformats.org/markup-compatibility/2006" xmlns:aink="http://schemas.microsoft.com/office/drawing/2016/ink" xmlns:am3d="http://schemas.microsoft.com/office/drawing/2017/model3d" xmlns:o="urn:schemas-microsoft-com:office:office" xmlns:oel="http://schemas.microsoft.com/office/2019/extlst" xmlns:r="http://schemas.openxmlformats.org/officeDocument/2006/relationships" xmlns:m="http://schemas.openxmlformats.org/officeDocument/2006/math" xmlns:v="urn:schemas-microsoft-com:vml" xmlns:wp14="http://schemas.microsoft.com/office/word/2010/wordprocessingDrawing" xmlns:wp="http://schemas.openxmlformats.org/drawingml/2006/wordprocessingDrawing" xmlns:w10="urn:schemas-microsoft-com:office:word" xmlns:w="http://schemas.openxmlformats.org/wordprocessingml/2006/main" xmlns:w14="http://schemas.microsoft.com/office/word/2010/wordml" xmlns:w15="http://schemas.microsoft.com/office/word/2012/wordml" xmlns:w16cex="http://schemas.microsoft.com/office/word/2018/wordml/cex" xmlns:w16cid="http://schemas.microsoft.com/office/word/2016/wordml/cid" xmlns:w16="http://schemas.microsoft.com/office/word/2018/wordml" xmlns:w16du="http://schemas.microsoft.com/office/word/2023/wordml/word16du" xmlns:w16sdtdh="http://schemas.microsoft.com/office/word/2020/wordml/sdtdatahash" xmlns:w16sdtfl="http://schemas.microsoft.com/office/word/2024/wordml/sdtformatlock" xmlns:w16se="http://schemas.microsoft.com/office/word/2015/wordml/symex" xmlns:wpg="http://schemas.microsoft.com/office/word/2010/wordprocessingGroup" xmlns:wpi="http://schemas.microsoft.com/office/word/2010/wordprocessingInk" xmlns:wne="http://schemas.microsoft.com/office/word/2006/wordml" xmlns:wps="http://schemas.microsoft.com/office/word/2010/wordprocessingShape" mc:Ignorable="w14 w15 w16se w16cid w16 w16cex w16sdtdh w16sdtfl w16du wp14">
   <w:footnote w:type="separator" w:id="-1">
     <w:p>
       <w:pPr>
@@ -1819,7 +1724,7 @@
 </file>
 
 <file path=word/numbering.xml><?xml version="1.0" encoding="utf-8"?>
-<w:numbering xmlns:wpc="http://schemas.microsoft.com/office/word/2010/wordprocessingCanvas" xmlns:cx="http://schemas.microsoft.com/office/drawing/2014/chartex" xmlns:cx1="http://schemas.microsoft.com/office/drawing/2015/9/8/chartex" xmlns:cx2="http://schemas.microsoft.com/office/drawing/2015/10/21/chartex" xmlns:cx3="http://schemas.microsoft.com/office/drawing/2016/5/9/chartex" xmlns:cx4="http://schemas.microsoft.com/office/drawing/2016/5/10/chartex" xmlns:cx5="http://schemas.microsoft.com/office/drawing/2016/5/11/chartex" xmlns:cx6="http://schemas.microsoft.com/office/drawing/2016/5/12/chartex" xmlns:cx7="http://schemas.microsoft.com/office/drawing/2016/5/13/chartex" xmlns:cx8="http://schemas.microsoft.com/office/drawing/2016/5/14/chartex" xmlns:mc="http://schemas.openxmlformats.org/markup-compatibility/2006" xmlns:m="http://schemas.openxmlformats.org/officeDocument/2006/math" xmlns:aink="http://schemas.microsoft.com/office/drawing/2016/ink" xmlns:am3d="http://schemas.microsoft.com/office/drawing/2017/model3d" xmlns:oel="http://schemas.microsoft.com/office/2019/extlst" xmlns:r="http://schemas.openxmlformats.org/officeDocument/2006/relationships" xmlns:wp14="http://schemas.microsoft.com/office/word/2010/wordprocessingDrawing" xmlns:wp="http://schemas.openxmlformats.org/drawingml/2006/wordprocessingDrawing" xmlns:wpg="http://schemas.microsoft.com/office/word/2010/wordprocessingGroup" xmlns:wpi="http://schemas.microsoft.com/office/word/2010/wordprocessingInk" xmlns:wps="http://schemas.microsoft.com/office/word/2010/wordprocessingShape" xmlns:o="urn:schemas-microsoft-com:office:office" xmlns:v="urn:schemas-microsoft-com:vml" xmlns:w10="urn:schemas-microsoft-com:office:word" xmlns:w="http://schemas.openxmlformats.org/wordprocessingml/2006/main" xmlns:w14="http://schemas.microsoft.com/office/word/2010/wordml" xmlns:w15="http://schemas.microsoft.com/office/word/2012/wordml" xmlns:w16cex="http://schemas.microsoft.com/office/word/2018/wordml/cex" xmlns:w16cid="http://schemas.microsoft.com/office/word/2016/wordml/cid" xmlns:w16="http://schemas.microsoft.com/office/word/2018/wordml" xmlns:w16sdtdh="http://schemas.microsoft.com/office/word/2020/wordml/sdtdatahash" xmlns:w16sdtfl="http://schemas.microsoft.com/office/word/2024/wordml/sdtformatlock" xmlns:w16se="http://schemas.microsoft.com/office/word/2015/wordml/symex" xmlns:w16du="http://schemas.microsoft.com/office/word/2023/wordml/word16du" xmlns:wne="http://schemas.microsoft.com/office/word/2006/wordml" mc:Ignorable="w14 w15 w16se w16cid w16 w16cex w16sdtdh w16sdtfl w16du wp14">
+<w:numbering xmlns:wpc="http://schemas.microsoft.com/office/word/2010/wordprocessingCanvas" xmlns:cx="http://schemas.microsoft.com/office/drawing/2014/chartex" xmlns:cx1="http://schemas.microsoft.com/office/drawing/2015/9/8/chartex" xmlns:cx2="http://schemas.microsoft.com/office/drawing/2015/10/21/chartex" xmlns:cx3="http://schemas.microsoft.com/office/drawing/2016/5/9/chartex" xmlns:cx4="http://schemas.microsoft.com/office/drawing/2016/5/10/chartex" xmlns:cx5="http://schemas.microsoft.com/office/drawing/2016/5/11/chartex" xmlns:cx6="http://schemas.microsoft.com/office/drawing/2016/5/12/chartex" xmlns:cx7="http://schemas.microsoft.com/office/drawing/2016/5/13/chartex" xmlns:cx8="http://schemas.microsoft.com/office/drawing/2016/5/14/chartex" xmlns:mc="http://schemas.openxmlformats.org/markup-compatibility/2006" xmlns:aink="http://schemas.microsoft.com/office/drawing/2016/ink" xmlns:am3d="http://schemas.microsoft.com/office/drawing/2017/model3d" xmlns:o="urn:schemas-microsoft-com:office:office" xmlns:oel="http://schemas.microsoft.com/office/2019/extlst" xmlns:r="http://schemas.openxmlformats.org/officeDocument/2006/relationships" xmlns:m="http://schemas.openxmlformats.org/officeDocument/2006/math" xmlns:v="urn:schemas-microsoft-com:vml" xmlns:wp14="http://schemas.microsoft.com/office/word/2010/wordprocessingDrawing" xmlns:wp="http://schemas.openxmlformats.org/drawingml/2006/wordprocessingDrawing" xmlns:w10="urn:schemas-microsoft-com:office:word" xmlns:w="http://schemas.openxmlformats.org/wordprocessingml/2006/main" xmlns:w14="http://schemas.microsoft.com/office/word/2010/wordml" xmlns:w15="http://schemas.microsoft.com/office/word/2012/wordml" xmlns:w16cex="http://schemas.microsoft.com/office/word/2018/wordml/cex" xmlns:w16cid="http://schemas.microsoft.com/office/word/2016/wordml/cid" xmlns:w16="http://schemas.microsoft.com/office/word/2018/wordml" xmlns:w16du="http://schemas.microsoft.com/office/word/2023/wordml/word16du" xmlns:w16sdtdh="http://schemas.microsoft.com/office/word/2020/wordml/sdtdatahash" xmlns:w16sdtfl="http://schemas.microsoft.com/office/word/2024/wordml/sdtformatlock" xmlns:w16se="http://schemas.microsoft.com/office/word/2015/wordml/symex" xmlns:wpg="http://schemas.microsoft.com/office/word/2010/wordprocessingGroup" xmlns:wpi="http://schemas.microsoft.com/office/word/2010/wordprocessingInk" xmlns:wne="http://schemas.microsoft.com/office/word/2006/wordml" xmlns:wps="http://schemas.microsoft.com/office/word/2010/wordprocessingShape" mc:Ignorable="w14 w15 w16se w16cid w16 w16cex w16sdtdh w16sdtfl w16du wp14">
   <w:abstractNum w:abstractNumId="0" w15:restartNumberingAfterBreak="0">
     <w:nsid w:val="FFFFFF7C"/>
     <w:multiLevelType w:val="singleLevel"/>
@@ -2022,7 +1927,7 @@
 </file>
 
 <file path=word/styles.xml><?xml version="1.0" encoding="utf-8"?>
-<w:styles xmlns:mc="http://schemas.openxmlformats.org/markup-compatibility/2006" xmlns:r="http://schemas.openxmlformats.org/officeDocument/2006/relationships" xmlns:w="http://schemas.openxmlformats.org/wordprocessingml/2006/main" xmlns:w14="http://schemas.microsoft.com/office/word/2010/wordml" xmlns:w15="http://schemas.microsoft.com/office/word/2012/wordml" xmlns:w16cex="http://schemas.microsoft.com/office/word/2018/wordml/cex" xmlns:w16cid="http://schemas.microsoft.com/office/word/2016/wordml/cid" xmlns:w16="http://schemas.microsoft.com/office/word/2018/wordml" xmlns:w16sdtdh="http://schemas.microsoft.com/office/word/2020/wordml/sdtdatahash" xmlns:w16sdtfl="http://schemas.microsoft.com/office/word/2024/wordml/sdtformatlock" xmlns:w16se="http://schemas.microsoft.com/office/word/2015/wordml/symex" xmlns:w16du="http://schemas.microsoft.com/office/word/2023/wordml/word16du" mc:Ignorable="w14 w15 w16se w16cid w16 w16cex w16sdtdh w16sdtfl w16du">
+<w:styles xmlns:mc="http://schemas.openxmlformats.org/markup-compatibility/2006" xmlns:r="http://schemas.openxmlformats.org/officeDocument/2006/relationships" xmlns:w="http://schemas.openxmlformats.org/wordprocessingml/2006/main" xmlns:w14="http://schemas.microsoft.com/office/word/2010/wordml" xmlns:w15="http://schemas.microsoft.com/office/word/2012/wordml" xmlns:w16cex="http://schemas.microsoft.com/office/word/2018/wordml/cex" xmlns:w16cid="http://schemas.microsoft.com/office/word/2016/wordml/cid" xmlns:w16="http://schemas.microsoft.com/office/word/2018/wordml" xmlns:w16du="http://schemas.microsoft.com/office/word/2023/wordml/word16du" xmlns:w16sdtdh="http://schemas.microsoft.com/office/word/2020/wordml/sdtdatahash" xmlns:w16sdtfl="http://schemas.microsoft.com/office/word/2024/wordml/sdtformatlock" xmlns:w16se="http://schemas.microsoft.com/office/word/2015/wordml/symex" mc:Ignorable="w14 w15 w16se w16cid w16 w16cex w16sdtdh w16sdtfl w16du">
   <w:docDefaults>
     <w:rPrDefault>
       <w:rPr>

</xml_diff>

<commit_message>
Add data preparation to notebook and update Data Preparation section
- Normalize test income labels and compare train/test categories
- Count duplicates and conflicting rows, with and without fnlwgt
- Verify education/education_num mapping and drop education
- Replace ? with Unknown, drop fnlwgt, log1p capital gain/loss
- Fill in Data Preparation; update fnlwgt and education sentences in Dataset and Findings
</commit_message>
<xml_diff>
--- a/Phase3_MidtermReport_Brinegar.docx
+++ b/Phase3_MidtermReport_Brinegar.docx
@@ -131,7 +131,15 @@
     </w:p>
     <w:p>
       <w:r>
-        <w:t xml:space="preserve">The loaded data contain six integer columns and nine object columns, including the target. Age and hours_per_week describe age and working hours; capital_gain and capital_loss record capital amounts. Education appears as both a named category and an ordered education_num code. Workclass, occupation, </w:t>
+        <w:t xml:space="preserve">The loaded data </w:t>
+      </w:r>
+      <w:proofErr w:type="gramStart"/>
+      <w:r>
+        <w:t>contain</w:t>
+      </w:r>
+      <w:proofErr w:type="gramEnd"/>
+      <w:r>
+        <w:t xml:space="preserve"> six integer columns and nine object columns, including the target. Age and hours_per_week describe age and working hours; capital_gain and capital_loss record capital amounts. Education appears as both a named category and an ordered education_num code. Workclass, occupation, </w:t>
       </w:r>
       <w:r>
         <w:t>marital_status, relationship, race, and native_country describe employment and demographic</w:t>
@@ -143,40 +151,44 @@
         <w:t>. Fnlwgt is a census sample weight</w:t>
       </w:r>
       <w:r>
-        <w:t>. It tells us how many people in the broader population one dataset record represents, i.e., the record counts more toward population estimates. We have not yet decided w</w:t>
-      </w:r>
-      <w:r>
-        <w:t xml:space="preserve">hether to exclude it, use it as a predictor, or use it for </w:t>
-      </w:r>
-      <w:r>
-        <w:t>weighting in some way.</w:t>
+        <w:t xml:space="preserve">. It tells us how many people in the broader population one dataset record represents, i.e., the record counts more toward population estimates. </w:t>
+      </w:r>
+      <w:r>
+        <w:rPr>
+          <w:highlight w:val="yellow"/>
+        </w:rPr>
+        <w:t xml:space="preserve">We excluded </w:t>
+      </w:r>
+      <w:proofErr w:type="spellStart"/>
+      <w:r>
+        <w:rPr>
+          <w:highlight w:val="yellow"/>
+        </w:rPr>
+        <w:t>fnlwgt</w:t>
+      </w:r>
+      <w:proofErr w:type="spellEnd"/>
+      <w:r>
+        <w:rPr>
+          <w:highlight w:val="yellow"/>
+        </w:rPr>
+        <w:t xml:space="preserve"> from modeling, as explained in Data Preparation.</w:t>
       </w:r>
     </w:p>
     <w:p>
-      <w:pPr>
-        <w:pStyle w:val="NormalWeb"/>
+      <w:r>
         <w:rPr>
-          <w:sz w:val="21"/>
-          <w:szCs w:val="21"/>
-        </w:rPr>
-      </w:pPr>
-      <w:r>
-        <w:rPr>
-          <w:sz w:val="21"/>
           <w:szCs w:val="21"/>
         </w:rPr>
         <w:t xml:space="preserve">The Adult dataset is a good fit for this project because it includes two income categories, unequal numbers of male and female observations, and both numerical and categorical features. However, the </w:t>
       </w:r>
       <w:r>
         <w:rPr>
-          <w:sz w:val="21"/>
           <w:szCs w:val="21"/>
         </w:rPr>
         <w:t>timeliness of the data is questionable</w:t>
       </w:r>
       <w:r>
         <w:rPr>
-          <w:sz w:val="21"/>
           <w:szCs w:val="21"/>
         </w:rPr>
         <w:t>, so the results may not apply to people today. The dataset also records sex only as male or female, which limits our fairness analysis to those two groups.</w:t>
@@ -254,6 +266,12 @@
       </w:r>
     </w:p>
     <w:p>
+      <w:pPr>
+        <w:rPr>
+          <w:i/>
+          <w:color w:val="595959"/>
+        </w:rPr>
+      </w:pPr>
       <w:r>
         <w:rPr>
           <w:i/>
@@ -290,6 +308,490 @@
           <w:color w:val="595959"/>
         </w:rPr>
         <w:t xml:space="preserve"> column. Record any feature transformations]</w:t>
+      </w:r>
+    </w:p>
+    <w:p>
+      <w:pPr>
+        <w:rPr>
+          <w:iCs/>
+          <w:color w:val="auto"/>
+          <w:highlight w:val="yellow"/>
+        </w:rPr>
+      </w:pPr>
+      <w:r>
+        <w:rPr>
+          <w:iCs/>
+          <w:color w:val="auto"/>
+          <w:highlight w:val="yellow"/>
+        </w:rPr>
+        <w:t xml:space="preserve">All preparation steps were applied to a copy of the combined data to make sure we didn’t affect the raw files, and all four resampling conditions start with the same prepared data. So first we removed the periods at the end of the income column in test, so know we only have to classes </w:t>
+      </w:r>
+      <w:r>
+        <w:rPr>
+          <w:iCs/>
+          <w:color w:val="auto"/>
+          <w:highlight w:val="yellow"/>
+        </w:rPr>
+        <w:t>≤50K (37,155) and &gt;50K (11,687).</w:t>
+      </w:r>
+      <w:r>
+        <w:rPr>
+          <w:iCs/>
+          <w:color w:val="auto"/>
+          <w:highlight w:val="yellow"/>
+        </w:rPr>
+        <w:t xml:space="preserve"> Then instead of dropping the 3,620 rows that had the ‘?’, we replaced them with an “Uknown” label (more specifically in </w:t>
+      </w:r>
+      <w:proofErr w:type="spellStart"/>
+      <w:r>
+        <w:rPr>
+          <w:iCs/>
+          <w:color w:val="auto"/>
+          <w:highlight w:val="yellow"/>
+        </w:rPr>
+        <w:t>workclass</w:t>
+      </w:r>
+      <w:proofErr w:type="spellEnd"/>
+      <w:r>
+        <w:rPr>
+          <w:iCs/>
+          <w:color w:val="auto"/>
+          <w:highlight w:val="yellow"/>
+        </w:rPr>
+        <w:t xml:space="preserve">, occupation, and </w:t>
+      </w:r>
+      <w:proofErr w:type="spellStart"/>
+      <w:r>
+        <w:rPr>
+          <w:iCs/>
+          <w:color w:val="auto"/>
+          <w:highlight w:val="yellow"/>
+        </w:rPr>
+        <w:t>native_country</w:t>
+      </w:r>
+      <w:proofErr w:type="spellEnd"/>
+      <w:r>
+        <w:rPr>
+          <w:iCs/>
+          <w:color w:val="auto"/>
+          <w:highlight w:val="yellow"/>
+        </w:rPr>
+        <w:t xml:space="preserve"> columns); the reason behind that choice was that dropping </w:t>
+      </w:r>
+      <w:r>
+        <w:rPr>
+          <w:iCs/>
+          <w:color w:val="auto"/>
+          <w:highlight w:val="yellow"/>
+        </w:rPr>
+        <w:t>them would remove 100 of the 1</w:t>
+      </w:r>
+      <w:r>
+        <w:rPr>
+          <w:iCs/>
+          <w:color w:val="auto"/>
+          <w:highlight w:val="yellow"/>
+        </w:rPr>
+        <w:t>,</w:t>
+      </w:r>
+      <w:r>
+        <w:rPr>
+          <w:iCs/>
+          <w:color w:val="auto"/>
+          <w:highlight w:val="yellow"/>
+        </w:rPr>
+        <w:t xml:space="preserve">769 Female &gt;50K records, which is already the smallest subgroup, and subgroup sizes are </w:t>
+      </w:r>
+      <w:r>
+        <w:rPr>
+          <w:iCs/>
+          <w:color w:val="auto"/>
+          <w:highlight w:val="yellow"/>
+        </w:rPr>
+        <w:t>important</w:t>
+      </w:r>
+      <w:r>
+        <w:rPr>
+          <w:iCs/>
+          <w:color w:val="auto"/>
+          <w:highlight w:val="yellow"/>
+        </w:rPr>
+        <w:t xml:space="preserve"> </w:t>
+      </w:r>
+      <w:r>
+        <w:rPr>
+          <w:iCs/>
+          <w:color w:val="auto"/>
+          <w:highlight w:val="yellow"/>
+        </w:rPr>
+        <w:t>in</w:t>
+      </w:r>
+      <w:r>
+        <w:rPr>
+          <w:iCs/>
+          <w:color w:val="auto"/>
+          <w:highlight w:val="yellow"/>
+        </w:rPr>
+        <w:t xml:space="preserve"> our fairness comparison.</w:t>
+      </w:r>
+    </w:p>
+    <w:p>
+      <w:pPr>
+        <w:rPr>
+          <w:iCs/>
+          <w:color w:val="auto"/>
+        </w:rPr>
+      </w:pPr>
+      <w:r>
+        <w:rPr>
+          <w:iCs/>
+          <w:color w:val="auto"/>
+          <w:highlight w:val="yellow"/>
+        </w:rPr>
+        <w:lastRenderedPageBreak/>
+        <w:t xml:space="preserve">We found only 52 exact duplicate rows (about 0.1%) and five conflicting groups (identical features with a different income). However, once we dropped </w:t>
+      </w:r>
+      <w:proofErr w:type="spellStart"/>
+      <w:r>
+        <w:rPr>
+          <w:iCs/>
+          <w:color w:val="auto"/>
+          <w:highlight w:val="yellow"/>
+        </w:rPr>
+        <w:t>fnlwgt</w:t>
+      </w:r>
+      <w:proofErr w:type="spellEnd"/>
+      <w:r>
+        <w:rPr>
+          <w:iCs/>
+          <w:color w:val="auto"/>
+          <w:highlight w:val="yellow"/>
+        </w:rPr>
+        <w:t xml:space="preserve"> </w:t>
+      </w:r>
+      <w:r>
+        <w:rPr>
+          <w:iCs/>
+          <w:color w:val="auto"/>
+          <w:highlight w:val="yellow"/>
+        </w:rPr>
+        <w:t xml:space="preserve">the duplicates increase to </w:t>
+      </w:r>
+      <w:r>
+        <w:rPr>
+          <w:iCs/>
+          <w:color w:val="auto"/>
+          <w:highlight w:val="yellow"/>
+        </w:rPr>
+        <w:t>6,374 (13.1%)</w:t>
+      </w:r>
+      <w:r>
+        <w:rPr>
+          <w:iCs/>
+          <w:color w:val="auto"/>
+          <w:highlight w:val="yellow"/>
+        </w:rPr>
+        <w:t>,</w:t>
+      </w:r>
+      <w:r>
+        <w:rPr>
+          <w:iCs/>
+          <w:color w:val="auto"/>
+          <w:highlight w:val="yellow"/>
+        </w:rPr>
+        <w:t xml:space="preserve"> since many people share common profiles; we kept all rows because they are separate records</w:t>
+      </w:r>
+      <w:r>
+        <w:rPr>
+          <w:iCs/>
+          <w:color w:val="auto"/>
+          <w:highlight w:val="yellow"/>
+        </w:rPr>
+        <w:t xml:space="preserve"> and it doesn’t necessarily mean they’re duplicates</w:t>
+      </w:r>
+      <w:r>
+        <w:rPr>
+          <w:iCs/>
+          <w:color w:val="auto"/>
+          <w:highlight w:val="yellow"/>
+        </w:rPr>
+        <w:t>, but this remains an open question for Phase 4.</w:t>
+      </w:r>
+      <w:r>
+        <w:rPr>
+          <w:iCs/>
+          <w:color w:val="auto"/>
+          <w:highlight w:val="yellow"/>
+        </w:rPr>
+        <w:t xml:space="preserve"> </w:t>
+      </w:r>
+      <w:r>
+        <w:rPr>
+          <w:iCs/>
+          <w:color w:val="auto"/>
+          <w:highlight w:val="yellow"/>
+        </w:rPr>
+        <w:t xml:space="preserve">Additionally, education and </w:t>
+      </w:r>
+      <w:proofErr w:type="spellStart"/>
+      <w:r>
+        <w:rPr>
+          <w:iCs/>
+          <w:color w:val="auto"/>
+          <w:highlight w:val="yellow"/>
+        </w:rPr>
+        <w:t>education_num</w:t>
+      </w:r>
+      <w:proofErr w:type="spellEnd"/>
+      <w:r>
+        <w:rPr>
+          <w:iCs/>
+          <w:color w:val="auto"/>
+          <w:highlight w:val="yellow"/>
+        </w:rPr>
+        <w:t xml:space="preserve"> </w:t>
+      </w:r>
+      <w:r>
+        <w:rPr>
+          <w:iCs/>
+          <w:color w:val="auto"/>
+          <w:highlight w:val="yellow"/>
+        </w:rPr>
+        <w:t>ended up having</w:t>
+      </w:r>
+      <w:r>
+        <w:rPr>
+          <w:iCs/>
+          <w:color w:val="auto"/>
+          <w:highlight w:val="yellow"/>
+        </w:rPr>
+        <w:t xml:space="preserve"> a one-to-one mapping, from Preschool (1) to Doctorate (16), so we</w:t>
+      </w:r>
+      <w:r>
+        <w:rPr>
+          <w:iCs/>
+          <w:color w:val="auto"/>
+          <w:highlight w:val="yellow"/>
+        </w:rPr>
+        <w:t xml:space="preserve"> decided to</w:t>
+      </w:r>
+      <w:r>
+        <w:rPr>
+          <w:iCs/>
+          <w:color w:val="auto"/>
+          <w:highlight w:val="yellow"/>
+        </w:rPr>
+        <w:t xml:space="preserve"> drop</w:t>
+      </w:r>
+      <w:r>
+        <w:rPr>
+          <w:iCs/>
+          <w:color w:val="auto"/>
+          <w:highlight w:val="yellow"/>
+        </w:rPr>
+        <w:t xml:space="preserve"> </w:t>
+      </w:r>
+      <w:r>
+        <w:rPr>
+          <w:iCs/>
+          <w:color w:val="auto"/>
+          <w:highlight w:val="yellow"/>
+        </w:rPr>
+        <w:t xml:space="preserve">education and kept </w:t>
+      </w:r>
+      <w:r>
+        <w:rPr>
+          <w:iCs/>
+          <w:color w:val="auto"/>
+          <w:highlight w:val="yellow"/>
+        </w:rPr>
+        <w:t>the column with the numbers</w:t>
+      </w:r>
+      <w:r>
+        <w:rPr>
+          <w:iCs/>
+          <w:color w:val="auto"/>
+          <w:highlight w:val="yellow"/>
+        </w:rPr>
+        <w:t xml:space="preserve"> which</w:t>
+      </w:r>
+      <w:r>
+        <w:rPr>
+          <w:iCs/>
+          <w:color w:val="auto"/>
+          <w:highlight w:val="yellow"/>
+        </w:rPr>
+        <w:t xml:space="preserve"> at the end</w:t>
+      </w:r>
+      <w:r>
+        <w:rPr>
+          <w:iCs/>
+          <w:color w:val="auto"/>
+          <w:highlight w:val="yellow"/>
+        </w:rPr>
+        <w:t xml:space="preserve"> keeps the order between </w:t>
+      </w:r>
+      <w:r>
+        <w:rPr>
+          <w:iCs/>
+          <w:color w:val="auto"/>
+          <w:highlight w:val="yellow"/>
+        </w:rPr>
+        <w:t>levels. The reason for dropping</w:t>
+      </w:r>
+      <w:r>
+        <w:rPr>
+          <w:iCs/>
+          <w:color w:val="auto"/>
+          <w:highlight w:val="yellow"/>
+        </w:rPr>
+        <w:t xml:space="preserve"> </w:t>
+      </w:r>
+      <w:proofErr w:type="spellStart"/>
+      <w:r>
+        <w:rPr>
+          <w:iCs/>
+          <w:color w:val="auto"/>
+          <w:highlight w:val="yellow"/>
+        </w:rPr>
+        <w:t>fnlwgt</w:t>
+      </w:r>
+      <w:proofErr w:type="spellEnd"/>
+      <w:r>
+        <w:rPr>
+          <w:iCs/>
+          <w:color w:val="auto"/>
+          <w:highlight w:val="yellow"/>
+        </w:rPr>
+        <w:t xml:space="preserve"> was that </w:t>
+      </w:r>
+      <w:r>
+        <w:rPr>
+          <w:iCs/>
+          <w:color w:val="auto"/>
+          <w:highlight w:val="yellow"/>
+        </w:rPr>
+        <w:t xml:space="preserve">it is a census sampling weight and not a personal characteristic, and it is only comparable within a state, which the dataset does not include; </w:t>
+      </w:r>
+      <w:proofErr w:type="gramStart"/>
+      <w:r>
+        <w:rPr>
+          <w:iCs/>
+          <w:color w:val="auto"/>
+          <w:highlight w:val="yellow"/>
+        </w:rPr>
+        <w:t>so</w:t>
+      </w:r>
+      <w:proofErr w:type="gramEnd"/>
+      <w:r>
+        <w:rPr>
+          <w:iCs/>
+          <w:color w:val="auto"/>
+          <w:highlight w:val="yellow"/>
+        </w:rPr>
+        <w:t xml:space="preserve"> then the best decision is to drop it since we don’t really know how it works or was collected. Finally, we applied a log(1 + x) transformation to </w:t>
+      </w:r>
+      <w:proofErr w:type="spellStart"/>
+      <w:r>
+        <w:rPr>
+          <w:iCs/>
+          <w:color w:val="auto"/>
+          <w:highlight w:val="yellow"/>
+        </w:rPr>
+        <w:t>capital_gain</w:t>
+      </w:r>
+      <w:proofErr w:type="spellEnd"/>
+      <w:r>
+        <w:rPr>
+          <w:iCs/>
+          <w:color w:val="auto"/>
+          <w:highlight w:val="yellow"/>
+        </w:rPr>
+        <w:t xml:space="preserve"> and </w:t>
+      </w:r>
+      <w:proofErr w:type="spellStart"/>
+      <w:r>
+        <w:rPr>
+          <w:iCs/>
+          <w:color w:val="auto"/>
+          <w:highlight w:val="yellow"/>
+        </w:rPr>
+        <w:t>capital_loss</w:t>
+      </w:r>
+      <w:proofErr w:type="spellEnd"/>
+      <w:r>
+        <w:rPr>
+          <w:iCs/>
+          <w:color w:val="auto"/>
+          <w:highlight w:val="yellow"/>
+        </w:rPr>
+        <w:t xml:space="preserve">, to keep the zeros as zeros and reduce the influence of very large values/outliers like 99,999 (244 records) </w:t>
+      </w:r>
+      <w:r>
+        <w:rPr>
+          <w:iCs/>
+          <w:color w:val="auto"/>
+          <w:highlight w:val="yellow"/>
+        </w:rPr>
+        <w:t>when SMOTE-NC selects neighbors.</w:t>
+      </w:r>
+      <w:r>
+        <w:rPr>
+          <w:iCs/>
+          <w:color w:val="auto"/>
+          <w:highlight w:val="yellow"/>
+        </w:rPr>
+        <w:t xml:space="preserve"> </w:t>
+      </w:r>
+      <w:r>
+        <w:rPr>
+          <w:iCs/>
+          <w:color w:val="auto"/>
+          <w:highlight w:val="yellow"/>
+        </w:rPr>
+        <w:t xml:space="preserve">We did not remove </w:t>
+      </w:r>
+      <w:r>
+        <w:rPr>
+          <w:iCs/>
+          <w:color w:val="auto"/>
+          <w:highlight w:val="yellow"/>
+        </w:rPr>
+        <w:t xml:space="preserve">any </w:t>
+      </w:r>
+      <w:r>
+        <w:rPr>
+          <w:iCs/>
+          <w:color w:val="auto"/>
+          <w:highlight w:val="yellow"/>
+        </w:rPr>
+        <w:t xml:space="preserve">outliers, since values like age 90 or 99 hours per week are </w:t>
+      </w:r>
+      <w:proofErr w:type="gramStart"/>
+      <w:r>
+        <w:rPr>
+          <w:iCs/>
+          <w:color w:val="auto"/>
+          <w:highlight w:val="yellow"/>
+        </w:rPr>
+        <w:t>actually possible</w:t>
+      </w:r>
+      <w:proofErr w:type="gramEnd"/>
+      <w:r>
+        <w:rPr>
+          <w:iCs/>
+          <w:color w:val="auto"/>
+          <w:highlight w:val="yellow"/>
+        </w:rPr>
+        <w:t xml:space="preserve"> and may be correct,</w:t>
+      </w:r>
+      <w:r>
+        <w:rPr>
+          <w:iCs/>
+          <w:color w:val="auto"/>
+          <w:highlight w:val="yellow"/>
+        </w:rPr>
+        <w:t xml:space="preserve"> and a decision tree splits on thresholds. The prepared data keeps all 48,842 rows, with 5 numerical and 7 categorical predictors, and the subgroup counts are unchanged.</w:t>
       </w:r>
     </w:p>
     <w:p>
@@ -724,7 +1226,6 @@
     </w:p>
     <w:p>
       <w:r>
-        <w:lastRenderedPageBreak/>
         <w:t>Table 1 counts entries by column, not affected rows</w:t>
       </w:r>
       <w:r>
@@ -1515,7 +2016,11 @@
         <w:t xml:space="preserve"> and </w:t>
       </w:r>
       <w:r>
-        <w:t>differences in the outcome variable strings</w:t>
+        <w:t xml:space="preserve">differences in the outcome </w:t>
+      </w:r>
+      <w:r>
+        <w:lastRenderedPageBreak/>
+        <w:t>variable strings</w:t>
       </w:r>
       <w:r>
         <w:t xml:space="preserve"> </w:t>
@@ -1535,13 +2040,81 @@
     </w:p>
     <w:p>
       <w:r>
-        <w:t xml:space="preserve">The strongest unexpected inspection result is that all columns appear non-null even though three contain explicit unknown markers. This illustrates why storage-level checks alone are insufficient. The two education representations may also be redundant, </w:t>
+        <w:t xml:space="preserve">The strongest unexpected inspection result is that all columns appear non-null even though three contain explicit unknown markers. This illustrates why storage-level checks alone are insufficient. </w:t>
       </w:r>
       <w:r>
         <w:rPr>
-          <w:highlight w:val="lightGray"/>
+          <w:highlight w:val="yellow"/>
         </w:rPr>
-        <w:t>but their exact mapping still needs verification.</w:t>
+        <w:t xml:space="preserve">The two education representations </w:t>
+      </w:r>
+      <w:r>
+        <w:rPr>
+          <w:highlight w:val="yellow"/>
+        </w:rPr>
+        <w:t>were</w:t>
+      </w:r>
+      <w:r>
+        <w:rPr>
+          <w:highlight w:val="yellow"/>
+        </w:rPr>
+        <w:t xml:space="preserve"> also redundant, since each label </w:t>
+      </w:r>
+      <w:proofErr w:type="gramStart"/>
+      <w:r>
+        <w:rPr>
+          <w:highlight w:val="yellow"/>
+        </w:rPr>
+        <w:t>maps to</w:t>
+      </w:r>
+      <w:proofErr w:type="gramEnd"/>
+      <w:r>
+        <w:rPr>
+          <w:highlight w:val="yellow"/>
+        </w:rPr>
+        <w:t xml:space="preserve"> exactly one </w:t>
+      </w:r>
+      <w:proofErr w:type="spellStart"/>
+      <w:r>
+        <w:rPr>
+          <w:highlight w:val="yellow"/>
+        </w:rPr>
+        <w:t>education_num</w:t>
+      </w:r>
+      <w:proofErr w:type="spellEnd"/>
+      <w:r>
+        <w:rPr>
+          <w:highlight w:val="yellow"/>
+        </w:rPr>
+        <w:t xml:space="preserve"> code. Another unexpected result is that excluding </w:t>
+      </w:r>
+      <w:proofErr w:type="spellStart"/>
+      <w:r>
+        <w:rPr>
+          <w:highlight w:val="yellow"/>
+        </w:rPr>
+        <w:t>fnlwgt</w:t>
+      </w:r>
+      <w:proofErr w:type="spellEnd"/>
+      <w:r>
+        <w:rPr>
+          <w:highlight w:val="yellow"/>
+        </w:rPr>
+        <w:t xml:space="preserve"> turns 13.1% of the rows into duplicates, because </w:t>
+      </w:r>
+      <w:proofErr w:type="spellStart"/>
+      <w:r>
+        <w:rPr>
+          <w:highlight w:val="yellow"/>
+        </w:rPr>
+        <w:t>fnlwgt</w:t>
+      </w:r>
+      <w:proofErr w:type="spellEnd"/>
+      <w:r>
+        <w:rPr>
+          <w:highlight w:val="yellow"/>
+        </w:rPr>
+        <w:t xml:space="preserve"> was the only almost-unique column.</w:t>
       </w:r>
     </w:p>
     <w:p>
@@ -1576,11 +2149,7 @@
       </w:r>
       <w:proofErr w:type="spellEnd"/>
       <w:r>
-        <w:t xml:space="preserve"> removes records. Neither method changes the values within a record. Synthetic </w:t>
-      </w:r>
-      <w:r>
-        <w:lastRenderedPageBreak/>
-        <w:t>categorical values and demographic/outcome labels will be validated.</w:t>
+        <w:t xml:space="preserve"> removes records. Neither method changes the values within a record. Synthetic categorical values and demographic/outcome labels will be validated.</w:t>
       </w:r>
     </w:p>
     <w:p>
@@ -1601,12 +2170,207 @@
       </w:r>
     </w:p>
     <w:p>
+      <w:pPr>
+        <w:rPr>
+          <w:i/>
+          <w:color w:val="595959"/>
+        </w:rPr>
+      </w:pPr>
       <w:r>
         <w:rPr>
           <w:i/>
           <w:color w:val="595959"/>
         </w:rPr>
         <w:t>[To complete: Specify K, the source-file split strategy, final preprocessing and predictor set, decision-tree settings, and SMOTE-NC neighbor count after verifying subgroup sizes. Confirm whether sex enters the classifier and how undefined group metrics will be handled.]</w:t>
+      </w:r>
+    </w:p>
+    <w:p>
+      <w:pPr>
+        <w:rPr>
+          <w:b/>
+          <w:bCs/>
+          <w:iCs/>
+        </w:rPr>
+      </w:pPr>
+      <w:r>
+        <w:rPr>
+          <w:b/>
+          <w:bCs/>
+          <w:iCs/>
+          <w:color w:val="595959"/>
+          <w:highlight w:val="yellow"/>
+        </w:rPr>
+        <w:t>Use this if needed:</w:t>
+      </w:r>
+      <w:r>
+        <w:rPr>
+          <w:b/>
+          <w:bCs/>
+          <w:iCs/>
+          <w:color w:val="595959"/>
+        </w:rPr>
+        <w:br/>
+      </w:r>
+      <w:r>
+        <w:rPr>
+          <w:iCs/>
+          <w:highlight w:val="yellow"/>
+        </w:rPr>
+        <w:t xml:space="preserve">We </w:t>
+      </w:r>
+      <w:r>
+        <w:rPr>
+          <w:iCs/>
+          <w:highlight w:val="yellow"/>
+        </w:rPr>
+        <w:t xml:space="preserve">decided to </w:t>
+      </w:r>
+      <w:r>
+        <w:rPr>
+          <w:iCs/>
+          <w:highlight w:val="yellow"/>
+        </w:rPr>
+        <w:t xml:space="preserve">keep the </w:t>
+      </w:r>
+      <w:r>
+        <w:rPr>
+          <w:iCs/>
+          <w:highlight w:val="yellow"/>
+        </w:rPr>
+        <w:t>given</w:t>
+      </w:r>
+      <w:r>
+        <w:rPr>
+          <w:iCs/>
+          <w:highlight w:val="yellow"/>
+        </w:rPr>
+        <w:t xml:space="preserve"> train/test split: cross-validation folds </w:t>
+      </w:r>
+      <w:r>
+        <w:rPr>
+          <w:iCs/>
+          <w:highlight w:val="yellow"/>
+        </w:rPr>
+        <w:t>will be</w:t>
+      </w:r>
+      <w:r>
+        <w:rPr>
+          <w:iCs/>
+          <w:highlight w:val="yellow"/>
+        </w:rPr>
+        <w:t xml:space="preserve"> built within the 32,561 training rows, and the 16,281 test rows are reserved for the final evaluation. The predictors are age, </w:t>
+      </w:r>
+      <w:proofErr w:type="spellStart"/>
+      <w:r>
+        <w:rPr>
+          <w:iCs/>
+          <w:highlight w:val="yellow"/>
+        </w:rPr>
+        <w:t>education_num</w:t>
+      </w:r>
+      <w:proofErr w:type="spellEnd"/>
+      <w:r>
+        <w:rPr>
+          <w:iCs/>
+          <w:highlight w:val="yellow"/>
+        </w:rPr>
+        <w:t xml:space="preserve">, </w:t>
+      </w:r>
+      <w:proofErr w:type="spellStart"/>
+      <w:r>
+        <w:rPr>
+          <w:iCs/>
+          <w:highlight w:val="yellow"/>
+        </w:rPr>
+        <w:t>capital_gain_log</w:t>
+      </w:r>
+      <w:proofErr w:type="spellEnd"/>
+      <w:r>
+        <w:rPr>
+          <w:iCs/>
+          <w:highlight w:val="yellow"/>
+        </w:rPr>
+        <w:t xml:space="preserve">, </w:t>
+      </w:r>
+      <w:proofErr w:type="spellStart"/>
+      <w:r>
+        <w:rPr>
+          <w:iCs/>
+          <w:highlight w:val="yellow"/>
+        </w:rPr>
+        <w:t>capital_loss_log</w:t>
+      </w:r>
+      <w:proofErr w:type="spellEnd"/>
+      <w:r>
+        <w:rPr>
+          <w:iCs/>
+          <w:highlight w:val="yellow"/>
+        </w:rPr>
+        <w:t xml:space="preserve">, </w:t>
+      </w:r>
+      <w:proofErr w:type="spellStart"/>
+      <w:r>
+        <w:rPr>
+          <w:iCs/>
+          <w:highlight w:val="yellow"/>
+        </w:rPr>
+        <w:t>hours_per_week</w:t>
+      </w:r>
+      <w:proofErr w:type="spellEnd"/>
+      <w:r>
+        <w:rPr>
+          <w:iCs/>
+          <w:highlight w:val="yellow"/>
+        </w:rPr>
+        <w:t xml:space="preserve">, </w:t>
+      </w:r>
+      <w:proofErr w:type="spellStart"/>
+      <w:r>
+        <w:rPr>
+          <w:iCs/>
+          <w:highlight w:val="yellow"/>
+        </w:rPr>
+        <w:t>workclass</w:t>
+      </w:r>
+      <w:proofErr w:type="spellEnd"/>
+      <w:r>
+        <w:rPr>
+          <w:iCs/>
+          <w:highlight w:val="yellow"/>
+        </w:rPr>
+        <w:t xml:space="preserve">, </w:t>
+      </w:r>
+      <w:proofErr w:type="spellStart"/>
+      <w:r>
+        <w:rPr>
+          <w:iCs/>
+          <w:highlight w:val="yellow"/>
+        </w:rPr>
+        <w:t>marital_status</w:t>
+      </w:r>
+      <w:proofErr w:type="spellEnd"/>
+      <w:r>
+        <w:rPr>
+          <w:iCs/>
+          <w:highlight w:val="yellow"/>
+        </w:rPr>
+        <w:t xml:space="preserve">, occupation, relationship, race, and </w:t>
+      </w:r>
+      <w:proofErr w:type="spellStart"/>
+      <w:r>
+        <w:rPr>
+          <w:iCs/>
+          <w:highlight w:val="yellow"/>
+        </w:rPr>
+        <w:t>native_country</w:t>
+      </w:r>
+      <w:proofErr w:type="spellEnd"/>
+      <w:r>
+        <w:rPr>
+          <w:iCs/>
+          <w:highlight w:val="yellow"/>
+        </w:rPr>
+        <w:t>, with sex still to be decided.</w:t>
       </w:r>
     </w:p>
     <w:p>
@@ -2534,7 +3298,6 @@
   <w:style w:type="character" w:default="1" w:styleId="DefaultParagraphFont">
     <w:name w:val="Default Paragraph Font"/>
     <w:uiPriority w:val="1"/>
-    <w:semiHidden/>
     <w:unhideWhenUsed/>
   </w:style>
   <w:style w:type="table" w:default="1" w:styleId="TableNormal">

</xml_diff>

<commit_message>
Add subgroup plots and income-rate analysis; update midterm findings
</commit_message>
<xml_diff>
--- a/Phase3_MidtermReport_Brinegar.docx
+++ b/Phase3_MidtermReport_Brinegar.docx
@@ -1,6 +1,6 @@
 
 <file path=word/document.xml><?xml version="1.0" encoding="utf-8"?>
-<w:document xmlns:wpc="http://schemas.microsoft.com/office/word/2010/wordprocessingCanvas" xmlns:cx="http://schemas.microsoft.com/office/drawing/2014/chartex" xmlns:cx1="http://schemas.microsoft.com/office/drawing/2015/9/8/chartex" xmlns:cx2="http://schemas.microsoft.com/office/drawing/2015/10/21/chartex" xmlns:cx3="http://schemas.microsoft.com/office/drawing/2016/5/9/chartex" xmlns:cx4="http://schemas.microsoft.com/office/drawing/2016/5/10/chartex" xmlns:cx5="http://schemas.microsoft.com/office/drawing/2016/5/11/chartex" xmlns:cx6="http://schemas.microsoft.com/office/drawing/2016/5/12/chartex" xmlns:cx7="http://schemas.microsoft.com/office/drawing/2016/5/13/chartex" xmlns:cx8="http://schemas.microsoft.com/office/drawing/2016/5/14/chartex" xmlns:mc="http://schemas.openxmlformats.org/markup-compatibility/2006" xmlns:aink="http://schemas.microsoft.com/office/drawing/2016/ink" xmlns:am3d="http://schemas.microsoft.com/office/drawing/2017/model3d" xmlns:o="urn:schemas-microsoft-com:office:office" xmlns:oel="http://schemas.microsoft.com/office/2019/extlst" xmlns:r="http://schemas.openxmlformats.org/officeDocument/2006/relationships" xmlns:m="http://schemas.openxmlformats.org/officeDocument/2006/math" xmlns:v="urn:schemas-microsoft-com:vml" xmlns:wp14="http://schemas.microsoft.com/office/word/2010/wordprocessingDrawing" xmlns:wp="http://schemas.openxmlformats.org/drawingml/2006/wordprocessingDrawing" xmlns:w10="urn:schemas-microsoft-com:office:word" xmlns:w="http://schemas.openxmlformats.org/wordprocessingml/2006/main" xmlns:w14="http://schemas.microsoft.com/office/word/2010/wordml" xmlns:w15="http://schemas.microsoft.com/office/word/2012/wordml" xmlns:w16cex="http://schemas.microsoft.com/office/word/2018/wordml/cex" xmlns:w16cid="http://schemas.microsoft.com/office/word/2016/wordml/cid" xmlns:w16="http://schemas.microsoft.com/office/word/2018/wordml" xmlns:w16du="http://schemas.microsoft.com/office/word/2023/wordml/word16du" xmlns:w16sdtdh="http://schemas.microsoft.com/office/word/2020/wordml/sdtdatahash" xmlns:w16sdtfl="http://schemas.microsoft.com/office/word/2024/wordml/sdtformatlock" xmlns:w16se="http://schemas.microsoft.com/office/word/2015/wordml/symex" xmlns:wpg="http://schemas.microsoft.com/office/word/2010/wordprocessingGroup" xmlns:wpi="http://schemas.microsoft.com/office/word/2010/wordprocessingInk" xmlns:wne="http://schemas.microsoft.com/office/word/2006/wordml" xmlns:wps="http://schemas.microsoft.com/office/word/2010/wordprocessingShape" mc:Ignorable="w14 w15 w16se w16cid w16 w16cex w16sdtdh w16sdtfl w16du wp14">
+<w:document xmlns:wpc="http://schemas.microsoft.com/office/word/2010/wordprocessingCanvas" xmlns:cx="http://schemas.microsoft.com/office/drawing/2014/chartex" xmlns:cx1="http://schemas.microsoft.com/office/drawing/2015/9/8/chartex" xmlns:cx2="http://schemas.microsoft.com/office/drawing/2015/10/21/chartex" xmlns:cx3="http://schemas.microsoft.com/office/drawing/2016/5/9/chartex" xmlns:cx4="http://schemas.microsoft.com/office/drawing/2016/5/10/chartex" xmlns:cx5="http://schemas.microsoft.com/office/drawing/2016/5/11/chartex" xmlns:cx6="http://schemas.microsoft.com/office/drawing/2016/5/12/chartex" xmlns:cx7="http://schemas.microsoft.com/office/drawing/2016/5/13/chartex" xmlns:cx8="http://schemas.microsoft.com/office/drawing/2016/5/14/chartex" xmlns:mc="http://schemas.openxmlformats.org/markup-compatibility/2006" xmlns:m="http://schemas.openxmlformats.org/officeDocument/2006/math" xmlns:aink="http://schemas.microsoft.com/office/drawing/2016/ink" xmlns:am3d="http://schemas.microsoft.com/office/drawing/2017/model3d" xmlns:oel="http://schemas.microsoft.com/office/2019/extlst" xmlns:r="http://schemas.openxmlformats.org/officeDocument/2006/relationships" xmlns:wp14="http://schemas.microsoft.com/office/word/2010/wordprocessingDrawing" xmlns:wp="http://schemas.openxmlformats.org/drawingml/2006/wordprocessingDrawing" xmlns:wpg="http://schemas.microsoft.com/office/word/2010/wordprocessingGroup" xmlns:wpi="http://schemas.microsoft.com/office/word/2010/wordprocessingInk" xmlns:wps="http://schemas.microsoft.com/office/word/2010/wordprocessingShape" xmlns:o="urn:schemas-microsoft-com:office:office" xmlns:v="urn:schemas-microsoft-com:vml" xmlns:w10="urn:schemas-microsoft-com:office:word" xmlns:w="http://schemas.openxmlformats.org/wordprocessingml/2006/main" xmlns:w14="http://schemas.microsoft.com/office/word/2010/wordml" xmlns:w15="http://schemas.microsoft.com/office/word/2012/wordml" xmlns:w16cex="http://schemas.microsoft.com/office/word/2018/wordml/cex" xmlns:w16cid="http://schemas.microsoft.com/office/word/2016/wordml/cid" xmlns:w16="http://schemas.microsoft.com/office/word/2018/wordml" xmlns:w16sdtdh="http://schemas.microsoft.com/office/word/2020/wordml/sdtdatahash" xmlns:w16sdtfl="http://schemas.microsoft.com/office/word/2024/wordml/sdtformatlock" xmlns:w16se="http://schemas.microsoft.com/office/word/2015/wordml/symex" xmlns:w16du="http://schemas.microsoft.com/office/word/2023/wordml/word16du" xmlns:wne="http://schemas.microsoft.com/office/word/2006/wordml" mc:Ignorable="w14 w15 w16se w16cid w16 w16cex w16sdtdh w16sdtfl w16du wp14">
   <w:body>
     <w:p>
       <w:pPr>
@@ -131,15 +131,7 @@
     </w:p>
     <w:p>
       <w:r>
-        <w:t xml:space="preserve">The loaded data </w:t>
-      </w:r>
-      <w:proofErr w:type="gramStart"/>
-      <w:r>
-        <w:t>contain</w:t>
-      </w:r>
-      <w:proofErr w:type="gramEnd"/>
-      <w:r>
-        <w:t xml:space="preserve"> six integer columns and nine object columns, including the target. Age and hours_per_week describe age and working hours; capital_gain and capital_loss record capital amounts. Education appears as both a named category and an ordered education_num code. Workclass, occupation, </w:t>
+        <w:t xml:space="preserve">The loaded data contain six integer columns and nine object columns, including the target. Age and hours_per_week describe age and working hours; capital_gain and capital_loss record capital amounts. Education appears as both a named category and an ordered education_num code. Workclass, occupation, </w:t>
       </w:r>
       <w:r>
         <w:t>marital_status, relationship, race, and native_country describe employment and demographic</w:t>
@@ -263,51 +255,6 @@
       <w:proofErr w:type="spellEnd"/>
       <w:r>
         <w:t>() therefore is not meaningful for this dataset.</w:t>
-      </w:r>
-    </w:p>
-    <w:p>
-      <w:pPr>
-        <w:rPr>
-          <w:i/>
-          <w:color w:val="595959"/>
-        </w:rPr>
-      </w:pPr>
-      <w:r>
-        <w:rPr>
-          <w:i/>
-          <w:color w:val="595959"/>
-        </w:rPr>
-        <w:t>[To complete: Add transformations/cleaning done for missing values, the trailing ‘.’ in the target column values, etc.</w:t>
-      </w:r>
-      <w:r>
-        <w:rPr>
-          <w:i/>
-          <w:color w:val="595959"/>
-        </w:rPr>
-        <w:t xml:space="preserve"> </w:t>
-      </w:r>
-      <w:r>
-        <w:rPr>
-          <w:i/>
-          <w:color w:val="595959"/>
-        </w:rPr>
-        <w:t xml:space="preserve">Complete missing-data and outlier checks, verify the education mapping, and finalize feature selection, categorical encoding, and the role of the </w:t>
-      </w:r>
-      <w:proofErr w:type="spellStart"/>
-      <w:r>
-        <w:rPr>
-          <w:i/>
-          <w:color w:val="595959"/>
-        </w:rPr>
-        <w:t>fnlwgt</w:t>
-      </w:r>
-      <w:proofErr w:type="spellEnd"/>
-      <w:r>
-        <w:rPr>
-          <w:i/>
-          <w:color w:val="595959"/>
-        </w:rPr>
-        <w:t xml:space="preserve"> column. Record any feature transformations]</w:t>
       </w:r>
     </w:p>
     <w:p>
@@ -324,23 +271,7 @@
           <w:color w:val="auto"/>
           <w:highlight w:val="yellow"/>
         </w:rPr>
-        <w:t xml:space="preserve">All preparation steps were applied to a copy of the combined data to make sure we didn’t affect the raw files, and all four resampling conditions start with the same prepared data. So first we removed the periods at the end of the income column in test, so know we only have to classes </w:t>
-      </w:r>
-      <w:r>
-        <w:rPr>
-          <w:iCs/>
-          <w:color w:val="auto"/>
-          <w:highlight w:val="yellow"/>
-        </w:rPr>
-        <w:t>≤50K (37,155) and &gt;50K (11,687).</w:t>
-      </w:r>
-      <w:r>
-        <w:rPr>
-          <w:iCs/>
-          <w:color w:val="auto"/>
-          <w:highlight w:val="yellow"/>
-        </w:rPr>
-        <w:t xml:space="preserve"> Then instead of dropping the 3,620 rows that had the ‘?’, we replaced them with an “Uknown” label (more specifically in </w:t>
+        <w:t xml:space="preserve">All preparation steps were applied to a copy of the combined data to make sure we didn’t affect the raw files, and all four resampling conditions start with the same prepared data. So first we removed the periods at the end of the income column in test, so know we only have to classes ≤50K (37,155) and &gt;50K (11,687). Then instead of dropping the 3,620 rows that had the ‘?’, we replaced them with an “Uknown” label (more specifically in </w:t>
       </w:r>
       <w:proofErr w:type="spellStart"/>
       <w:r>
@@ -376,63 +307,7 @@
           <w:color w:val="auto"/>
           <w:highlight w:val="yellow"/>
         </w:rPr>
-        <w:t xml:space="preserve"> columns); the reason behind that choice was that dropping </w:t>
-      </w:r>
-      <w:r>
-        <w:rPr>
-          <w:iCs/>
-          <w:color w:val="auto"/>
-          <w:highlight w:val="yellow"/>
-        </w:rPr>
-        <w:t>them would remove 100 of the 1</w:t>
-      </w:r>
-      <w:r>
-        <w:rPr>
-          <w:iCs/>
-          <w:color w:val="auto"/>
-          <w:highlight w:val="yellow"/>
-        </w:rPr>
-        <w:t>,</w:t>
-      </w:r>
-      <w:r>
-        <w:rPr>
-          <w:iCs/>
-          <w:color w:val="auto"/>
-          <w:highlight w:val="yellow"/>
-        </w:rPr>
-        <w:t xml:space="preserve">769 Female &gt;50K records, which is already the smallest subgroup, and subgroup sizes are </w:t>
-      </w:r>
-      <w:r>
-        <w:rPr>
-          <w:iCs/>
-          <w:color w:val="auto"/>
-          <w:highlight w:val="yellow"/>
-        </w:rPr>
-        <w:t>important</w:t>
-      </w:r>
-      <w:r>
-        <w:rPr>
-          <w:iCs/>
-          <w:color w:val="auto"/>
-          <w:highlight w:val="yellow"/>
-        </w:rPr>
-        <w:t xml:space="preserve"> </w:t>
-      </w:r>
-      <w:r>
-        <w:rPr>
-          <w:iCs/>
-          <w:color w:val="auto"/>
-          <w:highlight w:val="yellow"/>
-        </w:rPr>
-        <w:t>in</w:t>
-      </w:r>
-      <w:r>
-        <w:rPr>
-          <w:iCs/>
-          <w:color w:val="auto"/>
-          <w:highlight w:val="yellow"/>
-        </w:rPr>
-        <w:t xml:space="preserve"> our fairness comparison.</w:t>
+        <w:t xml:space="preserve"> columns); the reason behind that choice was that dropping them would remove 100 of the 1,769 Female &gt;50K records, which is already the smallest subgroup, and subgroup sizes are important in our fairness comparison.</w:t>
       </w:r>
     </w:p>
     <w:p>
@@ -448,7 +323,6 @@
           <w:color w:val="auto"/>
           <w:highlight w:val="yellow"/>
         </w:rPr>
-        <w:lastRenderedPageBreak/>
         <w:t xml:space="preserve">We found only 52 exact duplicate rows (about 0.1%) and five conflicting groups (identical features with a different income). However, once we dropped </w:t>
       </w:r>
       <w:proofErr w:type="spellStart"/>
@@ -467,7 +341,7 @@
           <w:color w:val="auto"/>
           <w:highlight w:val="yellow"/>
         </w:rPr>
-        <w:t xml:space="preserve"> </w:t>
+        <w:t xml:space="preserve"> the duplicates increase to 6,374 (13.1%), since many people share common profiles; we kept all rows because they are separate records and it doesn’t necessarily mean they’re </w:t>
       </w:r>
       <w:r>
         <w:rPr>
@@ -475,7 +349,8 @@
           <w:color w:val="auto"/>
           <w:highlight w:val="yellow"/>
         </w:rPr>
-        <w:t xml:space="preserve">the duplicates increase to </w:t>
+        <w:lastRenderedPageBreak/>
+        <w:t>duplicates, but this remains an open question for Phase 4.</w:t>
       </w:r>
       <w:r>
         <w:rPr>
@@ -483,55 +358,7 @@
           <w:color w:val="auto"/>
           <w:highlight w:val="yellow"/>
         </w:rPr>
-        <w:t>6,374 (13.1%)</w:t>
-      </w:r>
-      <w:r>
-        <w:rPr>
-          <w:iCs/>
-          <w:color w:val="auto"/>
-          <w:highlight w:val="yellow"/>
-        </w:rPr>
-        <w:t>,</w:t>
-      </w:r>
-      <w:r>
-        <w:rPr>
-          <w:iCs/>
-          <w:color w:val="auto"/>
-          <w:highlight w:val="yellow"/>
-        </w:rPr>
-        <w:t xml:space="preserve"> since many people share common profiles; we kept all rows because they are separate records</w:t>
-      </w:r>
-      <w:r>
-        <w:rPr>
-          <w:iCs/>
-          <w:color w:val="auto"/>
-          <w:highlight w:val="yellow"/>
-        </w:rPr>
-        <w:t xml:space="preserve"> and it doesn’t necessarily mean they’re duplicates</w:t>
-      </w:r>
-      <w:r>
-        <w:rPr>
-          <w:iCs/>
-          <w:color w:val="auto"/>
-          <w:highlight w:val="yellow"/>
-        </w:rPr>
-        <w:t>, but this remains an open question for Phase 4.</w:t>
-      </w:r>
-      <w:r>
-        <w:rPr>
-          <w:iCs/>
-          <w:color w:val="auto"/>
-          <w:highlight w:val="yellow"/>
-        </w:rPr>
-        <w:t xml:space="preserve"> </w:t>
-      </w:r>
-      <w:r>
-        <w:rPr>
-          <w:iCs/>
-          <w:color w:val="auto"/>
-          <w:highlight w:val="yellow"/>
-        </w:rPr>
-        <w:t xml:space="preserve">Additionally, education and </w:t>
+        <w:t xml:space="preserve"> Additionally, education and </w:t>
       </w:r>
       <w:proofErr w:type="spellStart"/>
       <w:r>
@@ -549,103 +376,7 @@
           <w:color w:val="auto"/>
           <w:highlight w:val="yellow"/>
         </w:rPr>
-        <w:t xml:space="preserve"> </w:t>
-      </w:r>
-      <w:r>
-        <w:rPr>
-          <w:iCs/>
-          <w:color w:val="auto"/>
-          <w:highlight w:val="yellow"/>
-        </w:rPr>
-        <w:t>ended up having</w:t>
-      </w:r>
-      <w:r>
-        <w:rPr>
-          <w:iCs/>
-          <w:color w:val="auto"/>
-          <w:highlight w:val="yellow"/>
-        </w:rPr>
-        <w:t xml:space="preserve"> a one-to-one mapping, from Preschool (1) to Doctorate (16), so we</w:t>
-      </w:r>
-      <w:r>
-        <w:rPr>
-          <w:iCs/>
-          <w:color w:val="auto"/>
-          <w:highlight w:val="yellow"/>
-        </w:rPr>
-        <w:t xml:space="preserve"> decided to</w:t>
-      </w:r>
-      <w:r>
-        <w:rPr>
-          <w:iCs/>
-          <w:color w:val="auto"/>
-          <w:highlight w:val="yellow"/>
-        </w:rPr>
-        <w:t xml:space="preserve"> drop</w:t>
-      </w:r>
-      <w:r>
-        <w:rPr>
-          <w:iCs/>
-          <w:color w:val="auto"/>
-          <w:highlight w:val="yellow"/>
-        </w:rPr>
-        <w:t xml:space="preserve"> </w:t>
-      </w:r>
-      <w:r>
-        <w:rPr>
-          <w:iCs/>
-          <w:color w:val="auto"/>
-          <w:highlight w:val="yellow"/>
-        </w:rPr>
-        <w:t xml:space="preserve">education and kept </w:t>
-      </w:r>
-      <w:r>
-        <w:rPr>
-          <w:iCs/>
-          <w:color w:val="auto"/>
-          <w:highlight w:val="yellow"/>
-        </w:rPr>
-        <w:t>the column with the numbers</w:t>
-      </w:r>
-      <w:r>
-        <w:rPr>
-          <w:iCs/>
-          <w:color w:val="auto"/>
-          <w:highlight w:val="yellow"/>
-        </w:rPr>
-        <w:t xml:space="preserve"> which</w:t>
-      </w:r>
-      <w:r>
-        <w:rPr>
-          <w:iCs/>
-          <w:color w:val="auto"/>
-          <w:highlight w:val="yellow"/>
-        </w:rPr>
-        <w:t xml:space="preserve"> at the end</w:t>
-      </w:r>
-      <w:r>
-        <w:rPr>
-          <w:iCs/>
-          <w:color w:val="auto"/>
-          <w:highlight w:val="yellow"/>
-        </w:rPr>
-        <w:t xml:space="preserve"> keeps the order between </w:t>
-      </w:r>
-      <w:r>
-        <w:rPr>
-          <w:iCs/>
-          <w:color w:val="auto"/>
-          <w:highlight w:val="yellow"/>
-        </w:rPr>
-        <w:t>levels. The reason for dropping</w:t>
-      </w:r>
-      <w:r>
-        <w:rPr>
-          <w:iCs/>
-          <w:color w:val="auto"/>
-          <w:highlight w:val="yellow"/>
-        </w:rPr>
-        <w:t xml:space="preserve"> </w:t>
+        <w:t xml:space="preserve"> ended up having a one-to-one mapping, from Preschool (1) to Doctorate (16), so we decided to drop education and kept the column with the numbers which at the end keeps the order between levels. The reason for dropping </w:t>
       </w:r>
       <w:proofErr w:type="spellStart"/>
       <w:r>
@@ -663,15 +394,7 @@
           <w:color w:val="auto"/>
           <w:highlight w:val="yellow"/>
         </w:rPr>
-        <w:t xml:space="preserve"> was that </w:t>
-      </w:r>
-      <w:r>
-        <w:rPr>
-          <w:iCs/>
-          <w:color w:val="auto"/>
-          <w:highlight w:val="yellow"/>
-        </w:rPr>
-        <w:t xml:space="preserve">it is a census sampling weight and not a personal characteristic, and it is only comparable within a state, which the dataset does not include; </w:t>
+        <w:t xml:space="preserve"> was that it is a census sampling weight and not a personal characteristic, and it is only comparable within a state, which the dataset does not include; </w:t>
       </w:r>
       <w:proofErr w:type="gramStart"/>
       <w:r>
@@ -725,47 +448,7 @@
           <w:color w:val="auto"/>
           <w:highlight w:val="yellow"/>
         </w:rPr>
-        <w:t xml:space="preserve">, to keep the zeros as zeros and reduce the influence of very large values/outliers like 99,999 (244 records) </w:t>
-      </w:r>
-      <w:r>
-        <w:rPr>
-          <w:iCs/>
-          <w:color w:val="auto"/>
-          <w:highlight w:val="yellow"/>
-        </w:rPr>
-        <w:t>when SMOTE-NC selects neighbors.</w:t>
-      </w:r>
-      <w:r>
-        <w:rPr>
-          <w:iCs/>
-          <w:color w:val="auto"/>
-          <w:highlight w:val="yellow"/>
-        </w:rPr>
-        <w:t xml:space="preserve"> </w:t>
-      </w:r>
-      <w:r>
-        <w:rPr>
-          <w:iCs/>
-          <w:color w:val="auto"/>
-          <w:highlight w:val="yellow"/>
-        </w:rPr>
-        <w:t xml:space="preserve">We did not remove </w:t>
-      </w:r>
-      <w:r>
-        <w:rPr>
-          <w:iCs/>
-          <w:color w:val="auto"/>
-          <w:highlight w:val="yellow"/>
-        </w:rPr>
-        <w:t xml:space="preserve">any </w:t>
-      </w:r>
-      <w:r>
-        <w:rPr>
-          <w:iCs/>
-          <w:color w:val="auto"/>
-          <w:highlight w:val="yellow"/>
-        </w:rPr>
-        <w:t xml:space="preserve">outliers, since values like age 90 or 99 hours per week are </w:t>
+        <w:t xml:space="preserve">, to keep the zeros as zeros and reduce the influence of very large values/outliers like 99,999 (244 records) when SMOTE-NC selects neighbors. We did not remove any outliers, since values like age 90 or 99 hours per week are </w:t>
       </w:r>
       <w:proofErr w:type="gramStart"/>
       <w:r>
@@ -783,15 +466,7 @@
           <w:color w:val="auto"/>
           <w:highlight w:val="yellow"/>
         </w:rPr>
-        <w:t xml:space="preserve"> and may be correct,</w:t>
-      </w:r>
-      <w:r>
-        <w:rPr>
-          <w:iCs/>
-          <w:color w:val="auto"/>
-          <w:highlight w:val="yellow"/>
-        </w:rPr>
-        <w:t xml:space="preserve"> and a decision tree splits on thresholds. The prepared data keeps all 48,842 rows, with 5 numerical and 7 categorical predictors, and the subgroup counts are unchanged.</w:t>
+        <w:t xml:space="preserve"> and may be correct, and a decision tree splits on thresholds. The prepared data keeps all 48,842 rows, with 5 numerical and 7 categorical predictors, and the subgroup counts are unchanged.</w:t>
       </w:r>
     </w:p>
     <w:p>
@@ -1257,7 +932,10 @@
         <w:pStyle w:val="Heading2"/>
       </w:pPr>
       <w:r>
-        <w:t>Marginal imbalance</w:t>
+        <w:rPr>
+          <w:shd w:val="clear" w:color="auto" w:fill="D9EAF7"/>
+        </w:rPr>
+        <w:t>Sex and income imbalance</w:t>
       </w:r>
     </w:p>
     <w:p>
@@ -1265,44 +943,352 @@
         <w:keepNext/>
       </w:pPr>
       <w:r>
-        <w:t>&lt;</w:t>
-      </w:r>
-      <w:r>
         <w:rPr>
-          <w:i/>
-          <w:color w:val="595959"/>
+          <w:shd w:val="clear" w:color="auto" w:fill="D9EAF7"/>
         </w:rPr>
-        <w:t xml:space="preserve"> insert figure here showing counts described below</w:t>
-      </w:r>
-      <w:r>
-        <w:t>&gt;</w:t>
+        <w:t>Table 2  Sex/income counts and observed high-income rates (N = 48,842)</w:t>
+      </w:r>
+    </w:p>
+    <w:tbl>
+      <w:tblPr>
+        <w:tblW w:w="5004" w:type="dxa"/>
+        <w:tblBorders>
+          <w:top w:val="single" w:sz="4" w:space="0" w:color="D9D9D9"/>
+          <w:left w:val="single" w:sz="4" w:space="0" w:color="D9D9D9"/>
+          <w:bottom w:val="single" w:sz="4" w:space="0" w:color="D9D9D9"/>
+          <w:right w:val="single" w:sz="4" w:space="0" w:color="D9D9D9"/>
+          <w:insideH w:val="single" w:sz="4" w:space="0" w:color="D9D9D9"/>
+          <w:insideV w:val="single" w:sz="4" w:space="0" w:color="D9D9D9"/>
+        </w:tblBorders>
+        <w:tblLayout w:type="fixed"/>
+        <w:tblCellMar>
+          <w:top w:w="65" w:type="dxa"/>
+          <w:left w:w="55" w:type="dxa"/>
+          <w:bottom w:w="65" w:type="dxa"/>
+          <w:right w:w="55" w:type="dxa"/>
+        </w:tblCellMar>
+        <w:tblLook w:val="04A0" w:firstRow="1" w:lastRow="0" w:firstColumn="1" w:lastColumn="0" w:noHBand="0" w:noVBand="1"/>
+      </w:tblPr>
+      <w:tblGrid>
+        <w:gridCol w:w="850"/>
+        <w:gridCol w:w="1050"/>
+        <w:gridCol w:w="1000"/>
+        <w:gridCol w:w="1050"/>
+        <w:gridCol w:w="1054"/>
+      </w:tblGrid>
+      <w:tr>
+        <w:trPr>
+          <w:cantSplit/>
+          <w:tblHeader/>
+        </w:trPr>
+        <w:tc>
+          <w:tcPr>
+            <w:tcW w:w="850" w:type="dxa"/>
+            <w:shd w:val="clear" w:color="auto" w:fill="E7E6E6"/>
+            <w:vAlign w:val="center"/>
+          </w:tcPr>
+          <w:p>
+            <w:pPr>
+              <w:spacing w:after="0"/>
+            </w:pPr>
+            <w:r>
+              <w:rPr>
+                <w:b/>
+                <w:shd w:val="clear" w:color="auto" w:fill="D9EAF7"/>
+              </w:rPr>
+              <w:t>Sex</w:t>
+            </w:r>
+          </w:p>
+        </w:tc>
+        <w:tc>
+          <w:tcPr>
+            <w:tcW w:w="1050" w:type="dxa"/>
+            <w:shd w:val="clear" w:color="auto" w:fill="E7E6E6"/>
+            <w:vAlign w:val="center"/>
+          </w:tcPr>
+          <w:p>
+            <w:pPr>
+              <w:spacing w:after="0"/>
+              <w:jc w:val="center"/>
+            </w:pPr>
+            <w:r>
+              <w:rPr>
+                <w:b/>
+                <w:shd w:val="clear" w:color="auto" w:fill="D9EAF7"/>
+              </w:rPr>
+              <w:t>≤50K</w:t>
+            </w:r>
+          </w:p>
+        </w:tc>
+        <w:tc>
+          <w:tcPr>
+            <w:tcW w:w="1000" w:type="dxa"/>
+            <w:shd w:val="clear" w:color="auto" w:fill="E7E6E6"/>
+            <w:vAlign w:val="center"/>
+          </w:tcPr>
+          <w:p>
+            <w:pPr>
+              <w:spacing w:after="0"/>
+              <w:jc w:val="center"/>
+            </w:pPr>
+            <w:r>
+              <w:rPr>
+                <w:b/>
+                <w:shd w:val="clear" w:color="auto" w:fill="D9EAF7"/>
+              </w:rPr>
+              <w:t>&gt;50K</w:t>
+            </w:r>
+          </w:p>
+        </w:tc>
+        <w:tc>
+          <w:tcPr>
+            <w:tcW w:w="1050" w:type="dxa"/>
+            <w:shd w:val="clear" w:color="auto" w:fill="E7E6E6"/>
+            <w:vAlign w:val="center"/>
+          </w:tcPr>
+          <w:p>
+            <w:pPr>
+              <w:spacing w:after="0"/>
+              <w:jc w:val="center"/>
+            </w:pPr>
+            <w:r>
+              <w:rPr>
+                <w:b/>
+                <w:shd w:val="clear" w:color="auto" w:fill="D9EAF7"/>
+              </w:rPr>
+              <w:t>Total</w:t>
+            </w:r>
+          </w:p>
+        </w:tc>
+        <w:tc>
+          <w:tcPr>
+            <w:tcW w:w="1054" w:type="dxa"/>
+            <w:shd w:val="clear" w:color="auto" w:fill="E7E6E6"/>
+            <w:vAlign w:val="center"/>
+          </w:tcPr>
+          <w:p>
+            <w:pPr>
+              <w:spacing w:after="0"/>
+              <w:jc w:val="center"/>
+            </w:pPr>
+            <w:r>
+              <w:rPr>
+                <w:b/>
+                <w:shd w:val="clear" w:color="auto" w:fill="D9EAF7"/>
+              </w:rPr>
+              <w:t>&gt;50K (%)</w:t>
+            </w:r>
+          </w:p>
+        </w:tc>
+      </w:tr>
+      <w:tr>
+        <w:trPr>
+          <w:cantSplit/>
+        </w:trPr>
+        <w:tc>
+          <w:tcPr>
+            <w:tcW w:w="850" w:type="dxa"/>
+            <w:vAlign w:val="center"/>
+          </w:tcPr>
+          <w:p>
+            <w:pPr>
+              <w:spacing w:after="0"/>
+            </w:pPr>
+            <w:r>
+              <w:rPr>
+                <w:shd w:val="clear" w:color="auto" w:fill="D9EAF7"/>
+              </w:rPr>
+              <w:t>Female</w:t>
+            </w:r>
+          </w:p>
+        </w:tc>
+        <w:tc>
+          <w:tcPr>
+            <w:tcW w:w="1050" w:type="dxa"/>
+            <w:vAlign w:val="center"/>
+          </w:tcPr>
+          <w:p>
+            <w:pPr>
+              <w:spacing w:after="0"/>
+              <w:jc w:val="center"/>
+            </w:pPr>
+            <w:r>
+              <w:rPr>
+                <w:shd w:val="clear" w:color="auto" w:fill="D9EAF7"/>
+              </w:rPr>
+              <w:t>14,423</w:t>
+            </w:r>
+          </w:p>
+        </w:tc>
+        <w:tc>
+          <w:tcPr>
+            <w:tcW w:w="1000" w:type="dxa"/>
+            <w:vAlign w:val="center"/>
+          </w:tcPr>
+          <w:p>
+            <w:pPr>
+              <w:spacing w:after="0"/>
+              <w:jc w:val="center"/>
+            </w:pPr>
+            <w:r>
+              <w:rPr>
+                <w:shd w:val="clear" w:color="auto" w:fill="D9EAF7"/>
+              </w:rPr>
+              <w:t>1,769</w:t>
+            </w:r>
+          </w:p>
+        </w:tc>
+        <w:tc>
+          <w:tcPr>
+            <w:tcW w:w="1050" w:type="dxa"/>
+            <w:vAlign w:val="center"/>
+          </w:tcPr>
+          <w:p>
+            <w:pPr>
+              <w:spacing w:after="0"/>
+              <w:jc w:val="center"/>
+            </w:pPr>
+            <w:r>
+              <w:rPr>
+                <w:shd w:val="clear" w:color="auto" w:fill="D9EAF7"/>
+              </w:rPr>
+              <w:t>16,192</w:t>
+            </w:r>
+          </w:p>
+        </w:tc>
+        <w:tc>
+          <w:tcPr>
+            <w:tcW w:w="1054" w:type="dxa"/>
+            <w:vAlign w:val="center"/>
+          </w:tcPr>
+          <w:p>
+            <w:pPr>
+              <w:spacing w:after="0"/>
+              <w:jc w:val="center"/>
+            </w:pPr>
+            <w:r>
+              <w:rPr>
+                <w:shd w:val="clear" w:color="auto" w:fill="D9EAF7"/>
+              </w:rPr>
+              <w:t>10.93</w:t>
+            </w:r>
+          </w:p>
+        </w:tc>
+      </w:tr>
+      <w:tr>
+        <w:trPr>
+          <w:cantSplit/>
+        </w:trPr>
+        <w:tc>
+          <w:tcPr>
+            <w:tcW w:w="850" w:type="dxa"/>
+            <w:vAlign w:val="center"/>
+          </w:tcPr>
+          <w:p>
+            <w:pPr>
+              <w:spacing w:after="0"/>
+            </w:pPr>
+            <w:r>
+              <w:rPr>
+                <w:shd w:val="clear" w:color="auto" w:fill="D9EAF7"/>
+              </w:rPr>
+              <w:t>Male</w:t>
+            </w:r>
+          </w:p>
+        </w:tc>
+        <w:tc>
+          <w:tcPr>
+            <w:tcW w:w="1050" w:type="dxa"/>
+            <w:vAlign w:val="center"/>
+          </w:tcPr>
+          <w:p>
+            <w:pPr>
+              <w:spacing w:after="0"/>
+              <w:jc w:val="center"/>
+            </w:pPr>
+            <w:r>
+              <w:rPr>
+                <w:shd w:val="clear" w:color="auto" w:fill="D9EAF7"/>
+              </w:rPr>
+              <w:t>22,732</w:t>
+            </w:r>
+          </w:p>
+        </w:tc>
+        <w:tc>
+          <w:tcPr>
+            <w:tcW w:w="1000" w:type="dxa"/>
+            <w:vAlign w:val="center"/>
+          </w:tcPr>
+          <w:p>
+            <w:pPr>
+              <w:spacing w:after="0"/>
+              <w:jc w:val="center"/>
+            </w:pPr>
+            <w:r>
+              <w:rPr>
+                <w:shd w:val="clear" w:color="auto" w:fill="D9EAF7"/>
+              </w:rPr>
+              <w:t>9,918</w:t>
+            </w:r>
+          </w:p>
+        </w:tc>
+        <w:tc>
+          <w:tcPr>
+            <w:tcW w:w="1050" w:type="dxa"/>
+            <w:vAlign w:val="center"/>
+          </w:tcPr>
+          <w:p>
+            <w:pPr>
+              <w:spacing w:after="0"/>
+              <w:jc w:val="center"/>
+            </w:pPr>
+            <w:r>
+              <w:rPr>
+                <w:shd w:val="clear" w:color="auto" w:fill="D9EAF7"/>
+              </w:rPr>
+              <w:t>32,650</w:t>
+            </w:r>
+          </w:p>
+        </w:tc>
+        <w:tc>
+          <w:tcPr>
+            <w:tcW w:w="1054" w:type="dxa"/>
+            <w:vAlign w:val="center"/>
+          </w:tcPr>
+          <w:p>
+            <w:pPr>
+              <w:spacing w:after="0"/>
+              <w:jc w:val="center"/>
+            </w:pPr>
+            <w:r>
+              <w:rPr>
+                <w:shd w:val="clear" w:color="auto" w:fill="D9EAF7"/>
+              </w:rPr>
+              <w:t>30.38</w:t>
+            </w:r>
+          </w:p>
+        </w:tc>
+      </w:tr>
+    </w:tbl>
+    <w:p>
+      <w:r>
+        <w:t xml:space="preserve">Summing the corresponding raw income counts yields 11,687 &gt;50K observations (23.9%) and 37,155 ≤50K </w:t>
+      </w:r>
+      <w:r>
+        <w:t>observations (76.1%). An always-≤50K rule would therefore achieve 76.1% accuracy on these combined records while detecting no favorable outcomes. This descriptive benchmark supports reporting favorable-class recall and F1 alongside accuracy.</w:t>
       </w:r>
     </w:p>
     <w:p>
-      <w:pPr>
-        <w:pStyle w:val="Caption"/>
-      </w:pPr>
-      <w:r>
-        <w:t>Figure 1  Marginal proportions from notebook counts (N = 48,842).</w:t>
+      <w:r>
+        <w:t xml:space="preserve">The data contain 32,650 male observations and 16,192 female observations, approximately a two-to-one ratio. </w:t>
       </w:r>
     </w:p>
     <w:p>
       <w:r>
-        <w:t>Summing the corresponding raw income counts yields 11,687 &gt;50K observations (23.9%) and 37,155 ≤50K observations (76.1%). An always-≤50K rule would therefore achieve 76.1% accuracy on these combined records while detecting no favorable outcomes. This descriptive benchmark supports reporting favorable-class recall and F1 alongside accuracy.</w:t>
-      </w:r>
-    </w:p>
-    <w:p>
-      <w:r>
-        <w:t xml:space="preserve">The data contain 32,650 male observations and 16,192 female observations, approximately a two-to-one ratio. </w:t>
-      </w:r>
-    </w:p>
-    <w:p>
-      <w:r>
         <w:rPr>
-          <w:i/>
-          <w:color w:val="595959"/>
+          <w:shd w:val="clear" w:color="auto" w:fill="D9EAF7"/>
         </w:rPr>
-        <w:t>[To complete: Include sex/income subgroup totals. Those counts are needed to calculate how many rows each resampling method would add or remove.]</w:t>
+        <w:t xml:space="preserve">Female/&gt;50K is the smallest subgroup (1,769 records), while Male/≤50K is the largest (22,732). Income is above $50K for 10.93% of Female records and 30.38% of Male records, a difference of 19.45 percentage points. </w:t>
       </w:r>
     </w:p>
     <w:p>
@@ -1319,7 +1305,10 @@
         <w:keepNext/>
       </w:pPr>
       <w:r>
-        <w:t>Table 2  Selected numerical summaries before cleaning</w:t>
+        <w:rPr>
+          <w:shd w:val="clear" w:color="auto" w:fill="D9EAF7"/>
+        </w:rPr>
+        <w:t>Table 3  Selected numerical summaries before cleaning</w:t>
       </w:r>
     </w:p>
     <w:tbl>
@@ -1975,26 +1964,19 @@
       </w:r>
     </w:p>
     <w:p>
-      <w:r>
+      <w:pPr>
         <w:rPr>
           <w:i/>
-          <w:color w:val="595959"/>
+          <w:iCs/>
         </w:rPr>
-        <w:t>[To complete: Add normalized sex/income count table and group income rates. Examine missingness by subgroup, numerical distributions by outcome, education versus education_num, and other relevant feature relationships</w:t>
-      </w:r>
+      </w:pPr>
       <w:r>
         <w:rPr>
           <w:i/>
-          <w:color w:val="595959"/>
+          <w:iCs/>
+          <w:shd w:val="clear" w:color="auto" w:fill="D9EAF7"/>
         </w:rPr>
-        <w:t>. A</w:t>
-      </w:r>
-      <w:r>
-        <w:rPr>
-          <w:i/>
-          <w:color w:val="595959"/>
-        </w:rPr>
-        <w:t>dd only the most informative plots and interpretations.]</w:t>
+        <w:t>[To complete: Integrate numerical distributions by outcome and other relevant feature relationships.]</w:t>
       </w:r>
     </w:p>
     <w:p>
@@ -2016,26 +1998,26 @@
         <w:t xml:space="preserve"> and </w:t>
       </w:r>
       <w:r>
-        <w:t xml:space="preserve">differences in the outcome </w:t>
+        <w:t>differences in the outcome variable strings</w:t>
+      </w:r>
+      <w:r>
+        <w:t xml:space="preserve"> </w:t>
+      </w:r>
+      <w:r>
+        <w:t>were</w:t>
+      </w:r>
+      <w:r>
+        <w:t xml:space="preserve"> immediate preparation concerns. Unequal outcome and sex totals motivate subgroup analysis, while </w:t>
+      </w:r>
+      <w:r>
+        <w:t xml:space="preserve">the </w:t>
+      </w:r>
+      <w:r>
+        <w:t xml:space="preserve">zero-heavy capital variables and rare </w:t>
       </w:r>
       <w:r>
         <w:lastRenderedPageBreak/>
-        <w:t>variable strings</w:t>
-      </w:r>
-      <w:r>
-        <w:t xml:space="preserve"> </w:t>
-      </w:r>
-      <w:r>
-        <w:t>were</w:t>
-      </w:r>
-      <w:r>
-        <w:t xml:space="preserve"> immediate preparation concerns. Unequal outcome and sex totals motivate subgroup analysis, while </w:t>
-      </w:r>
-      <w:r>
-        <w:t xml:space="preserve">the </w:t>
-      </w:r>
-      <w:r>
-        <w:t>zero-heavy capital variables and rare categories constrain how synthetic examples should be generated.</w:t>
+        <w:t>categories constrain how synthetic examples should be generated.</w:t>
       </w:r>
     </w:p>
     <w:p>
@@ -2046,33 +2028,7 @@
         <w:rPr>
           <w:highlight w:val="yellow"/>
         </w:rPr>
-        <w:t xml:space="preserve">The two education representations </w:t>
-      </w:r>
-      <w:r>
-        <w:rPr>
-          <w:highlight w:val="yellow"/>
-        </w:rPr>
-        <w:t>were</w:t>
-      </w:r>
-      <w:r>
-        <w:rPr>
-          <w:highlight w:val="yellow"/>
-        </w:rPr>
-        <w:t xml:space="preserve"> also redundant, since each label </w:t>
-      </w:r>
-      <w:proofErr w:type="gramStart"/>
-      <w:r>
-        <w:rPr>
-          <w:highlight w:val="yellow"/>
-        </w:rPr>
-        <w:t>maps to</w:t>
-      </w:r>
-      <w:proofErr w:type="gramEnd"/>
-      <w:r>
-        <w:rPr>
-          <w:highlight w:val="yellow"/>
-        </w:rPr>
-        <w:t xml:space="preserve"> exactly one </w:t>
+        <w:t xml:space="preserve">The two education representations were also redundant, since each label maps to exactly one </w:t>
       </w:r>
       <w:proofErr w:type="spellStart"/>
       <w:r>
@@ -2120,10 +2076,9 @@
     <w:p>
       <w:r>
         <w:rPr>
-          <w:i/>
-          <w:color w:val="595959"/>
+          <w:shd w:val="clear" w:color="auto" w:fill="D9EAF7"/>
         </w:rPr>
-        <w:t>[To complete: Integrate the completed subgroup and feature analyses, explain verified anomalies, and revise the interpretation if cleaning changes class or subgroup proportions.]</w:t>
+        <w:t>Female records are fewer overall and have a lower observed high-income rate. These differences support comparing resampling methods using the four sex/income subgroups. They do not show whether resampling will improve model fairness.</w:t>
       </w:r>
     </w:p>
     <w:p>
@@ -2154,19 +2109,10 @@
     </w:p>
     <w:p>
       <w:r>
-        <w:t>We will use matched folds, random seeds, predictors, and decision-tree settings across conditions. Resampling will affect training folds only</w:t>
-      </w:r>
-      <w:r>
-        <w:t>.</w:t>
-      </w:r>
-      <w:r>
-        <w:t xml:space="preserve"> </w:t>
-      </w:r>
-      <w:r>
-        <w:t>V</w:t>
-      </w:r>
-      <w:r>
-        <w:t>alidation rows will retain their observed proportions. We will report accuracy, favorable-class precision, recall and F1, group confusion matrices, and mean scores with variation across folds. Fairness evaluation will use female-minus-male statistical parity gaps (favorable prediction rates) and equal opportunity gaps (true-positive rates). Smaller absolute gaps indicate closer group rates on those measures, not complete fairness.</w:t>
+        <w:rPr>
+          <w:shd w:val="clear" w:color="auto" w:fill="D9EAF7"/>
+        </w:rPr>
+        <w:t>All four conditions will use the same training and validation rows in each cross-validation fold, with matched random seeds, predictors, and decision-tree settings. Only the training rows will be resampled. Validation rows will keep their observed subgroup proportions. We will report accuracy, favorable-class precision, recall and F1, group confusion matrices, and score variation across folds. Female-minus-male statistical parity gaps will compare favorable prediction rates, and equal opportunity gaps will compare true-positive rates. Smaller absolute gaps mean closer group rates on these measures. We will compare these gaps alongside predictive performance because higher overall scores may not mean better fairness.</w:t>
       </w:r>
     </w:p>
     <w:p>
@@ -2178,29 +2124,9 @@
       </w:pPr>
       <w:r>
         <w:rPr>
-          <w:i/>
-          <w:color w:val="595959"/>
+          <w:shd w:val="clear" w:color="auto" w:fill="D9EAF7"/>
         </w:rPr>
-        <w:t>[To complete: Specify K, the source-file split strategy, final preprocessing and predictor set, decision-tree settings, and SMOTE-NC neighbor count after verifying subgroup sizes. Confirm whether sex enters the classifier and how undefined group metrics will be handled.]</w:t>
-      </w:r>
-    </w:p>
-    <w:p>
-      <w:pPr>
-        <w:rPr>
-          <w:b/>
-          <w:bCs/>
-          <w:iCs/>
-        </w:rPr>
-      </w:pPr>
-      <w:r>
-        <w:rPr>
-          <w:b/>
-          <w:bCs/>
-          <w:iCs/>
-          <w:color w:val="595959"/>
-          <w:highlight w:val="yellow"/>
-        </w:rPr>
-        <w:t>Use this if needed:</w:t>
+        <w:t>Before modeling, we still need to choose K, decision-tree settings, the SMOTE-NC neighbor count, how to handle education_num, and whether sex is a predictor. Numerical scaling and categorical encoding will be fitted within training folds. We will also specify how undefined group metrics are handled.</w:t>
       </w:r>
       <w:r>
         <w:rPr>
@@ -2409,7 +2335,7 @@
 </file>
 
 <file path=word/endnotes.xml><?xml version="1.0" encoding="utf-8"?>
-<w:endnotes xmlns:wpc="http://schemas.microsoft.com/office/word/2010/wordprocessingCanvas" xmlns:cx="http://schemas.microsoft.com/office/drawing/2014/chartex" xmlns:cx1="http://schemas.microsoft.com/office/drawing/2015/9/8/chartex" xmlns:cx2="http://schemas.microsoft.com/office/drawing/2015/10/21/chartex" xmlns:cx3="http://schemas.microsoft.com/office/drawing/2016/5/9/chartex" xmlns:cx4="http://schemas.microsoft.com/office/drawing/2016/5/10/chartex" xmlns:cx5="http://schemas.microsoft.com/office/drawing/2016/5/11/chartex" xmlns:cx6="http://schemas.microsoft.com/office/drawing/2016/5/12/chartex" xmlns:cx7="http://schemas.microsoft.com/office/drawing/2016/5/13/chartex" xmlns:cx8="http://schemas.microsoft.com/office/drawing/2016/5/14/chartex" xmlns:mc="http://schemas.openxmlformats.org/markup-compatibility/2006" xmlns:aink="http://schemas.microsoft.com/office/drawing/2016/ink" xmlns:am3d="http://schemas.microsoft.com/office/drawing/2017/model3d" xmlns:o="urn:schemas-microsoft-com:office:office" xmlns:oel="http://schemas.microsoft.com/office/2019/extlst" xmlns:r="http://schemas.openxmlformats.org/officeDocument/2006/relationships" xmlns:m="http://schemas.openxmlformats.org/officeDocument/2006/math" xmlns:v="urn:schemas-microsoft-com:vml" xmlns:wp14="http://schemas.microsoft.com/office/word/2010/wordprocessingDrawing" xmlns:wp="http://schemas.openxmlformats.org/drawingml/2006/wordprocessingDrawing" xmlns:w10="urn:schemas-microsoft-com:office:word" xmlns:w="http://schemas.openxmlformats.org/wordprocessingml/2006/main" xmlns:w14="http://schemas.microsoft.com/office/word/2010/wordml" xmlns:w15="http://schemas.microsoft.com/office/word/2012/wordml" xmlns:w16cex="http://schemas.microsoft.com/office/word/2018/wordml/cex" xmlns:w16cid="http://schemas.microsoft.com/office/word/2016/wordml/cid" xmlns:w16="http://schemas.microsoft.com/office/word/2018/wordml" xmlns:w16du="http://schemas.microsoft.com/office/word/2023/wordml/word16du" xmlns:w16sdtdh="http://schemas.microsoft.com/office/word/2020/wordml/sdtdatahash" xmlns:w16sdtfl="http://schemas.microsoft.com/office/word/2024/wordml/sdtformatlock" xmlns:w16se="http://schemas.microsoft.com/office/word/2015/wordml/symex" xmlns:wpg="http://schemas.microsoft.com/office/word/2010/wordprocessingGroup" xmlns:wpi="http://schemas.microsoft.com/office/word/2010/wordprocessingInk" xmlns:wne="http://schemas.microsoft.com/office/word/2006/wordml" xmlns:wps="http://schemas.microsoft.com/office/word/2010/wordprocessingShape" mc:Ignorable="w14 w15 w16se w16cid w16 w16cex w16sdtdh w16sdtfl w16du wp14">
+<w:endnotes xmlns:wpc="http://schemas.microsoft.com/office/word/2010/wordprocessingCanvas" xmlns:cx="http://schemas.microsoft.com/office/drawing/2014/chartex" xmlns:cx1="http://schemas.microsoft.com/office/drawing/2015/9/8/chartex" xmlns:cx2="http://schemas.microsoft.com/office/drawing/2015/10/21/chartex" xmlns:cx3="http://schemas.microsoft.com/office/drawing/2016/5/9/chartex" xmlns:cx4="http://schemas.microsoft.com/office/drawing/2016/5/10/chartex" xmlns:cx5="http://schemas.microsoft.com/office/drawing/2016/5/11/chartex" xmlns:cx6="http://schemas.microsoft.com/office/drawing/2016/5/12/chartex" xmlns:cx7="http://schemas.microsoft.com/office/drawing/2016/5/13/chartex" xmlns:cx8="http://schemas.microsoft.com/office/drawing/2016/5/14/chartex" xmlns:mc="http://schemas.openxmlformats.org/markup-compatibility/2006" xmlns:m="http://schemas.openxmlformats.org/officeDocument/2006/math" xmlns:aink="http://schemas.microsoft.com/office/drawing/2016/ink" xmlns:am3d="http://schemas.microsoft.com/office/drawing/2017/model3d" xmlns:oel="http://schemas.microsoft.com/office/2019/extlst" xmlns:r="http://schemas.openxmlformats.org/officeDocument/2006/relationships" xmlns:wp14="http://schemas.microsoft.com/office/word/2010/wordprocessingDrawing" xmlns:wp="http://schemas.openxmlformats.org/drawingml/2006/wordprocessingDrawing" xmlns:wpg="http://schemas.microsoft.com/office/word/2010/wordprocessingGroup" xmlns:wpi="http://schemas.microsoft.com/office/word/2010/wordprocessingInk" xmlns:wps="http://schemas.microsoft.com/office/word/2010/wordprocessingShape" xmlns:o="urn:schemas-microsoft-com:office:office" xmlns:v="urn:schemas-microsoft-com:vml" xmlns:w10="urn:schemas-microsoft-com:office:word" xmlns:w="http://schemas.openxmlformats.org/wordprocessingml/2006/main" xmlns:w14="http://schemas.microsoft.com/office/word/2010/wordml" xmlns:w15="http://schemas.microsoft.com/office/word/2012/wordml" xmlns:w16cex="http://schemas.microsoft.com/office/word/2018/wordml/cex" xmlns:w16cid="http://schemas.microsoft.com/office/word/2016/wordml/cid" xmlns:w16="http://schemas.microsoft.com/office/word/2018/wordml" xmlns:w16sdtdh="http://schemas.microsoft.com/office/word/2020/wordml/sdtdatahash" xmlns:w16sdtfl="http://schemas.microsoft.com/office/word/2024/wordml/sdtformatlock" xmlns:w16se="http://schemas.microsoft.com/office/word/2015/wordml/symex" xmlns:w16du="http://schemas.microsoft.com/office/word/2023/wordml/word16du" xmlns:wne="http://schemas.microsoft.com/office/word/2006/wordml" mc:Ignorable="w14 w15 w16se w16cid w16 w16cex w16sdtdh w16sdtfl w16du wp14">
   <w:endnote w:type="separator" w:id="-1">
     <w:p>
       <w:pPr>
@@ -2434,7 +2360,7 @@
 </file>
 
 <file path=word/footer1.xml><?xml version="1.0" encoding="utf-8"?>
-<w:ftr xmlns:wpc="http://schemas.microsoft.com/office/word/2010/wordprocessingCanvas" xmlns:cx="http://schemas.microsoft.com/office/drawing/2014/chartex" xmlns:cx1="http://schemas.microsoft.com/office/drawing/2015/9/8/chartex" xmlns:cx2="http://schemas.microsoft.com/office/drawing/2015/10/21/chartex" xmlns:cx3="http://schemas.microsoft.com/office/drawing/2016/5/9/chartex" xmlns:cx4="http://schemas.microsoft.com/office/drawing/2016/5/10/chartex" xmlns:cx5="http://schemas.microsoft.com/office/drawing/2016/5/11/chartex" xmlns:cx6="http://schemas.microsoft.com/office/drawing/2016/5/12/chartex" xmlns:cx7="http://schemas.microsoft.com/office/drawing/2016/5/13/chartex" xmlns:cx8="http://schemas.microsoft.com/office/drawing/2016/5/14/chartex" xmlns:mc="http://schemas.openxmlformats.org/markup-compatibility/2006" xmlns:aink="http://schemas.microsoft.com/office/drawing/2016/ink" xmlns:am3d="http://schemas.microsoft.com/office/drawing/2017/model3d" xmlns:o="urn:schemas-microsoft-com:office:office" xmlns:oel="http://schemas.microsoft.com/office/2019/extlst" xmlns:r="http://schemas.openxmlformats.org/officeDocument/2006/relationships" xmlns:m="http://schemas.openxmlformats.org/officeDocument/2006/math" xmlns:v="urn:schemas-microsoft-com:vml" xmlns:wp14="http://schemas.microsoft.com/office/word/2010/wordprocessingDrawing" xmlns:wp="http://schemas.openxmlformats.org/drawingml/2006/wordprocessingDrawing" xmlns:w10="urn:schemas-microsoft-com:office:word" xmlns:w="http://schemas.openxmlformats.org/wordprocessingml/2006/main" xmlns:w14="http://schemas.microsoft.com/office/word/2010/wordml" xmlns:w15="http://schemas.microsoft.com/office/word/2012/wordml" xmlns:w16cex="http://schemas.microsoft.com/office/word/2018/wordml/cex" xmlns:w16cid="http://schemas.microsoft.com/office/word/2016/wordml/cid" xmlns:w16="http://schemas.microsoft.com/office/word/2018/wordml" xmlns:w16du="http://schemas.microsoft.com/office/word/2023/wordml/word16du" xmlns:w16sdtdh="http://schemas.microsoft.com/office/word/2020/wordml/sdtdatahash" xmlns:w16sdtfl="http://schemas.microsoft.com/office/word/2024/wordml/sdtformatlock" xmlns:w16se="http://schemas.microsoft.com/office/word/2015/wordml/symex" xmlns:wpg="http://schemas.microsoft.com/office/word/2010/wordprocessingGroup" xmlns:wpi="http://schemas.microsoft.com/office/word/2010/wordprocessingInk" xmlns:wne="http://schemas.microsoft.com/office/word/2006/wordml" xmlns:wps="http://schemas.microsoft.com/office/word/2010/wordprocessingShape" mc:Ignorable="w14 w15 w16se w16cid w16 w16cex w16sdtdh w16sdtfl w16du wp14">
+<w:ftr xmlns:wpc="http://schemas.microsoft.com/office/word/2010/wordprocessingCanvas" xmlns:cx="http://schemas.microsoft.com/office/drawing/2014/chartex" xmlns:cx1="http://schemas.microsoft.com/office/drawing/2015/9/8/chartex" xmlns:cx2="http://schemas.microsoft.com/office/drawing/2015/10/21/chartex" xmlns:cx3="http://schemas.microsoft.com/office/drawing/2016/5/9/chartex" xmlns:cx4="http://schemas.microsoft.com/office/drawing/2016/5/10/chartex" xmlns:cx5="http://schemas.microsoft.com/office/drawing/2016/5/11/chartex" xmlns:cx6="http://schemas.microsoft.com/office/drawing/2016/5/12/chartex" xmlns:cx7="http://schemas.microsoft.com/office/drawing/2016/5/13/chartex" xmlns:cx8="http://schemas.microsoft.com/office/drawing/2016/5/14/chartex" xmlns:mc="http://schemas.openxmlformats.org/markup-compatibility/2006" xmlns:m="http://schemas.openxmlformats.org/officeDocument/2006/math" xmlns:aink="http://schemas.microsoft.com/office/drawing/2016/ink" xmlns:am3d="http://schemas.microsoft.com/office/drawing/2017/model3d" xmlns:oel="http://schemas.microsoft.com/office/2019/extlst" xmlns:r="http://schemas.openxmlformats.org/officeDocument/2006/relationships" xmlns:wp14="http://schemas.microsoft.com/office/word/2010/wordprocessingDrawing" xmlns:wp="http://schemas.openxmlformats.org/drawingml/2006/wordprocessingDrawing" xmlns:wpg="http://schemas.microsoft.com/office/word/2010/wordprocessingGroup" xmlns:wpi="http://schemas.microsoft.com/office/word/2010/wordprocessingInk" xmlns:wps="http://schemas.microsoft.com/office/word/2010/wordprocessingShape" xmlns:o="urn:schemas-microsoft-com:office:office" xmlns:v="urn:schemas-microsoft-com:vml" xmlns:w10="urn:schemas-microsoft-com:office:word" xmlns:w="http://schemas.openxmlformats.org/wordprocessingml/2006/main" xmlns:w14="http://schemas.microsoft.com/office/word/2010/wordml" xmlns:w15="http://schemas.microsoft.com/office/word/2012/wordml" xmlns:w16cex="http://schemas.microsoft.com/office/word/2018/wordml/cex" xmlns:w16cid="http://schemas.microsoft.com/office/word/2016/wordml/cid" xmlns:w16="http://schemas.microsoft.com/office/word/2018/wordml" xmlns:w16sdtdh="http://schemas.microsoft.com/office/word/2020/wordml/sdtdatahash" xmlns:w16sdtfl="http://schemas.microsoft.com/office/word/2024/wordml/sdtformatlock" xmlns:w16se="http://schemas.microsoft.com/office/word/2015/wordml/symex" xmlns:w16du="http://schemas.microsoft.com/office/word/2023/wordml/word16du" xmlns:wne="http://schemas.microsoft.com/office/word/2006/wordml" mc:Ignorable="w14 w15 w16se w16cid w16 w16cex w16sdtdh w16sdtfl w16du wp14">
   <w:p>
     <w:pPr>
       <w:pStyle w:val="Footer"/>
@@ -2463,7 +2389,7 @@
 </file>
 
 <file path=word/footnotes.xml><?xml version="1.0" encoding="utf-8"?>
-<w:footnotes xmlns:wpc="http://schemas.microsoft.com/office/word/2010/wordprocessingCanvas" xmlns:cx="http://schemas.microsoft.com/office/drawing/2014/chartex" xmlns:cx1="http://schemas.microsoft.com/office/drawing/2015/9/8/chartex" xmlns:cx2="http://schemas.microsoft.com/office/drawing/2015/10/21/chartex" xmlns:cx3="http://schemas.microsoft.com/office/drawing/2016/5/9/chartex" xmlns:cx4="http://schemas.microsoft.com/office/drawing/2016/5/10/chartex" xmlns:cx5="http://schemas.microsoft.com/office/drawing/2016/5/11/chartex" xmlns:cx6="http://schemas.microsoft.com/office/drawing/2016/5/12/chartex" xmlns:cx7="http://schemas.microsoft.com/office/drawing/2016/5/13/chartex" xmlns:cx8="http://schemas.microsoft.com/office/drawing/2016/5/14/chartex" xmlns:mc="http://schemas.openxmlformats.org/markup-compatibility/2006" xmlns:aink="http://schemas.microsoft.com/office/drawing/2016/ink" xmlns:am3d="http://schemas.microsoft.com/office/drawing/2017/model3d" xmlns:o="urn:schemas-microsoft-com:office:office" xmlns:oel="http://schemas.microsoft.com/office/2019/extlst" xmlns:r="http://schemas.openxmlformats.org/officeDocument/2006/relationships" xmlns:m="http://schemas.openxmlformats.org/officeDocument/2006/math" xmlns:v="urn:schemas-microsoft-com:vml" xmlns:wp14="http://schemas.microsoft.com/office/word/2010/wordprocessingDrawing" xmlns:wp="http://schemas.openxmlformats.org/drawingml/2006/wordprocessingDrawing" xmlns:w10="urn:schemas-microsoft-com:office:word" xmlns:w="http://schemas.openxmlformats.org/wordprocessingml/2006/main" xmlns:w14="http://schemas.microsoft.com/office/word/2010/wordml" xmlns:w15="http://schemas.microsoft.com/office/word/2012/wordml" xmlns:w16cex="http://schemas.microsoft.com/office/word/2018/wordml/cex" xmlns:w16cid="http://schemas.microsoft.com/office/word/2016/wordml/cid" xmlns:w16="http://schemas.microsoft.com/office/word/2018/wordml" xmlns:w16du="http://schemas.microsoft.com/office/word/2023/wordml/word16du" xmlns:w16sdtdh="http://schemas.microsoft.com/office/word/2020/wordml/sdtdatahash" xmlns:w16sdtfl="http://schemas.microsoft.com/office/word/2024/wordml/sdtformatlock" xmlns:w16se="http://schemas.microsoft.com/office/word/2015/wordml/symex" xmlns:wpg="http://schemas.microsoft.com/office/word/2010/wordprocessingGroup" xmlns:wpi="http://schemas.microsoft.com/office/word/2010/wordprocessingInk" xmlns:wne="http://schemas.microsoft.com/office/word/2006/wordml" xmlns:wps="http://schemas.microsoft.com/office/word/2010/wordprocessingShape" mc:Ignorable="w14 w15 w16se w16cid w16 w16cex w16sdtdh w16sdtfl w16du wp14">
+<w:footnotes xmlns:wpc="http://schemas.microsoft.com/office/word/2010/wordprocessingCanvas" xmlns:cx="http://schemas.microsoft.com/office/drawing/2014/chartex" xmlns:cx1="http://schemas.microsoft.com/office/drawing/2015/9/8/chartex" xmlns:cx2="http://schemas.microsoft.com/office/drawing/2015/10/21/chartex" xmlns:cx3="http://schemas.microsoft.com/office/drawing/2016/5/9/chartex" xmlns:cx4="http://schemas.microsoft.com/office/drawing/2016/5/10/chartex" xmlns:cx5="http://schemas.microsoft.com/office/drawing/2016/5/11/chartex" xmlns:cx6="http://schemas.microsoft.com/office/drawing/2016/5/12/chartex" xmlns:cx7="http://schemas.microsoft.com/office/drawing/2016/5/13/chartex" xmlns:cx8="http://schemas.microsoft.com/office/drawing/2016/5/14/chartex" xmlns:mc="http://schemas.openxmlformats.org/markup-compatibility/2006" xmlns:m="http://schemas.openxmlformats.org/officeDocument/2006/math" xmlns:aink="http://schemas.microsoft.com/office/drawing/2016/ink" xmlns:am3d="http://schemas.microsoft.com/office/drawing/2017/model3d" xmlns:oel="http://schemas.microsoft.com/office/2019/extlst" xmlns:r="http://schemas.openxmlformats.org/officeDocument/2006/relationships" xmlns:wp14="http://schemas.microsoft.com/office/word/2010/wordprocessingDrawing" xmlns:wp="http://schemas.openxmlformats.org/drawingml/2006/wordprocessingDrawing" xmlns:wpg="http://schemas.microsoft.com/office/word/2010/wordprocessingGroup" xmlns:wpi="http://schemas.microsoft.com/office/word/2010/wordprocessingInk" xmlns:wps="http://schemas.microsoft.com/office/word/2010/wordprocessingShape" xmlns:o="urn:schemas-microsoft-com:office:office" xmlns:v="urn:schemas-microsoft-com:vml" xmlns:w10="urn:schemas-microsoft-com:office:word" xmlns:w="http://schemas.openxmlformats.org/wordprocessingml/2006/main" xmlns:w14="http://schemas.microsoft.com/office/word/2010/wordml" xmlns:w15="http://schemas.microsoft.com/office/word/2012/wordml" xmlns:w16cex="http://schemas.microsoft.com/office/word/2018/wordml/cex" xmlns:w16cid="http://schemas.microsoft.com/office/word/2016/wordml/cid" xmlns:w16="http://schemas.microsoft.com/office/word/2018/wordml" xmlns:w16sdtdh="http://schemas.microsoft.com/office/word/2020/wordml/sdtdatahash" xmlns:w16sdtfl="http://schemas.microsoft.com/office/word/2024/wordml/sdtformatlock" xmlns:w16se="http://schemas.microsoft.com/office/word/2015/wordml/symex" xmlns:w16du="http://schemas.microsoft.com/office/word/2023/wordml/word16du" xmlns:wne="http://schemas.microsoft.com/office/word/2006/wordml" mc:Ignorable="w14 w15 w16se w16cid w16 w16cex w16sdtdh w16sdtfl w16du wp14">
   <w:footnote w:type="separator" w:id="-1">
     <w:p>
       <w:pPr>
@@ -2488,7 +2414,7 @@
 </file>
 
 <file path=word/numbering.xml><?xml version="1.0" encoding="utf-8"?>
-<w:numbering xmlns:wpc="http://schemas.microsoft.com/office/word/2010/wordprocessingCanvas" xmlns:cx="http://schemas.microsoft.com/office/drawing/2014/chartex" xmlns:cx1="http://schemas.microsoft.com/office/drawing/2015/9/8/chartex" xmlns:cx2="http://schemas.microsoft.com/office/drawing/2015/10/21/chartex" xmlns:cx3="http://schemas.microsoft.com/office/drawing/2016/5/9/chartex" xmlns:cx4="http://schemas.microsoft.com/office/drawing/2016/5/10/chartex" xmlns:cx5="http://schemas.microsoft.com/office/drawing/2016/5/11/chartex" xmlns:cx6="http://schemas.microsoft.com/office/drawing/2016/5/12/chartex" xmlns:cx7="http://schemas.microsoft.com/office/drawing/2016/5/13/chartex" xmlns:cx8="http://schemas.microsoft.com/office/drawing/2016/5/14/chartex" xmlns:mc="http://schemas.openxmlformats.org/markup-compatibility/2006" xmlns:aink="http://schemas.microsoft.com/office/drawing/2016/ink" xmlns:am3d="http://schemas.microsoft.com/office/drawing/2017/model3d" xmlns:o="urn:schemas-microsoft-com:office:office" xmlns:oel="http://schemas.microsoft.com/office/2019/extlst" xmlns:r="http://schemas.openxmlformats.org/officeDocument/2006/relationships" xmlns:m="http://schemas.openxmlformats.org/officeDocument/2006/math" xmlns:v="urn:schemas-microsoft-com:vml" xmlns:wp14="http://schemas.microsoft.com/office/word/2010/wordprocessingDrawing" xmlns:wp="http://schemas.openxmlformats.org/drawingml/2006/wordprocessingDrawing" xmlns:w10="urn:schemas-microsoft-com:office:word" xmlns:w="http://schemas.openxmlformats.org/wordprocessingml/2006/main" xmlns:w14="http://schemas.microsoft.com/office/word/2010/wordml" xmlns:w15="http://schemas.microsoft.com/office/word/2012/wordml" xmlns:w16cex="http://schemas.microsoft.com/office/word/2018/wordml/cex" xmlns:w16cid="http://schemas.microsoft.com/office/word/2016/wordml/cid" xmlns:w16="http://schemas.microsoft.com/office/word/2018/wordml" xmlns:w16du="http://schemas.microsoft.com/office/word/2023/wordml/word16du" xmlns:w16sdtdh="http://schemas.microsoft.com/office/word/2020/wordml/sdtdatahash" xmlns:w16sdtfl="http://schemas.microsoft.com/office/word/2024/wordml/sdtformatlock" xmlns:w16se="http://schemas.microsoft.com/office/word/2015/wordml/symex" xmlns:wpg="http://schemas.microsoft.com/office/word/2010/wordprocessingGroup" xmlns:wpi="http://schemas.microsoft.com/office/word/2010/wordprocessingInk" xmlns:wne="http://schemas.microsoft.com/office/word/2006/wordml" xmlns:wps="http://schemas.microsoft.com/office/word/2010/wordprocessingShape" mc:Ignorable="w14 w15 w16se w16cid w16 w16cex w16sdtdh w16sdtfl w16du wp14">
+<w:numbering xmlns:wpc="http://schemas.microsoft.com/office/word/2010/wordprocessingCanvas" xmlns:cx="http://schemas.microsoft.com/office/drawing/2014/chartex" xmlns:cx1="http://schemas.microsoft.com/office/drawing/2015/9/8/chartex" xmlns:cx2="http://schemas.microsoft.com/office/drawing/2015/10/21/chartex" xmlns:cx3="http://schemas.microsoft.com/office/drawing/2016/5/9/chartex" xmlns:cx4="http://schemas.microsoft.com/office/drawing/2016/5/10/chartex" xmlns:cx5="http://schemas.microsoft.com/office/drawing/2016/5/11/chartex" xmlns:cx6="http://schemas.microsoft.com/office/drawing/2016/5/12/chartex" xmlns:cx7="http://schemas.microsoft.com/office/drawing/2016/5/13/chartex" xmlns:cx8="http://schemas.microsoft.com/office/drawing/2016/5/14/chartex" xmlns:mc="http://schemas.openxmlformats.org/markup-compatibility/2006" xmlns:m="http://schemas.openxmlformats.org/officeDocument/2006/math" xmlns:aink="http://schemas.microsoft.com/office/drawing/2016/ink" xmlns:am3d="http://schemas.microsoft.com/office/drawing/2017/model3d" xmlns:oel="http://schemas.microsoft.com/office/2019/extlst" xmlns:r="http://schemas.openxmlformats.org/officeDocument/2006/relationships" xmlns:wp14="http://schemas.microsoft.com/office/word/2010/wordprocessingDrawing" xmlns:wp="http://schemas.openxmlformats.org/drawingml/2006/wordprocessingDrawing" xmlns:wpg="http://schemas.microsoft.com/office/word/2010/wordprocessingGroup" xmlns:wpi="http://schemas.microsoft.com/office/word/2010/wordprocessingInk" xmlns:wps="http://schemas.microsoft.com/office/word/2010/wordprocessingShape" xmlns:o="urn:schemas-microsoft-com:office:office" xmlns:v="urn:schemas-microsoft-com:vml" xmlns:w10="urn:schemas-microsoft-com:office:word" xmlns:w="http://schemas.openxmlformats.org/wordprocessingml/2006/main" xmlns:w14="http://schemas.microsoft.com/office/word/2010/wordml" xmlns:w15="http://schemas.microsoft.com/office/word/2012/wordml" xmlns:w16cex="http://schemas.microsoft.com/office/word/2018/wordml/cex" xmlns:w16cid="http://schemas.microsoft.com/office/word/2016/wordml/cid" xmlns:w16="http://schemas.microsoft.com/office/word/2018/wordml" xmlns:w16sdtdh="http://schemas.microsoft.com/office/word/2020/wordml/sdtdatahash" xmlns:w16sdtfl="http://schemas.microsoft.com/office/word/2024/wordml/sdtformatlock" xmlns:w16se="http://schemas.microsoft.com/office/word/2015/wordml/symex" xmlns:w16du="http://schemas.microsoft.com/office/word/2023/wordml/word16du" xmlns:wne="http://schemas.microsoft.com/office/word/2006/wordml" mc:Ignorable="w14 w15 w16se w16cid w16 w16cex w16sdtdh w16sdtfl w16du wp14">
   <w:abstractNum w:abstractNumId="0" w15:restartNumberingAfterBreak="0">
     <w:nsid w:val="FFFFFF7C"/>
     <w:multiLevelType w:val="singleLevel"/>
@@ -2691,7 +2617,7 @@
 </file>
 
 <file path=word/styles.xml><?xml version="1.0" encoding="utf-8"?>
-<w:styles xmlns:mc="http://schemas.openxmlformats.org/markup-compatibility/2006" xmlns:r="http://schemas.openxmlformats.org/officeDocument/2006/relationships" xmlns:w="http://schemas.openxmlformats.org/wordprocessingml/2006/main" xmlns:w14="http://schemas.microsoft.com/office/word/2010/wordml" xmlns:w15="http://schemas.microsoft.com/office/word/2012/wordml" xmlns:w16cex="http://schemas.microsoft.com/office/word/2018/wordml/cex" xmlns:w16cid="http://schemas.microsoft.com/office/word/2016/wordml/cid" xmlns:w16="http://schemas.microsoft.com/office/word/2018/wordml" xmlns:w16du="http://schemas.microsoft.com/office/word/2023/wordml/word16du" xmlns:w16sdtdh="http://schemas.microsoft.com/office/word/2020/wordml/sdtdatahash" xmlns:w16sdtfl="http://schemas.microsoft.com/office/word/2024/wordml/sdtformatlock" xmlns:w16se="http://schemas.microsoft.com/office/word/2015/wordml/symex" mc:Ignorable="w14 w15 w16se w16cid w16 w16cex w16sdtdh w16sdtfl w16du">
+<w:styles xmlns:mc="http://schemas.openxmlformats.org/markup-compatibility/2006" xmlns:r="http://schemas.openxmlformats.org/officeDocument/2006/relationships" xmlns:w="http://schemas.openxmlformats.org/wordprocessingml/2006/main" xmlns:w14="http://schemas.microsoft.com/office/word/2010/wordml" xmlns:w15="http://schemas.microsoft.com/office/word/2012/wordml" xmlns:w16cex="http://schemas.microsoft.com/office/word/2018/wordml/cex" xmlns:w16cid="http://schemas.microsoft.com/office/word/2016/wordml/cid" xmlns:w16="http://schemas.microsoft.com/office/word/2018/wordml" xmlns:w16sdtdh="http://schemas.microsoft.com/office/word/2020/wordml/sdtdatahash" xmlns:w16sdtfl="http://schemas.microsoft.com/office/word/2024/wordml/sdtformatlock" xmlns:w16se="http://schemas.microsoft.com/office/word/2015/wordml/symex" xmlns:w16du="http://schemas.microsoft.com/office/word/2023/wordml/word16du" mc:Ignorable="w14 w15 w16se w16cid w16 w16cex w16sdtdh w16sdtfl w16du">
   <w:docDefaults>
     <w:rPrDefault>
       <w:rPr>
@@ -3298,6 +3224,7 @@
   <w:style w:type="character" w:default="1" w:styleId="DefaultParagraphFont">
     <w:name w:val="Default Paragraph Font"/>
     <w:uiPriority w:val="1"/>
+    <w:semiHidden/>
     <w:unhideWhenUsed/>
   </w:style>
   <w:style w:type="table" w:default="1" w:styleId="TableNormal">

</xml_diff>

<commit_message>
Add numerical EDA findings and figures to midterm report
- Fill in numerical distributions by income (age, hours, capital gain)
- Add correlation and relationship-as-sex-proxy findings
- Add 4 figures: capital gain log transform, age/hours by income,
  correlation heatmap, >50K rate by relationship
- Fix typos in Data Preparation and update Phase 4 predictor list
- New edits for this part are highlighted in green
</commit_message>
<xml_diff>
--- a/Phase3_MidtermReport_Brinegar.docx
+++ b/Phase3_MidtermReport_Brinegar.docx
@@ -1,6 +1,6 @@
 
 <file path=word/document.xml><?xml version="1.0" encoding="utf-8"?>
-<w:document xmlns:wpc="http://schemas.microsoft.com/office/word/2010/wordprocessingCanvas" xmlns:cx="http://schemas.microsoft.com/office/drawing/2014/chartex" xmlns:cx1="http://schemas.microsoft.com/office/drawing/2015/9/8/chartex" xmlns:cx2="http://schemas.microsoft.com/office/drawing/2015/10/21/chartex" xmlns:cx3="http://schemas.microsoft.com/office/drawing/2016/5/9/chartex" xmlns:cx4="http://schemas.microsoft.com/office/drawing/2016/5/10/chartex" xmlns:cx5="http://schemas.microsoft.com/office/drawing/2016/5/11/chartex" xmlns:cx6="http://schemas.microsoft.com/office/drawing/2016/5/12/chartex" xmlns:cx7="http://schemas.microsoft.com/office/drawing/2016/5/13/chartex" xmlns:cx8="http://schemas.microsoft.com/office/drawing/2016/5/14/chartex" xmlns:mc="http://schemas.openxmlformats.org/markup-compatibility/2006" xmlns:m="http://schemas.openxmlformats.org/officeDocument/2006/math" xmlns:aink="http://schemas.microsoft.com/office/drawing/2016/ink" xmlns:am3d="http://schemas.microsoft.com/office/drawing/2017/model3d" xmlns:oel="http://schemas.microsoft.com/office/2019/extlst" xmlns:r="http://schemas.openxmlformats.org/officeDocument/2006/relationships" xmlns:wp14="http://schemas.microsoft.com/office/word/2010/wordprocessingDrawing" xmlns:wp="http://schemas.openxmlformats.org/drawingml/2006/wordprocessingDrawing" xmlns:wpg="http://schemas.microsoft.com/office/word/2010/wordprocessingGroup" xmlns:wpi="http://schemas.microsoft.com/office/word/2010/wordprocessingInk" xmlns:wps="http://schemas.microsoft.com/office/word/2010/wordprocessingShape" xmlns:o="urn:schemas-microsoft-com:office:office" xmlns:v="urn:schemas-microsoft-com:vml" xmlns:w10="urn:schemas-microsoft-com:office:word" xmlns:w="http://schemas.openxmlformats.org/wordprocessingml/2006/main" xmlns:w14="http://schemas.microsoft.com/office/word/2010/wordml" xmlns:w15="http://schemas.microsoft.com/office/word/2012/wordml" xmlns:w16cex="http://schemas.microsoft.com/office/word/2018/wordml/cex" xmlns:w16cid="http://schemas.microsoft.com/office/word/2016/wordml/cid" xmlns:w16="http://schemas.microsoft.com/office/word/2018/wordml" xmlns:w16sdtdh="http://schemas.microsoft.com/office/word/2020/wordml/sdtdatahash" xmlns:w16sdtfl="http://schemas.microsoft.com/office/word/2024/wordml/sdtformatlock" xmlns:w16se="http://schemas.microsoft.com/office/word/2015/wordml/symex" xmlns:w16du="http://schemas.microsoft.com/office/word/2023/wordml/word16du" xmlns:wne="http://schemas.microsoft.com/office/word/2006/wordml" mc:Ignorable="w14 w15 w16se w16cid w16 w16cex w16sdtdh w16sdtfl w16du wp14">
+<w:document xmlns:wpc="http://schemas.microsoft.com/office/word/2010/wordprocessingCanvas" xmlns:cx="http://schemas.microsoft.com/office/drawing/2014/chartex" xmlns:cx1="http://schemas.microsoft.com/office/drawing/2015/9/8/chartex" xmlns:cx2="http://schemas.microsoft.com/office/drawing/2015/10/21/chartex" xmlns:cx3="http://schemas.microsoft.com/office/drawing/2016/5/9/chartex" xmlns:cx4="http://schemas.microsoft.com/office/drawing/2016/5/10/chartex" xmlns:cx5="http://schemas.microsoft.com/office/drawing/2016/5/11/chartex" xmlns:cx6="http://schemas.microsoft.com/office/drawing/2016/5/12/chartex" xmlns:cx7="http://schemas.microsoft.com/office/drawing/2016/5/13/chartex" xmlns:cx8="http://schemas.microsoft.com/office/drawing/2016/5/14/chartex" xmlns:mc="http://schemas.openxmlformats.org/markup-compatibility/2006" xmlns:aink="http://schemas.microsoft.com/office/drawing/2016/ink" xmlns:am3d="http://schemas.microsoft.com/office/drawing/2017/model3d" xmlns:o="urn:schemas-microsoft-com:office:office" xmlns:oel="http://schemas.microsoft.com/office/2019/extlst" xmlns:r="http://schemas.openxmlformats.org/officeDocument/2006/relationships" xmlns:m="http://schemas.openxmlformats.org/officeDocument/2006/math" xmlns:v="urn:schemas-microsoft-com:vml" xmlns:wp14="http://schemas.microsoft.com/office/word/2010/wordprocessingDrawing" xmlns:wp="http://schemas.openxmlformats.org/drawingml/2006/wordprocessingDrawing" xmlns:w10="urn:schemas-microsoft-com:office:word" xmlns:w="http://schemas.openxmlformats.org/wordprocessingml/2006/main" xmlns:w14="http://schemas.microsoft.com/office/word/2010/wordml" xmlns:w15="http://schemas.microsoft.com/office/word/2012/wordml" xmlns:w16cex="http://schemas.microsoft.com/office/word/2018/wordml/cex" xmlns:w16cid="http://schemas.microsoft.com/office/word/2016/wordml/cid" xmlns:w16="http://schemas.microsoft.com/office/word/2018/wordml" xmlns:w16du="http://schemas.microsoft.com/office/word/2023/wordml/word16du" xmlns:w16sdtdh="http://schemas.microsoft.com/office/word/2020/wordml/sdtdatahash" xmlns:w16sdtfl="http://schemas.microsoft.com/office/word/2024/wordml/sdtformatlock" xmlns:w16se="http://schemas.microsoft.com/office/word/2015/wordml/symex" xmlns:wpg="http://schemas.microsoft.com/office/word/2010/wordprocessingGroup" xmlns:wpi="http://schemas.microsoft.com/office/word/2010/wordprocessingInk" xmlns:wne="http://schemas.microsoft.com/office/word/2006/wordml" xmlns:wps="http://schemas.microsoft.com/office/word/2010/wordprocessingShape" mc:Ignorable="w14 w15 w16se w16cid w16 w16cex w16sdtdh w16sdtfl w16du wp14">
   <w:body>
     <w:p>
       <w:pPr>
@@ -149,21 +149,7 @@
         <w:rPr>
           <w:highlight w:val="yellow"/>
         </w:rPr>
-        <w:t xml:space="preserve">We excluded </w:t>
-      </w:r>
-      <w:proofErr w:type="spellStart"/>
-      <w:r>
-        <w:rPr>
-          <w:highlight w:val="yellow"/>
-        </w:rPr>
-        <w:t>fnlwgt</w:t>
-      </w:r>
-      <w:proofErr w:type="spellEnd"/>
-      <w:r>
-        <w:rPr>
-          <w:highlight w:val="yellow"/>
-        </w:rPr>
-        <w:t xml:space="preserve"> from modeling, as explained in Data Preparation.</w:t>
+        <w:t>We excluded fnlwgt from modeling, as explained in Data Preparation.</w:t>
       </w:r>
     </w:p>
     <w:p>
@@ -215,11 +201,9 @@
       <w:r>
         <w:t xml:space="preserve">the </w:t>
       </w:r>
-      <w:proofErr w:type="spellStart"/>
       <w:r>
         <w:t>adult.names</w:t>
       </w:r>
-      <w:proofErr w:type="spellEnd"/>
       <w:r>
         <w:t xml:space="preserve"> file</w:t>
       </w:r>
@@ -246,15 +230,7 @@
     </w:p>
     <w:p>
       <w:r>
-        <w:t xml:space="preserve">Missing values were found to be represented by a ‘?’. A missing value count from </w:t>
-      </w:r>
-      <w:proofErr w:type="spellStart"/>
-      <w:r>
-        <w:t>isna</w:t>
-      </w:r>
-      <w:proofErr w:type="spellEnd"/>
-      <w:r>
-        <w:t>() therefore is not meaningful for this dataset.</w:t>
+        <w:t>Missing values were found to be represented by a ‘?’. A missing value count from isna() therefore is not meaningful for this dataset.</w:t>
       </w:r>
     </w:p>
     <w:p>
@@ -271,43 +247,23 @@
           <w:color w:val="auto"/>
           <w:highlight w:val="yellow"/>
         </w:rPr>
-        <w:t xml:space="preserve">All preparation steps were applied to a copy of the combined data to make sure we didn’t affect the raw files, and all four resampling conditions start with the same prepared data. So first we removed the periods at the end of the income column in test, so know we only have to classes ≤50K (37,155) and &gt;50K (11,687). Then instead of dropping the 3,620 rows that had the ‘?’, we replaced them with an “Uknown” label (more specifically in </w:t>
-      </w:r>
-      <w:proofErr w:type="spellStart"/>
+        <w:t xml:space="preserve">All preparation steps were applied to a copy of the combined data to make sure we didn’t affect the raw files, and all four resampling conditions start with the same prepared data. So first we removed the periods at the end of the income column in test, so now we only have </w:t>
+      </w:r>
       <w:r>
         <w:rPr>
           <w:iCs/>
           <w:color w:val="auto"/>
           <w:highlight w:val="yellow"/>
         </w:rPr>
-        <w:t>workclass</w:t>
-      </w:r>
-      <w:proofErr w:type="spellEnd"/>
+        <w:t>two</w:t>
+      </w:r>
       <w:r>
         <w:rPr>
           <w:iCs/>
           <w:color w:val="auto"/>
           <w:highlight w:val="yellow"/>
         </w:rPr>
-        <w:t xml:space="preserve">, occupation, and </w:t>
-      </w:r>
-      <w:proofErr w:type="spellStart"/>
-      <w:r>
-        <w:rPr>
-          <w:iCs/>
-          <w:color w:val="auto"/>
-          <w:highlight w:val="yellow"/>
-        </w:rPr>
-        <w:t>native_country</w:t>
-      </w:r>
-      <w:proofErr w:type="spellEnd"/>
-      <w:r>
-        <w:rPr>
-          <w:iCs/>
-          <w:color w:val="auto"/>
-          <w:highlight w:val="yellow"/>
-        </w:rPr>
-        <w:t xml:space="preserve"> columns); the reason behind that choice was that dropping them would remove 100 of the 1,769 Female &gt;50K records, which is already the smallest subgroup, and subgroup sizes are important in our fairness comparison.</w:t>
+        <w:t xml:space="preserve"> classes ≤50K (37,155) and &gt;50K (11,687). Then instead of dropping the 3,620 rows that had the ‘?’, we replaced them with an “Uknown” label (more specifically in workclass, occupation, and native_country columns); the reason behind that choice was that dropping them would remove 100 of the 1,769 Female &gt;50K records, which is already the smallest subgroup, and subgroup sizes are important in our fairness comparison.</w:t>
       </w:r>
     </w:p>
     <w:p>
@@ -366,25 +322,23 @@
           <w:color w:val="auto"/>
           <w:highlight w:val="yellow"/>
         </w:rPr>
-        <w:t xml:space="preserve">Additionally, education and </w:t>
-      </w:r>
-      <w:proofErr w:type="spellStart"/>
+        <w:t xml:space="preserve">Additionally, education and education_num ended up having a one-to-one mapping, from Preschool (1) to Doctorate (16), so we decided to drop education and </w:t>
+      </w:r>
       <w:r>
         <w:rPr>
           <w:iCs/>
           <w:color w:val="auto"/>
           <w:highlight w:val="yellow"/>
         </w:rPr>
-        <w:t>education_num</w:t>
-      </w:r>
-      <w:proofErr w:type="spellEnd"/>
+        <w:t>kept education_num, which keeps the order between levels</w:t>
+      </w:r>
       <w:r>
         <w:rPr>
           <w:iCs/>
           <w:color w:val="auto"/>
           <w:highlight w:val="yellow"/>
         </w:rPr>
-        <w:t xml:space="preserve"> ended up having a one-to-one mapping, from Preschool (1) to Doctorate (16), so we decided to drop education and kept the column with the numbers which at the end keeps the order between levels. </w:t>
+        <w:t xml:space="preserve">. </w:t>
       </w:r>
       <w:r>
         <w:rPr>
@@ -414,7 +368,124 @@
           <w:color w:val="auto"/>
           <w:highlight w:val="yellow"/>
         </w:rPr>
-        <w:t>Finally, we applied a log(1 + x) transformation to capital_gain and capital_loss, to keep the zeros as zeros and reduce the influence of very large values/outliers like 99,999 (244 records) when SMOTE-NC selects neighbors. We did not remove any outliers, since values like age 90 or 99 hours per week are actually possible and may be correct, and a decision tree splits on thresholds. The prepared data keeps all 48,842 rows, with 5 numerical and 7 categorical predictors, and the subgroup counts are unchanged.</w:t>
+        <w:t>Finally, we applied a log(1 + x) transformation to capital_gain and capital_loss, to keep the zeros as zeros and reduce the influence of very large values/outliers like 99,999 (244 records) when SMOTE-NC selects neighbors</w:t>
+      </w:r>
+      <w:r>
+        <w:rPr>
+          <w:iCs/>
+          <w:color w:val="auto"/>
+          <w:highlight w:val="yellow"/>
+        </w:rPr>
+        <w:t xml:space="preserve"> (Figure 1)</w:t>
+      </w:r>
+      <w:r>
+        <w:rPr>
+          <w:iCs/>
+          <w:color w:val="auto"/>
+          <w:highlight w:val="yellow"/>
+        </w:rPr>
+        <w:t>. We did not remove any outliers, since values like age 90 or 99 hours per week are actually possible and may be correct, and a decision tree splits on thresholds. The prepared data keeps all 48,842 rows, with 5 numerical and 7 categorical predictors, and the subgroup counts are unchanged.</w:t>
+      </w:r>
+    </w:p>
+    <w:p>
+      <w:pPr>
+        <w:keepNext/>
+        <w:jc w:val="center"/>
+      </w:pPr>
+      <w:r>
+        <w:rPr>
+          <w:iCs/>
+          <w:noProof/>
+          <w:color w:val="auto"/>
+        </w:rPr>
+        <w:drawing>
+          <wp:inline distT="0" distB="0" distL="0" distR="0" wp14:anchorId="12608BEE" wp14:editId="6A7F091E">
+            <wp:extent cx="3177540" cy="1251585"/>
+            <wp:effectExtent l="0" t="0" r="3810" b="5715"/>
+            <wp:docPr id="1662423202" name="Picture 4"/>
+            <wp:cNvGraphicFramePr>
+              <a:graphicFrameLocks xmlns:a="http://schemas.openxmlformats.org/drawingml/2006/main" noChangeAspect="1"/>
+            </wp:cNvGraphicFramePr>
+            <a:graphic xmlns:a="http://schemas.openxmlformats.org/drawingml/2006/main">
+              <a:graphicData uri="http://schemas.openxmlformats.org/drawingml/2006/picture">
+                <pic:pic xmlns:pic="http://schemas.openxmlformats.org/drawingml/2006/picture">
+                  <pic:nvPicPr>
+                    <pic:cNvPr id="1662423202" name="Picture 1662423202"/>
+                    <pic:cNvPicPr/>
+                  </pic:nvPicPr>
+                  <pic:blipFill>
+                    <a:blip r:embed="rId9"/>
+                    <a:stretch>
+                      <a:fillRect/>
+                    </a:stretch>
+                  </pic:blipFill>
+                  <pic:spPr>
+                    <a:xfrm>
+                      <a:off x="0" y="0"/>
+                      <a:ext cx="3177540" cy="1251585"/>
+                    </a:xfrm>
+                    <a:prstGeom prst="rect">
+                      <a:avLst/>
+                    </a:prstGeom>
+                  </pic:spPr>
+                </pic:pic>
+              </a:graphicData>
+            </a:graphic>
+          </wp:inline>
+        </w:drawing>
+      </w:r>
+    </w:p>
+    <w:p>
+      <w:pPr>
+        <w:pStyle w:val="Caption"/>
+        <w:jc w:val="center"/>
+        <w:rPr>
+          <w:iCs/>
+          <w:color w:val="auto"/>
+        </w:rPr>
+      </w:pPr>
+      <w:r>
+        <w:rPr>
+          <w:highlight w:val="darkCyan"/>
+        </w:rPr>
+        <w:t xml:space="preserve">Figure </w:t>
+      </w:r>
+      <w:r>
+        <w:rPr>
+          <w:highlight w:val="darkCyan"/>
+        </w:rPr>
+        <w:fldChar w:fldCharType="begin"/>
+      </w:r>
+      <w:r>
+        <w:rPr>
+          <w:highlight w:val="darkCyan"/>
+        </w:rPr>
+        <w:instrText xml:space="preserve"> SEQ Figure \* ARABIC </w:instrText>
+      </w:r>
+      <w:r>
+        <w:rPr>
+          <w:highlight w:val="darkCyan"/>
+        </w:rPr>
+        <w:fldChar w:fldCharType="separate"/>
+      </w:r>
+      <w:r>
+        <w:rPr>
+          <w:noProof/>
+          <w:highlight w:val="darkCyan"/>
+        </w:rPr>
+        <w:t>1</w:t>
+      </w:r>
+      <w:r>
+        <w:rPr>
+          <w:highlight w:val="darkCyan"/>
+        </w:rPr>
+        <w:fldChar w:fldCharType="end"/>
+      </w:r>
+      <w:r>
+        <w:rPr>
+          <w:highlight w:val="darkCyan"/>
+        </w:rPr>
+        <w:t>. Nonzero capital gain before and after the log(1 + x) transformation.</w:t>
       </w:r>
     </w:p>
     <w:p>
@@ -872,7 +943,10 @@
     </w:p>
     <w:p>
       <w:r>
-        <w:t>Income has four raw strings: training labels ≤50K and &gt;50K, and test labels with trailing periods. Their respective counts are 24,720 and 7,841 in training, and 12,435 and 3,846 in test. The apparent extra classes are a source-format inconsistency, not additional income outcomes.</w:t>
+        <w:t xml:space="preserve">Income has four raw strings: training labels ≤50K and &gt;50K, and test labels with trailing periods. Their respective counts are 24,720 and 7,841 in training, and 12,435 and </w:t>
+      </w:r>
+      <w:r>
+        <w:t>3,846 in test. The apparent extra classes are a source-format inconsistency, not additional income outcomes.</w:t>
       </w:r>
     </w:p>
     <w:p>
@@ -1859,24 +1933,51 @@
         <w:t>hide</w:t>
       </w:r>
       <w:r>
-        <w:t xml:space="preserve"> this structure. Examining nonzero values separately will help assess how </w:t>
-      </w:r>
-      <w:r>
-        <w:t>SMOTE-NC</w:t>
-      </w:r>
-      <w:r>
-        <w:t xml:space="preserve"> could change their distributions.</w:t>
+        <w:t xml:space="preserve"> this structure. </w:t>
+      </w:r>
+      <w:r>
+        <w:rPr>
+          <w:highlight w:val="darkCyan"/>
+        </w:rPr>
+        <w:t>We examine the nonzero values by income class below.</w:t>
       </w:r>
     </w:p>
     <w:p>
       <w:r>
-        <w:t xml:space="preserve">Weekly hours have an interquartile range of 40–45, making values near 1 or 99 </w:t>
-      </w:r>
-      <w:r>
-        <w:t>need further</w:t>
-      </w:r>
-      <w:r>
-        <w:t xml:space="preserve"> review rather than automatic exclusion. Fnlwgt ranges from 12,285 to 1,490,400, with a median of 178,144.5</w:t>
+        <w:rPr>
+          <w:highlight w:val="darkCyan"/>
+        </w:rPr>
+        <w:t>Weekly hours have an interquartile range of 40</w:t>
+      </w:r>
+      <w:r>
+        <w:rPr>
+          <w:highlight w:val="darkCyan"/>
+        </w:rPr>
+        <w:t>-</w:t>
+      </w:r>
+      <w:r>
+        <w:rPr>
+          <w:highlight w:val="darkCyan"/>
+        </w:rPr>
+        <w:t xml:space="preserve">45, so values near 1 or 99 were reviewed rather than </w:t>
+      </w:r>
+      <w:r>
+        <w:rPr>
+          <w:highlight w:val="darkCyan"/>
+        </w:rPr>
+        <w:t>a</w:t>
+      </w:r>
+      <w:r>
+        <w:rPr>
+          <w:highlight w:val="darkCyan"/>
+        </w:rPr>
+        <w:t>utomatically excluded (see below).</w:t>
+      </w:r>
+      <w:r>
+        <w:t xml:space="preserve"> </w:t>
+      </w:r>
+      <w:r>
+        <w:t>Fnlwgt ranges from 12,285 to 1,490,400, with a median of 178,144.5</w:t>
       </w:r>
       <w:r>
         <w:t>.</w:t>
@@ -1913,6 +2014,7 @@
         <w:rPr>
           <w:i/>
           <w:iCs/>
+          <w:shd w:val="clear" w:color="auto" w:fill="D9EAF7"/>
         </w:rPr>
       </w:pPr>
       <w:r>
@@ -1921,7 +2023,288 @@
           <w:iCs/>
           <w:shd w:val="clear" w:color="auto" w:fill="D9EAF7"/>
         </w:rPr>
+        <w:lastRenderedPageBreak/>
         <w:t>[To complete: Integrate numerical distributions by outcome and other relevant feature relationships.]</w:t>
+      </w:r>
+    </w:p>
+    <w:p>
+      <w:pPr>
+        <w:rPr>
+          <w:highlight w:val="darkCyan"/>
+        </w:rPr>
+      </w:pPr>
+      <w:r>
+        <w:rPr>
+          <w:highlight w:val="darkCyan"/>
+        </w:rPr>
+        <w:t xml:space="preserve">Records earning &gt;50K are older (median age 43 vs. 34) and work more hours (mean 45.5 vs. 38.8; Figure </w:t>
+      </w:r>
+      <w:r>
+        <w:rPr>
+          <w:highlight w:val="darkCyan"/>
+        </w:rPr>
+        <w:t>2</w:t>
+      </w:r>
+      <w:r>
+        <w:rPr>
+          <w:highlight w:val="darkCyan"/>
+        </w:rPr>
+        <w:t xml:space="preserve">), although about 47% of all records report exactly 40 hours. Unusual values such as age 90 (55 records) and 99 hours (137 records) </w:t>
+      </w:r>
+      <w:r>
+        <w:rPr>
+          <w:highlight w:val="darkCyan"/>
+        </w:rPr>
+        <w:t>seem like caps instead of errors</w:t>
+      </w:r>
+      <w:r>
+        <w:rPr>
+          <w:highlight w:val="darkCyan"/>
+        </w:rPr>
+        <w:t>, so we kept them. Nonzero capital gain is much more common among &gt;50K records (21.3% vs. 4.2%), and all 244 records with a gain of 99,999 earn &gt;50K, which suggests a cap; this supports the log transformation described in Data Preparation.</w:t>
+      </w:r>
+    </w:p>
+    <w:p>
+      <w:pPr>
+        <w:keepNext/>
+        <w:rPr>
+          <w:highlight w:val="darkCyan"/>
+        </w:rPr>
+      </w:pPr>
+      <w:r>
+        <w:rPr>
+          <w:noProof/>
+          <w:highlight w:val="darkCyan"/>
+        </w:rPr>
+        <w:drawing>
+          <wp:inline distT="0" distB="0" distL="0" distR="0" wp14:anchorId="1912215C" wp14:editId="71FD6A9A">
+            <wp:extent cx="3177540" cy="1251585"/>
+            <wp:effectExtent l="0" t="0" r="3175" b="1270"/>
+            <wp:docPr id="582492555" name="Picture 1"/>
+            <wp:cNvGraphicFramePr>
+              <a:graphicFrameLocks xmlns:a="http://schemas.openxmlformats.org/drawingml/2006/main" noChangeAspect="1"/>
+            </wp:cNvGraphicFramePr>
+            <a:graphic xmlns:a="http://schemas.openxmlformats.org/drawingml/2006/main">
+              <a:graphicData uri="http://schemas.openxmlformats.org/drawingml/2006/picture">
+                <pic:pic xmlns:pic="http://schemas.openxmlformats.org/drawingml/2006/picture">
+                  <pic:nvPicPr>
+                    <pic:cNvPr id="582492555" name="Picture 582492555"/>
+                    <pic:cNvPicPr/>
+                  </pic:nvPicPr>
+                  <pic:blipFill>
+                    <a:blip r:embed="rId10"/>
+                    <a:stretch>
+                      <a:fillRect/>
+                    </a:stretch>
+                  </pic:blipFill>
+                  <pic:spPr>
+                    <a:xfrm>
+                      <a:off x="0" y="0"/>
+                      <a:ext cx="3177540" cy="1251585"/>
+                    </a:xfrm>
+                    <a:prstGeom prst="rect">
+                      <a:avLst/>
+                    </a:prstGeom>
+                  </pic:spPr>
+                </pic:pic>
+              </a:graphicData>
+            </a:graphic>
+          </wp:inline>
+        </w:drawing>
+      </w:r>
+    </w:p>
+    <w:p>
+      <w:pPr>
+        <w:pStyle w:val="Caption"/>
+        <w:jc w:val="center"/>
+        <w:rPr>
+          <w:highlight w:val="darkCyan"/>
+        </w:rPr>
+      </w:pPr>
+      <w:r>
+        <w:rPr>
+          <w:highlight w:val="darkCyan"/>
+        </w:rPr>
+        <w:t xml:space="preserve">Figure </w:t>
+      </w:r>
+      <w:r>
+        <w:rPr>
+          <w:highlight w:val="darkCyan"/>
+        </w:rPr>
+        <w:fldChar w:fldCharType="begin"/>
+      </w:r>
+      <w:r>
+        <w:rPr>
+          <w:highlight w:val="darkCyan"/>
+        </w:rPr>
+        <w:instrText xml:space="preserve"> SEQ Figure \* ARABIC </w:instrText>
+      </w:r>
+      <w:r>
+        <w:rPr>
+          <w:highlight w:val="darkCyan"/>
+        </w:rPr>
+        <w:fldChar w:fldCharType="separate"/>
+      </w:r>
+      <w:r>
+        <w:rPr>
+          <w:noProof/>
+          <w:highlight w:val="darkCyan"/>
+        </w:rPr>
+        <w:t>2</w:t>
+      </w:r>
+      <w:r>
+        <w:rPr>
+          <w:highlight w:val="darkCyan"/>
+        </w:rPr>
+        <w:fldChar w:fldCharType="end"/>
+      </w:r>
+      <w:r>
+        <w:rPr>
+          <w:highlight w:val="darkCyan"/>
+        </w:rPr>
+        <w:t>. Distribution of age and hours per week by income class.</w:t>
+      </w:r>
+    </w:p>
+    <w:p>
+      <w:pPr>
+        <w:rPr>
+          <w:highlight w:val="darkCyan"/>
+        </w:rPr>
+      </w:pPr>
+      <w:r>
+        <w:rPr>
+          <w:highlight w:val="darkCyan"/>
+        </w:rPr>
+        <w:t xml:space="preserve">Among the numerical features, education_num has the strongest correlation with income (0.33; Figure </w:t>
+      </w:r>
+      <w:r>
+        <w:rPr>
+          <w:highlight w:val="darkCyan"/>
+        </w:rPr>
+        <w:t>3</w:t>
+      </w:r>
+      <w:r>
+        <w:rPr>
+          <w:highlight w:val="darkCyan"/>
+        </w:rPr>
+        <w:t>), followed b</w:t>
+      </w:r>
+      <w:r>
+        <w:rPr>
+          <w:highlight w:val="darkCyan"/>
+        </w:rPr>
+        <w:t>y age and hours_per_week (0.23 each), while correlations between predictors stay below 0.15. The relationship feature is almost a direct proxy for sex: all but one Husband record is male and all but three Wife records</w:t>
+      </w:r>
+      <w:r>
+        <w:rPr>
+          <w:highlight w:val="darkCyan"/>
+        </w:rPr>
+        <w:t xml:space="preserve"> </w:t>
+      </w:r>
+      <w:r>
+        <w:rPr>
+          <w:highlight w:val="darkCyan"/>
+        </w:rPr>
+        <w:t>are female.</w:t>
+      </w:r>
+    </w:p>
+    <w:p>
+      <w:pPr>
+        <w:keepNext/>
+        <w:jc w:val="center"/>
+        <w:rPr>
+          <w:highlight w:val="darkCyan"/>
+        </w:rPr>
+      </w:pPr>
+      <w:r>
+        <w:rPr>
+          <w:noProof/>
+          <w:highlight w:val="darkCyan"/>
+        </w:rPr>
+        <w:drawing>
+          <wp:inline distT="0" distB="0" distL="0" distR="0" wp14:anchorId="3BF077DC" wp14:editId="07A14952">
+            <wp:extent cx="2741452" cy="2337684"/>
+            <wp:effectExtent l="0" t="0" r="1905" b="5715"/>
+            <wp:docPr id="144954766" name="Picture 2"/>
+            <wp:cNvGraphicFramePr>
+              <a:graphicFrameLocks xmlns:a="http://schemas.openxmlformats.org/drawingml/2006/main" noChangeAspect="1"/>
+            </wp:cNvGraphicFramePr>
+            <a:graphic xmlns:a="http://schemas.openxmlformats.org/drawingml/2006/main">
+              <a:graphicData uri="http://schemas.openxmlformats.org/drawingml/2006/picture">
+                <pic:pic xmlns:pic="http://schemas.openxmlformats.org/drawingml/2006/picture">
+                  <pic:nvPicPr>
+                    <pic:cNvPr id="144954766" name="Picture 144954766"/>
+                    <pic:cNvPicPr/>
+                  </pic:nvPicPr>
+                  <pic:blipFill>
+                    <a:blip r:embed="rId11"/>
+                    <a:stretch>
+                      <a:fillRect/>
+                    </a:stretch>
+                  </pic:blipFill>
+                  <pic:spPr>
+                    <a:xfrm>
+                      <a:off x="0" y="0"/>
+                      <a:ext cx="2777718" cy="2368608"/>
+                    </a:xfrm>
+                    <a:prstGeom prst="rect">
+                      <a:avLst/>
+                    </a:prstGeom>
+                  </pic:spPr>
+                </pic:pic>
+              </a:graphicData>
+            </a:graphic>
+          </wp:inline>
+        </w:drawing>
+      </w:r>
+    </w:p>
+    <w:p>
+      <w:pPr>
+        <w:pStyle w:val="Caption"/>
+        <w:jc w:val="center"/>
+      </w:pPr>
+      <w:r>
+        <w:rPr>
+          <w:highlight w:val="darkCyan"/>
+        </w:rPr>
+        <w:t xml:space="preserve">Figure </w:t>
+      </w:r>
+      <w:r>
+        <w:rPr>
+          <w:highlight w:val="darkCyan"/>
+        </w:rPr>
+        <w:fldChar w:fldCharType="begin"/>
+      </w:r>
+      <w:r>
+        <w:rPr>
+          <w:highlight w:val="darkCyan"/>
+        </w:rPr>
+        <w:instrText xml:space="preserve"> SEQ Figure \* ARABIC </w:instrText>
+      </w:r>
+      <w:r>
+        <w:rPr>
+          <w:highlight w:val="darkCyan"/>
+        </w:rPr>
+        <w:fldChar w:fldCharType="separate"/>
+      </w:r>
+      <w:r>
+        <w:rPr>
+          <w:noProof/>
+          <w:highlight w:val="darkCyan"/>
+        </w:rPr>
+        <w:t>3</w:t>
+      </w:r>
+      <w:r>
+        <w:rPr>
+          <w:highlight w:val="darkCyan"/>
+        </w:rPr>
+        <w:fldChar w:fldCharType="end"/>
+      </w:r>
+      <w:r>
+        <w:rPr>
+          <w:highlight w:val="darkCyan"/>
+        </w:rPr>
+        <w:t>. Pearson correlation between the numerical features and income (&gt;50K = 1).</w:t>
       </w:r>
     </w:p>
     <w:p>
@@ -1937,11 +2320,7 @@
         <w:t>The initial inspection identifies data quality and representation issues that must be addressed before testing the resampling hypothesis. Hidden unknown markers</w:t>
       </w:r>
       <w:r>
-        <w:t xml:space="preserve"> (The </w:t>
-      </w:r>
-      <w:r>
-        <w:lastRenderedPageBreak/>
-        <w:t>“?” for unknown values)</w:t>
+        <w:t xml:space="preserve"> (The “?” for unknown values)</w:t>
       </w:r>
       <w:r>
         <w:t xml:space="preserve"> and </w:t>
@@ -1956,7 +2335,10 @@
         <w:t>were</w:t>
       </w:r>
       <w:r>
-        <w:t xml:space="preserve"> immediate preparation concerns. Unequal outcome and sex totals motivate subgroup analysis, while </w:t>
+        <w:t xml:space="preserve"> immediate preparation concerns. Unequal outcome and sex totals motivate subgroup </w:t>
+      </w:r>
+      <w:r>
+        <w:t xml:space="preserve">analysis, while </w:t>
       </w:r>
       <w:r>
         <w:t xml:space="preserve">the </w:t>
@@ -2001,11 +2383,130 @@
       </w:r>
     </w:p>
     <w:p>
+      <w:pPr>
+        <w:rPr>
+          <w:shd w:val="clear" w:color="auto" w:fill="D9EAF7"/>
+        </w:rPr>
+      </w:pPr>
       <w:r>
         <w:rPr>
           <w:shd w:val="clear" w:color="auto" w:fill="D9EAF7"/>
         </w:rPr>
         <w:t>Female records are fewer overall and have a lower observed high-income rate. These differences support comparing resampling methods using the four sex/income subgroups. They do not show whether resampling will improve model fairness.</w:t>
+      </w:r>
+    </w:p>
+    <w:p>
+      <w:r>
+        <w:rPr>
+          <w:highlight w:val="darkCyan"/>
+        </w:rPr>
+        <w:t>Another important finding is that about 60% of men are recorded as Husband, a category where 44.9% earn &gt;50K, while most women fall into categories with much lower rates, such as Not-in-family (10.1%) and Unmarried (6.0%)</w:t>
+      </w:r>
+      <w:r>
+        <w:rPr>
+          <w:highlight w:val="darkCyan"/>
+        </w:rPr>
+        <w:t xml:space="preserve"> (Figure 4)</w:t>
+      </w:r>
+      <w:r>
+        <w:rPr>
+          <w:highlight w:val="darkCyan"/>
+        </w:rPr>
+        <w:t>. Therefore, removing sex as a predictor may not remove its effect, since the decision tree could still learn it through relationship.</w:t>
+      </w:r>
+    </w:p>
+    <w:p>
+      <w:pPr>
+        <w:keepNext/>
+      </w:pPr>
+      <w:r>
+        <w:rPr>
+          <w:noProof/>
+        </w:rPr>
+        <w:drawing>
+          <wp:inline distT="0" distB="0" distL="0" distR="0" wp14:anchorId="659D116A" wp14:editId="5816F002">
+            <wp:extent cx="3177540" cy="1795780"/>
+            <wp:effectExtent l="0" t="0" r="3810" b="0"/>
+            <wp:docPr id="564681055" name="Picture 5"/>
+            <wp:cNvGraphicFramePr>
+              <a:graphicFrameLocks xmlns:a="http://schemas.openxmlformats.org/drawingml/2006/main" noChangeAspect="1"/>
+            </wp:cNvGraphicFramePr>
+            <a:graphic xmlns:a="http://schemas.openxmlformats.org/drawingml/2006/main">
+              <a:graphicData uri="http://schemas.openxmlformats.org/drawingml/2006/picture">
+                <pic:pic xmlns:pic="http://schemas.openxmlformats.org/drawingml/2006/picture">
+                  <pic:nvPicPr>
+                    <pic:cNvPr id="564681055" name="Picture 564681055"/>
+                    <pic:cNvPicPr/>
+                  </pic:nvPicPr>
+                  <pic:blipFill>
+                    <a:blip r:embed="rId12"/>
+                    <a:stretch>
+                      <a:fillRect/>
+                    </a:stretch>
+                  </pic:blipFill>
+                  <pic:spPr>
+                    <a:xfrm>
+                      <a:off x="0" y="0"/>
+                      <a:ext cx="3177540" cy="1795780"/>
+                    </a:xfrm>
+                    <a:prstGeom prst="rect">
+                      <a:avLst/>
+                    </a:prstGeom>
+                  </pic:spPr>
+                </pic:pic>
+              </a:graphicData>
+            </a:graphic>
+          </wp:inline>
+        </w:drawing>
+      </w:r>
+    </w:p>
+    <w:p>
+      <w:pPr>
+        <w:pStyle w:val="Caption"/>
+        <w:jc w:val="center"/>
+      </w:pPr>
+      <w:r>
+        <w:rPr>
+          <w:highlight w:val="darkCyan"/>
+        </w:rPr>
+        <w:t xml:space="preserve">Figure </w:t>
+      </w:r>
+      <w:r>
+        <w:rPr>
+          <w:highlight w:val="darkCyan"/>
+        </w:rPr>
+        <w:fldChar w:fldCharType="begin"/>
+      </w:r>
+      <w:r>
+        <w:rPr>
+          <w:highlight w:val="darkCyan"/>
+        </w:rPr>
+        <w:instrText xml:space="preserve"> SEQ Figure \* ARABIC </w:instrText>
+      </w:r>
+      <w:r>
+        <w:rPr>
+          <w:highlight w:val="darkCyan"/>
+        </w:rPr>
+        <w:fldChar w:fldCharType="separate"/>
+      </w:r>
+      <w:r>
+        <w:rPr>
+          <w:noProof/>
+          <w:highlight w:val="darkCyan"/>
+        </w:rPr>
+        <w:t>4</w:t>
+      </w:r>
+      <w:r>
+        <w:rPr>
+          <w:highlight w:val="darkCyan"/>
+        </w:rPr>
+        <w:fldChar w:fldCharType="end"/>
+      </w:r>
+      <w:r>
+        <w:rPr>
+          <w:highlight w:val="darkCyan"/>
+        </w:rPr>
+        <w:t>. Share of records earning &gt;50K by relationship category.</w:t>
       </w:r>
     </w:p>
     <w:p>
@@ -2023,15 +2524,11 @@
     </w:p>
     <w:p>
       <w:r>
-        <w:t xml:space="preserve">Because the dataset contains both numbers and categories, we will use SMOTE-NC to create synthetic records while keeping categorical values valid. Categorical predictors will be identified explicitly. Sex and income will be preserved or restored from the subgroup label. The temporary sampling label will be removed before classifier training. Random oversampling copies existing records, while random </w:t>
-      </w:r>
-      <w:proofErr w:type="spellStart"/>
-      <w:r>
-        <w:t>undersampling</w:t>
-      </w:r>
-      <w:proofErr w:type="spellEnd"/>
-      <w:r>
-        <w:t xml:space="preserve"> removes records. Neither method changes the values within a record. Synthetic categorical values and demographic/outcome labels will be validated.</w:t>
+        <w:t xml:space="preserve">Because the dataset contains both numbers and categories, we will use SMOTE-NC to create synthetic records while keeping categorical values valid. Categorical predictors </w:t>
+      </w:r>
+      <w:r>
+        <w:lastRenderedPageBreak/>
+        <w:t>will be identified explicitly. Sex and income will be preserved or restored from the subgroup label. The temporary sampling label will be removed before classifier training. Random oversampling copies existing records, while random undersampling removes records. Neither method changes the values within a record. Synthetic categorical values and demographic/outcome labels will be validated.</w:t>
       </w:r>
     </w:p>
     <w:p>
@@ -2039,27 +2536,34 @@
         <w:rPr>
           <w:shd w:val="clear" w:color="auto" w:fill="D9EAF7"/>
         </w:rPr>
-        <w:t xml:space="preserve">All four conditions will use the same training and validation rows in each cross-validation fold, with matched random seeds, predictors, and decision-tree settings. Only the training rows will be resampled. Validation rows will keep their observed subgroup proportions. We will report accuracy, favorable-class precision, recall and F1, group confusion matrices, and score variation across folds. Female-minus-male statistical parity gaps will compare favorable prediction rates, and equal opportunity gaps will </w:t>
-      </w:r>
-      <w:r>
-        <w:rPr>
-          <w:shd w:val="clear" w:color="auto" w:fill="D9EAF7"/>
-        </w:rPr>
-        <w:t>compare true-positive rates. Smaller absolute gaps mean closer group rates on these measures. We will compare these gaps alongside predictive performance because higher overall scores may not mean better fairness.</w:t>
+        <w:t>All four conditions will use the same training and validation rows in each cross-validation fold, with matched random seeds, predictors, and decision-tree settings. Only the training rows will be resampled. Validation rows will keep their observed subgroup proportions. We will report accuracy, favorable-class precision, recall and F1, group confusion matrices, and score variation across folds. Female-minus-male statistical parity gaps will compare favorable prediction rates, and equal opportunity gaps will compare true-positive rates. Smaller absolute gaps mean closer group rates on these measures. We will compare these gaps alongside predictive performance because higher overall scores may not mean better fairness.</w:t>
       </w:r>
     </w:p>
     <w:p>
       <w:pPr>
         <w:rPr>
-          <w:i/>
-          <w:color w:val="595959"/>
+          <w:iCs/>
+          <w:highlight w:val="yellow"/>
         </w:rPr>
       </w:pPr>
       <w:r>
         <w:rPr>
           <w:shd w:val="clear" w:color="auto" w:fill="D9EAF7"/>
         </w:rPr>
-        <w:t>Before modeling, we still need to choose K, decision-tree settings, the SMOTE-NC neighbor count, how to handle education_num, and whether sex is a predictor. Numerical scaling and categorical encoding will be fitted within training folds. We will also specify how undefined group metrics are handled.</w:t>
+        <w:t xml:space="preserve">Before modeling, we still need to choose K, decision-tree settings, the SMOTE-NC neighbor count, </w:t>
+      </w:r>
+      <w:r>
+        <w:rPr>
+          <w:highlight w:val="darkCyan"/>
+          <w:shd w:val="clear" w:color="auto" w:fill="D9EAF7"/>
+        </w:rPr>
+        <w:t>how to handle education_num, and whether sex and relationship are used as predictors</w:t>
+      </w:r>
+      <w:r>
+        <w:rPr>
+          <w:shd w:val="clear" w:color="auto" w:fill="D9EAF7"/>
+        </w:rPr>
+        <w:t>. Numerical scaling and categorical encoding will be fitted within training folds. We will also specify how undefined group metrics are handled.</w:t>
       </w:r>
       <w:r>
         <w:rPr>
@@ -2103,133 +2607,19 @@
           <w:iCs/>
           <w:highlight w:val="yellow"/>
         </w:rPr>
-        <w:t xml:space="preserve"> train/test split: cross-validation folds </w:t>
+        <w:t xml:space="preserve"> train/test split: cross-</w:t>
       </w:r>
       <w:r>
         <w:rPr>
-          <w:iCs/>
           <w:highlight w:val="yellow"/>
         </w:rPr>
-        <w:t>will be</w:t>
+        <w:t xml:space="preserve">validation folds will be built within the 32,561 training rows, and the 16,281 test rows are reserved for the final evaluation. </w:t>
       </w:r>
       <w:r>
         <w:rPr>
-          <w:iCs/>
-          <w:highlight w:val="yellow"/>
+          <w:highlight w:val="darkCyan"/>
         </w:rPr>
-        <w:t xml:space="preserve"> built within the 32,561 training rows, and the 16,281 test rows are reserved for the final evaluation. The predictors are age, </w:t>
-      </w:r>
-      <w:proofErr w:type="spellStart"/>
-      <w:r>
-        <w:rPr>
-          <w:iCs/>
-          <w:highlight w:val="yellow"/>
-        </w:rPr>
-        <w:t>education_num</w:t>
-      </w:r>
-      <w:proofErr w:type="spellEnd"/>
-      <w:r>
-        <w:rPr>
-          <w:iCs/>
-          <w:highlight w:val="yellow"/>
-        </w:rPr>
-        <w:t xml:space="preserve">, </w:t>
-      </w:r>
-      <w:proofErr w:type="spellStart"/>
-      <w:r>
-        <w:rPr>
-          <w:iCs/>
-          <w:highlight w:val="yellow"/>
-        </w:rPr>
-        <w:t>capital_gain_log</w:t>
-      </w:r>
-      <w:proofErr w:type="spellEnd"/>
-      <w:r>
-        <w:rPr>
-          <w:iCs/>
-          <w:highlight w:val="yellow"/>
-        </w:rPr>
-        <w:t xml:space="preserve">, </w:t>
-      </w:r>
-      <w:proofErr w:type="spellStart"/>
-      <w:r>
-        <w:rPr>
-          <w:iCs/>
-          <w:highlight w:val="yellow"/>
-        </w:rPr>
-        <w:t>capital_loss_log</w:t>
-      </w:r>
-      <w:proofErr w:type="spellEnd"/>
-      <w:r>
-        <w:rPr>
-          <w:iCs/>
-          <w:highlight w:val="yellow"/>
-        </w:rPr>
-        <w:t xml:space="preserve">, </w:t>
-      </w:r>
-      <w:proofErr w:type="spellStart"/>
-      <w:r>
-        <w:rPr>
-          <w:iCs/>
-          <w:highlight w:val="yellow"/>
-        </w:rPr>
-        <w:t>hours_per_week</w:t>
-      </w:r>
-      <w:proofErr w:type="spellEnd"/>
-      <w:r>
-        <w:rPr>
-          <w:iCs/>
-          <w:highlight w:val="yellow"/>
-        </w:rPr>
-        <w:t xml:space="preserve">, </w:t>
-      </w:r>
-      <w:proofErr w:type="spellStart"/>
-      <w:r>
-        <w:rPr>
-          <w:iCs/>
-          <w:highlight w:val="yellow"/>
-        </w:rPr>
-        <w:t>workclass</w:t>
-      </w:r>
-      <w:proofErr w:type="spellEnd"/>
-      <w:r>
-        <w:rPr>
-          <w:iCs/>
-          <w:highlight w:val="yellow"/>
-        </w:rPr>
-        <w:t xml:space="preserve">, </w:t>
-      </w:r>
-      <w:proofErr w:type="spellStart"/>
-      <w:r>
-        <w:rPr>
-          <w:iCs/>
-          <w:highlight w:val="yellow"/>
-        </w:rPr>
-        <w:t>marital_status</w:t>
-      </w:r>
-      <w:proofErr w:type="spellEnd"/>
-      <w:r>
-        <w:rPr>
-          <w:iCs/>
-          <w:highlight w:val="yellow"/>
-        </w:rPr>
-        <w:t xml:space="preserve">, occupation, relationship, race, and </w:t>
-      </w:r>
-      <w:proofErr w:type="spellStart"/>
-      <w:r>
-        <w:rPr>
-          <w:iCs/>
-          <w:highlight w:val="yellow"/>
-        </w:rPr>
-        <w:t>native_country</w:t>
-      </w:r>
-      <w:proofErr w:type="spellEnd"/>
-      <w:r>
-        <w:rPr>
-          <w:iCs/>
-          <w:highlight w:val="yellow"/>
-        </w:rPr>
-        <w:t>, with sex still to be decided.</w:t>
+        <w:t>The candidate predictors are age, education_num, capital_gain_log, capital_loss_log, hours_per_week, workclass, marital_status, occupation, race, and native_country, with sex and relationship still to be decided.</w:t>
       </w:r>
     </w:p>
     <w:p>
@@ -2268,7 +2658,7 @@
 </file>
 
 <file path=word/endnotes.xml><?xml version="1.0" encoding="utf-8"?>
-<w:endnotes xmlns:wpc="http://schemas.microsoft.com/office/word/2010/wordprocessingCanvas" xmlns:cx="http://schemas.microsoft.com/office/drawing/2014/chartex" xmlns:cx1="http://schemas.microsoft.com/office/drawing/2015/9/8/chartex" xmlns:cx2="http://schemas.microsoft.com/office/drawing/2015/10/21/chartex" xmlns:cx3="http://schemas.microsoft.com/office/drawing/2016/5/9/chartex" xmlns:cx4="http://schemas.microsoft.com/office/drawing/2016/5/10/chartex" xmlns:cx5="http://schemas.microsoft.com/office/drawing/2016/5/11/chartex" xmlns:cx6="http://schemas.microsoft.com/office/drawing/2016/5/12/chartex" xmlns:cx7="http://schemas.microsoft.com/office/drawing/2016/5/13/chartex" xmlns:cx8="http://schemas.microsoft.com/office/drawing/2016/5/14/chartex" xmlns:mc="http://schemas.openxmlformats.org/markup-compatibility/2006" xmlns:m="http://schemas.openxmlformats.org/officeDocument/2006/math" xmlns:aink="http://schemas.microsoft.com/office/drawing/2016/ink" xmlns:am3d="http://schemas.microsoft.com/office/drawing/2017/model3d" xmlns:oel="http://schemas.microsoft.com/office/2019/extlst" xmlns:r="http://schemas.openxmlformats.org/officeDocument/2006/relationships" xmlns:wp14="http://schemas.microsoft.com/office/word/2010/wordprocessingDrawing" xmlns:wp="http://schemas.openxmlformats.org/drawingml/2006/wordprocessingDrawing" xmlns:wpg="http://schemas.microsoft.com/office/word/2010/wordprocessingGroup" xmlns:wpi="http://schemas.microsoft.com/office/word/2010/wordprocessingInk" xmlns:wps="http://schemas.microsoft.com/office/word/2010/wordprocessingShape" xmlns:o="urn:schemas-microsoft-com:office:office" xmlns:v="urn:schemas-microsoft-com:vml" xmlns:w10="urn:schemas-microsoft-com:office:word" xmlns:w="http://schemas.openxmlformats.org/wordprocessingml/2006/main" xmlns:w14="http://schemas.microsoft.com/office/word/2010/wordml" xmlns:w15="http://schemas.microsoft.com/office/word/2012/wordml" xmlns:w16cex="http://schemas.microsoft.com/office/word/2018/wordml/cex" xmlns:w16cid="http://schemas.microsoft.com/office/word/2016/wordml/cid" xmlns:w16="http://schemas.microsoft.com/office/word/2018/wordml" xmlns:w16sdtdh="http://schemas.microsoft.com/office/word/2020/wordml/sdtdatahash" xmlns:w16sdtfl="http://schemas.microsoft.com/office/word/2024/wordml/sdtformatlock" xmlns:w16se="http://schemas.microsoft.com/office/word/2015/wordml/symex" xmlns:w16du="http://schemas.microsoft.com/office/word/2023/wordml/word16du" xmlns:wne="http://schemas.microsoft.com/office/word/2006/wordml" mc:Ignorable="w14 w15 w16se w16cid w16 w16cex w16sdtdh w16sdtfl w16du wp14">
+<w:endnotes xmlns:wpc="http://schemas.microsoft.com/office/word/2010/wordprocessingCanvas" xmlns:cx="http://schemas.microsoft.com/office/drawing/2014/chartex" xmlns:cx1="http://schemas.microsoft.com/office/drawing/2015/9/8/chartex" xmlns:cx2="http://schemas.microsoft.com/office/drawing/2015/10/21/chartex" xmlns:cx3="http://schemas.microsoft.com/office/drawing/2016/5/9/chartex" xmlns:cx4="http://schemas.microsoft.com/office/drawing/2016/5/10/chartex" xmlns:cx5="http://schemas.microsoft.com/office/drawing/2016/5/11/chartex" xmlns:cx6="http://schemas.microsoft.com/office/drawing/2016/5/12/chartex" xmlns:cx7="http://schemas.microsoft.com/office/drawing/2016/5/13/chartex" xmlns:cx8="http://schemas.microsoft.com/office/drawing/2016/5/14/chartex" xmlns:mc="http://schemas.openxmlformats.org/markup-compatibility/2006" xmlns:aink="http://schemas.microsoft.com/office/drawing/2016/ink" xmlns:am3d="http://schemas.microsoft.com/office/drawing/2017/model3d" xmlns:o="urn:schemas-microsoft-com:office:office" xmlns:oel="http://schemas.microsoft.com/office/2019/extlst" xmlns:r="http://schemas.openxmlformats.org/officeDocument/2006/relationships" xmlns:m="http://schemas.openxmlformats.org/officeDocument/2006/math" xmlns:v="urn:schemas-microsoft-com:vml" xmlns:wp14="http://schemas.microsoft.com/office/word/2010/wordprocessingDrawing" xmlns:wp="http://schemas.openxmlformats.org/drawingml/2006/wordprocessingDrawing" xmlns:w10="urn:schemas-microsoft-com:office:word" xmlns:w="http://schemas.openxmlformats.org/wordprocessingml/2006/main" xmlns:w14="http://schemas.microsoft.com/office/word/2010/wordml" xmlns:w15="http://schemas.microsoft.com/office/word/2012/wordml" xmlns:w16cex="http://schemas.microsoft.com/office/word/2018/wordml/cex" xmlns:w16cid="http://schemas.microsoft.com/office/word/2016/wordml/cid" xmlns:w16="http://schemas.microsoft.com/office/word/2018/wordml" xmlns:w16du="http://schemas.microsoft.com/office/word/2023/wordml/word16du" xmlns:w16sdtdh="http://schemas.microsoft.com/office/word/2020/wordml/sdtdatahash" xmlns:w16sdtfl="http://schemas.microsoft.com/office/word/2024/wordml/sdtformatlock" xmlns:w16se="http://schemas.microsoft.com/office/word/2015/wordml/symex" xmlns:wpg="http://schemas.microsoft.com/office/word/2010/wordprocessingGroup" xmlns:wpi="http://schemas.microsoft.com/office/word/2010/wordprocessingInk" xmlns:wne="http://schemas.microsoft.com/office/word/2006/wordml" xmlns:wps="http://schemas.microsoft.com/office/word/2010/wordprocessingShape" mc:Ignorable="w14 w15 w16se w16cid w16 w16cex w16sdtdh w16sdtfl w16du wp14">
   <w:endnote w:type="separator" w:id="-1">
     <w:p>
       <w:pPr>
@@ -2293,7 +2683,7 @@
 </file>
 
 <file path=word/footer1.xml><?xml version="1.0" encoding="utf-8"?>
-<w:ftr xmlns:wpc="http://schemas.microsoft.com/office/word/2010/wordprocessingCanvas" xmlns:cx="http://schemas.microsoft.com/office/drawing/2014/chartex" xmlns:cx1="http://schemas.microsoft.com/office/drawing/2015/9/8/chartex" xmlns:cx2="http://schemas.microsoft.com/office/drawing/2015/10/21/chartex" xmlns:cx3="http://schemas.microsoft.com/office/drawing/2016/5/9/chartex" xmlns:cx4="http://schemas.microsoft.com/office/drawing/2016/5/10/chartex" xmlns:cx5="http://schemas.microsoft.com/office/drawing/2016/5/11/chartex" xmlns:cx6="http://schemas.microsoft.com/office/drawing/2016/5/12/chartex" xmlns:cx7="http://schemas.microsoft.com/office/drawing/2016/5/13/chartex" xmlns:cx8="http://schemas.microsoft.com/office/drawing/2016/5/14/chartex" xmlns:mc="http://schemas.openxmlformats.org/markup-compatibility/2006" xmlns:m="http://schemas.openxmlformats.org/officeDocument/2006/math" xmlns:aink="http://schemas.microsoft.com/office/drawing/2016/ink" xmlns:am3d="http://schemas.microsoft.com/office/drawing/2017/model3d" xmlns:oel="http://schemas.microsoft.com/office/2019/extlst" xmlns:r="http://schemas.openxmlformats.org/officeDocument/2006/relationships" xmlns:wp14="http://schemas.microsoft.com/office/word/2010/wordprocessingDrawing" xmlns:wp="http://schemas.openxmlformats.org/drawingml/2006/wordprocessingDrawing" xmlns:wpg="http://schemas.microsoft.com/office/word/2010/wordprocessingGroup" xmlns:wpi="http://schemas.microsoft.com/office/word/2010/wordprocessingInk" xmlns:wps="http://schemas.microsoft.com/office/word/2010/wordprocessingShape" xmlns:o="urn:schemas-microsoft-com:office:office" xmlns:v="urn:schemas-microsoft-com:vml" xmlns:w10="urn:schemas-microsoft-com:office:word" xmlns:w="http://schemas.openxmlformats.org/wordprocessingml/2006/main" xmlns:w14="http://schemas.microsoft.com/office/word/2010/wordml" xmlns:w15="http://schemas.microsoft.com/office/word/2012/wordml" xmlns:w16cex="http://schemas.microsoft.com/office/word/2018/wordml/cex" xmlns:w16cid="http://schemas.microsoft.com/office/word/2016/wordml/cid" xmlns:w16="http://schemas.microsoft.com/office/word/2018/wordml" xmlns:w16sdtdh="http://schemas.microsoft.com/office/word/2020/wordml/sdtdatahash" xmlns:w16sdtfl="http://schemas.microsoft.com/office/word/2024/wordml/sdtformatlock" xmlns:w16se="http://schemas.microsoft.com/office/word/2015/wordml/symex" xmlns:w16du="http://schemas.microsoft.com/office/word/2023/wordml/word16du" xmlns:wne="http://schemas.microsoft.com/office/word/2006/wordml" mc:Ignorable="w14 w15 w16se w16cid w16 w16cex w16sdtdh w16sdtfl w16du wp14">
+<w:ftr xmlns:wpc="http://schemas.microsoft.com/office/word/2010/wordprocessingCanvas" xmlns:cx="http://schemas.microsoft.com/office/drawing/2014/chartex" xmlns:cx1="http://schemas.microsoft.com/office/drawing/2015/9/8/chartex" xmlns:cx2="http://schemas.microsoft.com/office/drawing/2015/10/21/chartex" xmlns:cx3="http://schemas.microsoft.com/office/drawing/2016/5/9/chartex" xmlns:cx4="http://schemas.microsoft.com/office/drawing/2016/5/10/chartex" xmlns:cx5="http://schemas.microsoft.com/office/drawing/2016/5/11/chartex" xmlns:cx6="http://schemas.microsoft.com/office/drawing/2016/5/12/chartex" xmlns:cx7="http://schemas.microsoft.com/office/drawing/2016/5/13/chartex" xmlns:cx8="http://schemas.microsoft.com/office/drawing/2016/5/14/chartex" xmlns:mc="http://schemas.openxmlformats.org/markup-compatibility/2006" xmlns:aink="http://schemas.microsoft.com/office/drawing/2016/ink" xmlns:am3d="http://schemas.microsoft.com/office/drawing/2017/model3d" xmlns:o="urn:schemas-microsoft-com:office:office" xmlns:oel="http://schemas.microsoft.com/office/2019/extlst" xmlns:r="http://schemas.openxmlformats.org/officeDocument/2006/relationships" xmlns:m="http://schemas.openxmlformats.org/officeDocument/2006/math" xmlns:v="urn:schemas-microsoft-com:vml" xmlns:wp14="http://schemas.microsoft.com/office/word/2010/wordprocessingDrawing" xmlns:wp="http://schemas.openxmlformats.org/drawingml/2006/wordprocessingDrawing" xmlns:w10="urn:schemas-microsoft-com:office:word" xmlns:w="http://schemas.openxmlformats.org/wordprocessingml/2006/main" xmlns:w14="http://schemas.microsoft.com/office/word/2010/wordml" xmlns:w15="http://schemas.microsoft.com/office/word/2012/wordml" xmlns:w16cex="http://schemas.microsoft.com/office/word/2018/wordml/cex" xmlns:w16cid="http://schemas.microsoft.com/office/word/2016/wordml/cid" xmlns:w16="http://schemas.microsoft.com/office/word/2018/wordml" xmlns:w16du="http://schemas.microsoft.com/office/word/2023/wordml/word16du" xmlns:w16sdtdh="http://schemas.microsoft.com/office/word/2020/wordml/sdtdatahash" xmlns:w16sdtfl="http://schemas.microsoft.com/office/word/2024/wordml/sdtformatlock" xmlns:w16se="http://schemas.microsoft.com/office/word/2015/wordml/symex" xmlns:wpg="http://schemas.microsoft.com/office/word/2010/wordprocessingGroup" xmlns:wpi="http://schemas.microsoft.com/office/word/2010/wordprocessingInk" xmlns:wne="http://schemas.microsoft.com/office/word/2006/wordml" xmlns:wps="http://schemas.microsoft.com/office/word/2010/wordprocessingShape" mc:Ignorable="w14 w15 w16se w16cid w16 w16cex w16sdtdh w16sdtfl w16du wp14">
   <w:p>
     <w:pPr>
       <w:pStyle w:val="Footer"/>
@@ -2322,7 +2712,7 @@
 </file>
 
 <file path=word/footnotes.xml><?xml version="1.0" encoding="utf-8"?>
-<w:footnotes xmlns:wpc="http://schemas.microsoft.com/office/word/2010/wordprocessingCanvas" xmlns:cx="http://schemas.microsoft.com/office/drawing/2014/chartex" xmlns:cx1="http://schemas.microsoft.com/office/drawing/2015/9/8/chartex" xmlns:cx2="http://schemas.microsoft.com/office/drawing/2015/10/21/chartex" xmlns:cx3="http://schemas.microsoft.com/office/drawing/2016/5/9/chartex" xmlns:cx4="http://schemas.microsoft.com/office/drawing/2016/5/10/chartex" xmlns:cx5="http://schemas.microsoft.com/office/drawing/2016/5/11/chartex" xmlns:cx6="http://schemas.microsoft.com/office/drawing/2016/5/12/chartex" xmlns:cx7="http://schemas.microsoft.com/office/drawing/2016/5/13/chartex" xmlns:cx8="http://schemas.microsoft.com/office/drawing/2016/5/14/chartex" xmlns:mc="http://schemas.openxmlformats.org/markup-compatibility/2006" xmlns:m="http://schemas.openxmlformats.org/officeDocument/2006/math" xmlns:aink="http://schemas.microsoft.com/office/drawing/2016/ink" xmlns:am3d="http://schemas.microsoft.com/office/drawing/2017/model3d" xmlns:oel="http://schemas.microsoft.com/office/2019/extlst" xmlns:r="http://schemas.openxmlformats.org/officeDocument/2006/relationships" xmlns:wp14="http://schemas.microsoft.com/office/word/2010/wordprocessingDrawing" xmlns:wp="http://schemas.openxmlformats.org/drawingml/2006/wordprocessingDrawing" xmlns:wpg="http://schemas.microsoft.com/office/word/2010/wordprocessingGroup" xmlns:wpi="http://schemas.microsoft.com/office/word/2010/wordprocessingInk" xmlns:wps="http://schemas.microsoft.com/office/word/2010/wordprocessingShape" xmlns:o="urn:schemas-microsoft-com:office:office" xmlns:v="urn:schemas-microsoft-com:vml" xmlns:w10="urn:schemas-microsoft-com:office:word" xmlns:w="http://schemas.openxmlformats.org/wordprocessingml/2006/main" xmlns:w14="http://schemas.microsoft.com/office/word/2010/wordml" xmlns:w15="http://schemas.microsoft.com/office/word/2012/wordml" xmlns:w16cex="http://schemas.microsoft.com/office/word/2018/wordml/cex" xmlns:w16cid="http://schemas.microsoft.com/office/word/2016/wordml/cid" xmlns:w16="http://schemas.microsoft.com/office/word/2018/wordml" xmlns:w16sdtdh="http://schemas.microsoft.com/office/word/2020/wordml/sdtdatahash" xmlns:w16sdtfl="http://schemas.microsoft.com/office/word/2024/wordml/sdtformatlock" xmlns:w16se="http://schemas.microsoft.com/office/word/2015/wordml/symex" xmlns:w16du="http://schemas.microsoft.com/office/word/2023/wordml/word16du" xmlns:wne="http://schemas.microsoft.com/office/word/2006/wordml" mc:Ignorable="w14 w15 w16se w16cid w16 w16cex w16sdtdh w16sdtfl w16du wp14">
+<w:footnotes xmlns:wpc="http://schemas.microsoft.com/office/word/2010/wordprocessingCanvas" xmlns:cx="http://schemas.microsoft.com/office/drawing/2014/chartex" xmlns:cx1="http://schemas.microsoft.com/office/drawing/2015/9/8/chartex" xmlns:cx2="http://schemas.microsoft.com/office/drawing/2015/10/21/chartex" xmlns:cx3="http://schemas.microsoft.com/office/drawing/2016/5/9/chartex" xmlns:cx4="http://schemas.microsoft.com/office/drawing/2016/5/10/chartex" xmlns:cx5="http://schemas.microsoft.com/office/drawing/2016/5/11/chartex" xmlns:cx6="http://schemas.microsoft.com/office/drawing/2016/5/12/chartex" xmlns:cx7="http://schemas.microsoft.com/office/drawing/2016/5/13/chartex" xmlns:cx8="http://schemas.microsoft.com/office/drawing/2016/5/14/chartex" xmlns:mc="http://schemas.openxmlformats.org/markup-compatibility/2006" xmlns:aink="http://schemas.microsoft.com/office/drawing/2016/ink" xmlns:am3d="http://schemas.microsoft.com/office/drawing/2017/model3d" xmlns:o="urn:schemas-microsoft-com:office:office" xmlns:oel="http://schemas.microsoft.com/office/2019/extlst" xmlns:r="http://schemas.openxmlformats.org/officeDocument/2006/relationships" xmlns:m="http://schemas.openxmlformats.org/officeDocument/2006/math" xmlns:v="urn:schemas-microsoft-com:vml" xmlns:wp14="http://schemas.microsoft.com/office/word/2010/wordprocessingDrawing" xmlns:wp="http://schemas.openxmlformats.org/drawingml/2006/wordprocessingDrawing" xmlns:w10="urn:schemas-microsoft-com:office:word" xmlns:w="http://schemas.openxmlformats.org/wordprocessingml/2006/main" xmlns:w14="http://schemas.microsoft.com/office/word/2010/wordml" xmlns:w15="http://schemas.microsoft.com/office/word/2012/wordml" xmlns:w16cex="http://schemas.microsoft.com/office/word/2018/wordml/cex" xmlns:w16cid="http://schemas.microsoft.com/office/word/2016/wordml/cid" xmlns:w16="http://schemas.microsoft.com/office/word/2018/wordml" xmlns:w16du="http://schemas.microsoft.com/office/word/2023/wordml/word16du" xmlns:w16sdtdh="http://schemas.microsoft.com/office/word/2020/wordml/sdtdatahash" xmlns:w16sdtfl="http://schemas.microsoft.com/office/word/2024/wordml/sdtformatlock" xmlns:w16se="http://schemas.microsoft.com/office/word/2015/wordml/symex" xmlns:wpg="http://schemas.microsoft.com/office/word/2010/wordprocessingGroup" xmlns:wpi="http://schemas.microsoft.com/office/word/2010/wordprocessingInk" xmlns:wne="http://schemas.microsoft.com/office/word/2006/wordml" xmlns:wps="http://schemas.microsoft.com/office/word/2010/wordprocessingShape" mc:Ignorable="w14 w15 w16se w16cid w16 w16cex w16sdtdh w16sdtfl w16du wp14">
   <w:footnote w:type="separator" w:id="-1">
     <w:p>
       <w:pPr>
@@ -2347,7 +2737,7 @@
 </file>
 
 <file path=word/numbering.xml><?xml version="1.0" encoding="utf-8"?>
-<w:numbering xmlns:wpc="http://schemas.microsoft.com/office/word/2010/wordprocessingCanvas" xmlns:cx="http://schemas.microsoft.com/office/drawing/2014/chartex" xmlns:cx1="http://schemas.microsoft.com/office/drawing/2015/9/8/chartex" xmlns:cx2="http://schemas.microsoft.com/office/drawing/2015/10/21/chartex" xmlns:cx3="http://schemas.microsoft.com/office/drawing/2016/5/9/chartex" xmlns:cx4="http://schemas.microsoft.com/office/drawing/2016/5/10/chartex" xmlns:cx5="http://schemas.microsoft.com/office/drawing/2016/5/11/chartex" xmlns:cx6="http://schemas.microsoft.com/office/drawing/2016/5/12/chartex" xmlns:cx7="http://schemas.microsoft.com/office/drawing/2016/5/13/chartex" xmlns:cx8="http://schemas.microsoft.com/office/drawing/2016/5/14/chartex" xmlns:mc="http://schemas.openxmlformats.org/markup-compatibility/2006" xmlns:m="http://schemas.openxmlformats.org/officeDocument/2006/math" xmlns:aink="http://schemas.microsoft.com/office/drawing/2016/ink" xmlns:am3d="http://schemas.microsoft.com/office/drawing/2017/model3d" xmlns:oel="http://schemas.microsoft.com/office/2019/extlst" xmlns:r="http://schemas.openxmlformats.org/officeDocument/2006/relationships" xmlns:wp14="http://schemas.microsoft.com/office/word/2010/wordprocessingDrawing" xmlns:wp="http://schemas.openxmlformats.org/drawingml/2006/wordprocessingDrawing" xmlns:wpg="http://schemas.microsoft.com/office/word/2010/wordprocessingGroup" xmlns:wpi="http://schemas.microsoft.com/office/word/2010/wordprocessingInk" xmlns:wps="http://schemas.microsoft.com/office/word/2010/wordprocessingShape" xmlns:o="urn:schemas-microsoft-com:office:office" xmlns:v="urn:schemas-microsoft-com:vml" xmlns:w10="urn:schemas-microsoft-com:office:word" xmlns:w="http://schemas.openxmlformats.org/wordprocessingml/2006/main" xmlns:w14="http://schemas.microsoft.com/office/word/2010/wordml" xmlns:w15="http://schemas.microsoft.com/office/word/2012/wordml" xmlns:w16cex="http://schemas.microsoft.com/office/word/2018/wordml/cex" xmlns:w16cid="http://schemas.microsoft.com/office/word/2016/wordml/cid" xmlns:w16="http://schemas.microsoft.com/office/word/2018/wordml" xmlns:w16sdtdh="http://schemas.microsoft.com/office/word/2020/wordml/sdtdatahash" xmlns:w16sdtfl="http://schemas.microsoft.com/office/word/2024/wordml/sdtformatlock" xmlns:w16se="http://schemas.microsoft.com/office/word/2015/wordml/symex" xmlns:w16du="http://schemas.microsoft.com/office/word/2023/wordml/word16du" xmlns:wne="http://schemas.microsoft.com/office/word/2006/wordml" mc:Ignorable="w14 w15 w16se w16cid w16 w16cex w16sdtdh w16sdtfl w16du wp14">
+<w:numbering xmlns:wpc="http://schemas.microsoft.com/office/word/2010/wordprocessingCanvas" xmlns:cx="http://schemas.microsoft.com/office/drawing/2014/chartex" xmlns:cx1="http://schemas.microsoft.com/office/drawing/2015/9/8/chartex" xmlns:cx2="http://schemas.microsoft.com/office/drawing/2015/10/21/chartex" xmlns:cx3="http://schemas.microsoft.com/office/drawing/2016/5/9/chartex" xmlns:cx4="http://schemas.microsoft.com/office/drawing/2016/5/10/chartex" xmlns:cx5="http://schemas.microsoft.com/office/drawing/2016/5/11/chartex" xmlns:cx6="http://schemas.microsoft.com/office/drawing/2016/5/12/chartex" xmlns:cx7="http://schemas.microsoft.com/office/drawing/2016/5/13/chartex" xmlns:cx8="http://schemas.microsoft.com/office/drawing/2016/5/14/chartex" xmlns:mc="http://schemas.openxmlformats.org/markup-compatibility/2006" xmlns:aink="http://schemas.microsoft.com/office/drawing/2016/ink" xmlns:am3d="http://schemas.microsoft.com/office/drawing/2017/model3d" xmlns:o="urn:schemas-microsoft-com:office:office" xmlns:oel="http://schemas.microsoft.com/office/2019/extlst" xmlns:r="http://schemas.openxmlformats.org/officeDocument/2006/relationships" xmlns:m="http://schemas.openxmlformats.org/officeDocument/2006/math" xmlns:v="urn:schemas-microsoft-com:vml" xmlns:wp14="http://schemas.microsoft.com/office/word/2010/wordprocessingDrawing" xmlns:wp="http://schemas.openxmlformats.org/drawingml/2006/wordprocessingDrawing" xmlns:w10="urn:schemas-microsoft-com:office:word" xmlns:w="http://schemas.openxmlformats.org/wordprocessingml/2006/main" xmlns:w14="http://schemas.microsoft.com/office/word/2010/wordml" xmlns:w15="http://schemas.microsoft.com/office/word/2012/wordml" xmlns:w16cex="http://schemas.microsoft.com/office/word/2018/wordml/cex" xmlns:w16cid="http://schemas.microsoft.com/office/word/2016/wordml/cid" xmlns:w16="http://schemas.microsoft.com/office/word/2018/wordml" xmlns:w16du="http://schemas.microsoft.com/office/word/2023/wordml/word16du" xmlns:w16sdtdh="http://schemas.microsoft.com/office/word/2020/wordml/sdtdatahash" xmlns:w16sdtfl="http://schemas.microsoft.com/office/word/2024/wordml/sdtformatlock" xmlns:w16se="http://schemas.microsoft.com/office/word/2015/wordml/symex" xmlns:wpg="http://schemas.microsoft.com/office/word/2010/wordprocessingGroup" xmlns:wpi="http://schemas.microsoft.com/office/word/2010/wordprocessingInk" xmlns:wne="http://schemas.microsoft.com/office/word/2006/wordml" xmlns:wps="http://schemas.microsoft.com/office/word/2010/wordprocessingShape" mc:Ignorable="w14 w15 w16se w16cid w16 w16cex w16sdtdh w16sdtfl w16du wp14">
   <w:abstractNum w:abstractNumId="0" w15:restartNumberingAfterBreak="0">
     <w:nsid w:val="FFFFFF7C"/>
     <w:multiLevelType w:val="singleLevel"/>
@@ -2550,7 +2940,7 @@
 </file>
 
 <file path=word/styles.xml><?xml version="1.0" encoding="utf-8"?>
-<w:styles xmlns:mc="http://schemas.openxmlformats.org/markup-compatibility/2006" xmlns:r="http://schemas.openxmlformats.org/officeDocument/2006/relationships" xmlns:w="http://schemas.openxmlformats.org/wordprocessingml/2006/main" xmlns:w14="http://schemas.microsoft.com/office/word/2010/wordml" xmlns:w15="http://schemas.microsoft.com/office/word/2012/wordml" xmlns:w16cex="http://schemas.microsoft.com/office/word/2018/wordml/cex" xmlns:w16cid="http://schemas.microsoft.com/office/word/2016/wordml/cid" xmlns:w16="http://schemas.microsoft.com/office/word/2018/wordml" xmlns:w16sdtdh="http://schemas.microsoft.com/office/word/2020/wordml/sdtdatahash" xmlns:w16sdtfl="http://schemas.microsoft.com/office/word/2024/wordml/sdtformatlock" xmlns:w16se="http://schemas.microsoft.com/office/word/2015/wordml/symex" xmlns:w16du="http://schemas.microsoft.com/office/word/2023/wordml/word16du" mc:Ignorable="w14 w15 w16se w16cid w16 w16cex w16sdtdh w16sdtfl w16du">
+<w:styles xmlns:mc="http://schemas.openxmlformats.org/markup-compatibility/2006" xmlns:r="http://schemas.openxmlformats.org/officeDocument/2006/relationships" xmlns:w="http://schemas.openxmlformats.org/wordprocessingml/2006/main" xmlns:w14="http://schemas.microsoft.com/office/word/2010/wordml" xmlns:w15="http://schemas.microsoft.com/office/word/2012/wordml" xmlns:w16cex="http://schemas.microsoft.com/office/word/2018/wordml/cex" xmlns:w16cid="http://schemas.microsoft.com/office/word/2016/wordml/cid" xmlns:w16="http://schemas.microsoft.com/office/word/2018/wordml" xmlns:w16du="http://schemas.microsoft.com/office/word/2023/wordml/word16du" xmlns:w16sdtdh="http://schemas.microsoft.com/office/word/2020/wordml/sdtdatahash" xmlns:w16sdtfl="http://schemas.microsoft.com/office/word/2024/wordml/sdtformatlock" xmlns:w16se="http://schemas.microsoft.com/office/word/2015/wordml/symex" mc:Ignorable="w14 w15 w16se w16cid w16 w16cex w16sdtdh w16sdtfl w16du">
   <w:docDefaults>
     <w:rPrDefault>
       <w:rPr>
@@ -3157,7 +3547,6 @@
   <w:style w:type="character" w:default="1" w:styleId="DefaultParagraphFont">
     <w:name w:val="Default Paragraph Font"/>
     <w:uiPriority w:val="1"/>
-    <w:semiHidden/>
     <w:unhideWhenUsed/>
   </w:style>
   <w:style w:type="table" w:default="1" w:styleId="TableNormal">
@@ -3720,7 +4109,6 @@
     <w:basedOn w:val="Normal"/>
     <w:next w:val="Normal"/>
     <w:uiPriority w:val="35"/>
-    <w:semiHidden/>
     <w:unhideWhenUsed/>
     <w:qFormat/>
     <w:rsid w:val="00FC693F"/>

</xml_diff>